<commit_message>
W05 SAT: the discussion guide, the provenance, and the leak and level fixes
The guide runs the 300-minute Saturday with the ME1 window held without marks,
day or slot, answers the row's nine anchors as reasoning with two follow-ups
each, and previews Build 2's five seeds. The paper no longer names the duration
trap before Q12, each bank blank prints last in its part, Q15 and Q23 join a
cause or rule to its consequence, and the levels read 4, 9 and 13 by the
exercise-builder bar.

Co-Authored-By: Claude Opus 5.5 <noreply@anthropic.com>
Claude-Session: https://claude.ai/code/session_01TK2R2uaDnJSEF8EjfT4zg9
</commit_message>
<xml_diff>
--- a/content/W05/SAT/answer-key/C2_W05_SAT_answer_key_TRAINER.docx
+++ b/content/W05/SAT/answer-key/C2_W05_SAT_answer_key_TRAINER.docx
@@ -761,7 +761,7 @@
                 <w:sz w:val="18"/>
                 <w:szCs w:val="18"/>
               </w:rPr>
-              <w:t xml:space="preserve">2</w:t>
+              <w:t xml:space="preserve">3</w:t>
             </w:r>
           </w:p>
         </w:tc>
@@ -797,7 +797,7 @@
                 <w:sz w:val="18"/>
                 <w:szCs w:val="18"/>
               </w:rPr>
-              <w:t xml:space="preserve">2</w:t>
+              <w:t xml:space="preserve">1</w:t>
             </w:r>
           </w:p>
         </w:tc>
@@ -1052,7 +1052,7 @@
                 <w:sz w:val="18"/>
                 <w:szCs w:val="18"/>
               </w:rPr>
-              <w:t xml:space="preserve">2</w:t>
+              <w:t xml:space="preserve">1</w:t>
             </w:r>
           </w:p>
         </w:tc>
@@ -1088,7 +1088,7 @@
                 <w:sz w:val="18"/>
                 <w:szCs w:val="18"/>
               </w:rPr>
-              <w:t xml:space="preserve">3</w:t>
+              <w:t xml:space="preserve">4</w:t>
             </w:r>
           </w:p>
         </w:tc>
@@ -1343,7 +1343,7 @@
                 <w:sz w:val="18"/>
                 <w:szCs w:val="18"/>
               </w:rPr>
-              <w:t xml:space="preserve">0</w:t>
+              <w:t xml:space="preserve">1</w:t>
             </w:r>
           </w:p>
         </w:tc>
@@ -1379,7 +1379,7 @@
                 <w:sz w:val="18"/>
                 <w:szCs w:val="18"/>
               </w:rPr>
-              <w:t xml:space="preserve">4</w:t>
+              <w:t xml:space="preserve">3</w:t>
             </w:r>
           </w:p>
         </w:tc>
@@ -1925,7 +1925,7 @@
                 <w:sz w:val="18"/>
                 <w:szCs w:val="18"/>
               </w:rPr>
-              <w:t xml:space="preserve">1</w:t>
+              <w:t xml:space="preserve">2</w:t>
             </w:r>
           </w:p>
         </w:tc>
@@ -1961,7 +1961,7 @@
                 <w:sz w:val="18"/>
                 <w:szCs w:val="18"/>
               </w:rPr>
-              <w:t xml:space="preserve">3</w:t>
+              <w:t xml:space="preserve">2</w:t>
             </w:r>
           </w:p>
         </w:tc>
@@ -2218,7 +2218,7 @@
                 <w:sz w:val="18"/>
                 <w:szCs w:val="18"/>
               </w:rPr>
-              <w:t xml:space="preserve">7</w:t>
+              <w:t xml:space="preserve">9</w:t>
             </w:r>
           </w:p>
         </w:tc>
@@ -2254,7 +2254,7 @@
                 <w:sz w:val="18"/>
                 <w:szCs w:val="18"/>
               </w:rPr>
-              <w:t xml:space="preserve">15</w:t>
+              <w:t xml:space="preserve">13</w:t>
             </w:r>
           </w:p>
         </w:tc>
@@ -2735,7 +2735,7 @@
                 <w:sz w:val="18"/>
                 <w:szCs w:val="18"/>
               </w:rPr>
-              <w:t xml:space="preserve">C (test)</w:t>
+              <w:t xml:space="preserve">B</w:t>
             </w:r>
           </w:p>
         </w:tc>
@@ -2771,7 +2771,7 @@
                 <w:sz w:val="18"/>
                 <w:szCs w:val="18"/>
               </w:rPr>
-              <w:t xml:space="preserve">Fill in the blank</w:t>
+              <w:t xml:space="preserve">One correct option</w:t>
             </w:r>
           </w:p>
         </w:tc>
@@ -2843,7 +2843,7 @@
                 <w:sz w:val="18"/>
                 <w:szCs w:val="18"/>
               </w:rPr>
-              <w:t xml:space="preserve">Easy</w:t>
+              <w:t xml:space="preserve">Medium</w:t>
             </w:r>
           </w:p>
         </w:tc>
@@ -2951,7 +2951,7 @@
                 <w:sz w:val="18"/>
                 <w:szCs w:val="18"/>
               </w:rPr>
-              <w:t xml:space="preserve">bank 1</w:t>
+              <w:t xml:space="preserve">new</w:t>
             </w:r>
           </w:p>
         </w:tc>
@@ -3026,7 +3026,7 @@
                 <w:sz w:val="18"/>
                 <w:szCs w:val="18"/>
               </w:rPr>
-              <w:t xml:space="preserve">B</w:t>
+              <w:t xml:space="preserve">C</w:t>
             </w:r>
           </w:p>
         </w:tc>
@@ -3062,7 +3062,7 @@
                 <w:sz w:val="18"/>
                 <w:szCs w:val="18"/>
               </w:rPr>
-              <w:t xml:space="preserve">One correct option</w:t>
+              <w:t xml:space="preserve">True or false</w:t>
             </w:r>
           </w:p>
         </w:tc>
@@ -3170,7 +3170,7 @@
                 <w:sz w:val="18"/>
                 <w:szCs w:val="18"/>
               </w:rPr>
-              <w:t xml:space="preserve">[S]</w:t>
+              <w:t xml:space="preserve">[D]</w:t>
             </w:r>
           </w:p>
         </w:tc>
@@ -3317,7 +3317,7 @@
                 <w:sz w:val="18"/>
                 <w:szCs w:val="18"/>
               </w:rPr>
-              <w:t xml:space="preserve">C</w:t>
+              <w:t xml:space="preserve">D</w:t>
             </w:r>
           </w:p>
         </w:tc>
@@ -3353,7 +3353,7 @@
                 <w:sz w:val="18"/>
                 <w:szCs w:val="18"/>
               </w:rPr>
-              <w:t xml:space="preserve">True or false</w:t>
+              <w:t xml:space="preserve">One correct option</w:t>
             </w:r>
           </w:p>
         </w:tc>
@@ -3425,7 +3425,7 @@
                 <w:sz w:val="18"/>
                 <w:szCs w:val="18"/>
               </w:rPr>
-              <w:t xml:space="preserve">Hard</w:t>
+              <w:t xml:space="preserve">Medium</w:t>
             </w:r>
           </w:p>
         </w:tc>
@@ -3461,7 +3461,7 @@
                 <w:sz w:val="18"/>
                 <w:szCs w:val="18"/>
               </w:rPr>
-              <w:t xml:space="preserve">[D]</w:t>
+              <w:t xml:space="preserve">[F]</w:t>
             </w:r>
           </w:p>
         </w:tc>
@@ -3608,7 +3608,7 @@
                 <w:sz w:val="18"/>
                 <w:szCs w:val="18"/>
               </w:rPr>
-              <w:t xml:space="preserve">D</w:t>
+              <w:t xml:space="preserve">A, D</w:t>
             </w:r>
           </w:p>
         </w:tc>
@@ -3644,7 +3644,7 @@
                 <w:sz w:val="18"/>
                 <w:szCs w:val="18"/>
               </w:rPr>
-              <w:t xml:space="preserve">One correct option</w:t>
+              <w:t xml:space="preserve">More than one correct</w:t>
             </w:r>
           </w:p>
         </w:tc>
@@ -3752,7 +3752,7 @@
                 <w:sz w:val="18"/>
                 <w:szCs w:val="18"/>
               </w:rPr>
-              <w:t xml:space="preserve">[F]</w:t>
+              <w:t xml:space="preserve">[S]</w:t>
             </w:r>
           </w:p>
         </w:tc>
@@ -3899,7 +3899,7 @@
                 <w:sz w:val="18"/>
                 <w:szCs w:val="18"/>
               </w:rPr>
-              <w:t xml:space="preserve">A, D</w:t>
+              <w:t xml:space="preserve">C (test)</w:t>
             </w:r>
           </w:p>
         </w:tc>
@@ -3935,7 +3935,7 @@
                 <w:sz w:val="18"/>
                 <w:szCs w:val="18"/>
               </w:rPr>
-              <w:t xml:space="preserve">More than one correct</w:t>
+              <w:t xml:space="preserve">Fill in the blank</w:t>
             </w:r>
           </w:p>
         </w:tc>
@@ -4007,7 +4007,7 @@
                 <w:sz w:val="18"/>
                 <w:szCs w:val="18"/>
               </w:rPr>
-              <w:t xml:space="preserve">Medium</w:t>
+              <w:t xml:space="preserve">Easy</w:t>
             </w:r>
           </w:p>
         </w:tc>
@@ -4115,7 +4115,7 @@
                 <w:sz w:val="18"/>
                 <w:szCs w:val="18"/>
               </w:rPr>
-              <w:t xml:space="preserve">new</w:t>
+              <w:t xml:space="preserve">bank 1</w:t>
             </w:r>
           </w:p>
         </w:tc>
@@ -4190,7 +4190,7 @@
                 <w:sz w:val="18"/>
                 <w:szCs w:val="18"/>
               </w:rPr>
-              <w:t xml:space="preserve">B (negatives)</w:t>
+              <w:t xml:space="preserve">D</w:t>
             </w:r>
           </w:p>
         </w:tc>
@@ -4226,7 +4226,7 @@
                 <w:sz w:val="18"/>
                 <w:szCs w:val="18"/>
               </w:rPr>
-              <w:t xml:space="preserve">Fill in the blank</w:t>
+              <w:t xml:space="preserve">True or false</w:t>
             </w:r>
           </w:p>
         </w:tc>
@@ -4298,7 +4298,7 @@
                 <w:sz w:val="18"/>
                 <w:szCs w:val="18"/>
               </w:rPr>
-              <w:t xml:space="preserve">Easy</w:t>
+              <w:t xml:space="preserve">Hard</w:t>
             </w:r>
           </w:p>
         </w:tc>
@@ -4334,7 +4334,7 @@
                 <w:sz w:val="18"/>
                 <w:szCs w:val="18"/>
               </w:rPr>
-              <w:t xml:space="preserve">[S]</w:t>
+              <w:t xml:space="preserve">[F]</w:t>
             </w:r>
           </w:p>
         </w:tc>
@@ -4406,7 +4406,7 @@
                 <w:sz w:val="18"/>
                 <w:szCs w:val="18"/>
               </w:rPr>
-              <w:t xml:space="preserve">bank 2</w:t>
+              <w:t xml:space="preserve">new</w:t>
             </w:r>
           </w:p>
         </w:tc>
@@ -4481,7 +4481,7 @@
                 <w:sz w:val="18"/>
                 <w:szCs w:val="18"/>
               </w:rPr>
-              <w:t xml:space="preserve">D</w:t>
+              <w:t xml:space="preserve">Precision 174 / 268 = 0.65; recall 174 / 928 = 0.19; F1 = 2 x 174 / (2 x 174 + 94 + 754) = 348 / 1,196 = 0.29.</w:t>
             </w:r>
           </w:p>
         </w:tc>
@@ -4517,7 +4517,7 @@
                 <w:sz w:val="18"/>
                 <w:szCs w:val="18"/>
               </w:rPr>
-              <w:t xml:space="preserve">True or false</w:t>
+              <w:t xml:space="preserve">Applied maths</w:t>
             </w:r>
           </w:p>
         </w:tc>
@@ -4589,7 +4589,7 @@
                 <w:sz w:val="18"/>
                 <w:szCs w:val="18"/>
               </w:rPr>
-              <w:t xml:space="preserve">Medium</w:t>
+              <w:t xml:space="preserve">Hard</w:t>
             </w:r>
           </w:p>
         </w:tc>
@@ -4625,7 +4625,7 @@
                 <w:sz w:val="18"/>
                 <w:szCs w:val="18"/>
               </w:rPr>
-              <w:t xml:space="preserve">[F]</w:t>
+              <w:t xml:space="preserve">[S]</w:t>
             </w:r>
           </w:p>
         </w:tc>
@@ -4772,7 +4772,7 @@
                 <w:sz w:val="18"/>
                 <w:szCs w:val="18"/>
               </w:rPr>
-              <w:t xml:space="preserve">Precision 174 / 268 = 0.65; recall 174 / 928 = 0.19; F1 = 2 x 174 / (2 x 174 + 94 + 754) = 348 / 1,196 = 0.29.</w:t>
+              <w:t xml:space="preserve">Call when p x 1,200 &gt; (1 - p) x 40, so p &gt; 40 / 1,240 = 1 / 31, about 0.032; the line moves down from 0.5 and recall leads.</w:t>
             </w:r>
           </w:p>
         </w:tc>
@@ -4880,7 +4880,7 @@
                 <w:sz w:val="18"/>
                 <w:szCs w:val="18"/>
               </w:rPr>
-              <w:t xml:space="preserve">Hard</w:t>
+              <w:t xml:space="preserve">Medium</w:t>
             </w:r>
           </w:p>
         </w:tc>
@@ -5063,7 +5063,7 @@
                 <w:sz w:val="18"/>
                 <w:szCs w:val="18"/>
               </w:rPr>
-              <w:t xml:space="preserve">Call when p x 1,200 &gt; (1 - p) x 40, so p &gt; 40 / 1,240 = 1 / 31, about 0.032; the line moves down from 0.5 and recall leads.</w:t>
+              <w:t xml:space="preserve">B</w:t>
             </w:r>
           </w:p>
         </w:tc>
@@ -5099,7 +5099,7 @@
                 <w:sz w:val="18"/>
                 <w:szCs w:val="18"/>
               </w:rPr>
-              <w:t xml:space="preserve">Applied maths</w:t>
+              <w:t xml:space="preserve">One correct option</w:t>
             </w:r>
           </w:p>
         </w:tc>
@@ -5171,7 +5171,7 @@
                 <w:sz w:val="18"/>
                 <w:szCs w:val="18"/>
               </w:rPr>
-              <w:t xml:space="preserve">Medium</w:t>
+              <w:t xml:space="preserve">Hard</w:t>
             </w:r>
           </w:p>
         </w:tc>
@@ -5354,7 +5354,7 @@
                 <w:sz w:val="18"/>
                 <w:szCs w:val="18"/>
               </w:rPr>
-              <w:t xml:space="preserve">B</w:t>
+              <w:t xml:space="preserve">C</w:t>
             </w:r>
           </w:p>
         </w:tc>
@@ -5498,7 +5498,7 @@
                 <w:sz w:val="18"/>
                 <w:szCs w:val="18"/>
               </w:rPr>
-              <w:t xml:space="preserve">[S]</w:t>
+              <w:t xml:space="preserve">[D]</w:t>
             </w:r>
           </w:p>
         </w:tc>
@@ -5645,7 +5645,7 @@
                 <w:sz w:val="18"/>
                 <w:szCs w:val="18"/>
               </w:rPr>
-              <w:t xml:space="preserve">C</w:t>
+              <w:t xml:space="preserve">B (negatives)</w:t>
             </w:r>
           </w:p>
         </w:tc>
@@ -5681,7 +5681,7 @@
                 <w:sz w:val="18"/>
                 <w:szCs w:val="18"/>
               </w:rPr>
-              <w:t xml:space="preserve">One correct option</w:t>
+              <w:t xml:space="preserve">Fill in the blank</w:t>
             </w:r>
           </w:p>
         </w:tc>
@@ -5753,7 +5753,7 @@
                 <w:sz w:val="18"/>
                 <w:szCs w:val="18"/>
               </w:rPr>
-              <w:t xml:space="preserve">Hard</w:t>
+              <w:t xml:space="preserve">Easy</w:t>
             </w:r>
           </w:p>
         </w:tc>
@@ -5789,7 +5789,7 @@
                 <w:sz w:val="18"/>
                 <w:szCs w:val="18"/>
               </w:rPr>
-              <w:t xml:space="preserve">[D]</w:t>
+              <w:t xml:space="preserve">[S]</w:t>
             </w:r>
           </w:p>
         </w:tc>
@@ -5861,7 +5861,7 @@
                 <w:sz w:val="18"/>
                 <w:szCs w:val="18"/>
               </w:rPr>
-              <w:t xml:space="preserve">new</w:t>
+              <w:t xml:space="preserve">bank 2</w:t>
             </w:r>
           </w:p>
         </w:tc>
@@ -5936,7 +5936,7 @@
                 <w:sz w:val="18"/>
                 <w:szCs w:val="18"/>
               </w:rPr>
-              <w:t xml:space="preserve">C (leakage)</w:t>
+              <w:t xml:space="preserve">C</w:t>
             </w:r>
           </w:p>
         </w:tc>
@@ -5972,7 +5972,7 @@
                 <w:sz w:val="18"/>
                 <w:szCs w:val="18"/>
               </w:rPr>
-              <w:t xml:space="preserve">Fill in the blank</w:t>
+              <w:t xml:space="preserve">One correct option</w:t>
             </w:r>
           </w:p>
         </w:tc>
@@ -6044,7 +6044,7 @@
                 <w:sz w:val="18"/>
                 <w:szCs w:val="18"/>
               </w:rPr>
-              <w:t xml:space="preserve">Easy</w:t>
+              <w:t xml:space="preserve">Hard</w:t>
             </w:r>
           </w:p>
         </w:tc>
@@ -6152,7 +6152,7 @@
                 <w:sz w:val="18"/>
                 <w:szCs w:val="18"/>
               </w:rPr>
-              <w:t xml:space="preserve">bank 3</w:t>
+              <w:t xml:space="preserve">new</w:t>
             </w:r>
           </w:p>
         </w:tc>
@@ -6227,7 +6227,7 @@
                 <w:sz w:val="18"/>
                 <w:szCs w:val="18"/>
               </w:rPr>
-              <w:t xml:space="preserve">C</w:t>
+              <w:t xml:space="preserve">B, C, D</w:t>
             </w:r>
           </w:p>
         </w:tc>
@@ -6263,7 +6263,7 @@
                 <w:sz w:val="18"/>
                 <w:szCs w:val="18"/>
               </w:rPr>
-              <w:t xml:space="preserve">One correct option</w:t>
+              <w:t xml:space="preserve">More than one correct</w:t>
             </w:r>
           </w:p>
         </w:tc>
@@ -6518,7 +6518,7 @@
                 <w:sz w:val="18"/>
                 <w:szCs w:val="18"/>
               </w:rPr>
-              <w:t xml:space="preserve">B, C, D</w:t>
+              <w:t xml:space="preserve">A</w:t>
             </w:r>
           </w:p>
         </w:tc>
@@ -6554,7 +6554,7 @@
                 <w:sz w:val="18"/>
                 <w:szCs w:val="18"/>
               </w:rPr>
-              <w:t xml:space="preserve">More than one correct</w:t>
+              <w:t xml:space="preserve">True or false</w:t>
             </w:r>
           </w:p>
         </w:tc>
@@ -6626,7 +6626,7 @@
                 <w:sz w:val="18"/>
                 <w:szCs w:val="18"/>
               </w:rPr>
-              <w:t xml:space="preserve">Hard</w:t>
+              <w:t xml:space="preserve">Medium</w:t>
             </w:r>
           </w:p>
         </w:tc>
@@ -6662,7 +6662,7 @@
                 <w:sz w:val="18"/>
                 <w:szCs w:val="18"/>
               </w:rPr>
-              <w:t xml:space="preserve">[S]</w:t>
+              <w:t xml:space="preserve">[F]</w:t>
             </w:r>
           </w:p>
         </w:tc>
@@ -6809,7 +6809,7 @@
                 <w:sz w:val="18"/>
                 <w:szCs w:val="18"/>
               </w:rPr>
-              <w:t xml:space="preserve">A</w:t>
+              <w:t xml:space="preserve">D</w:t>
             </w:r>
           </w:p>
         </w:tc>
@@ -6845,7 +6845,7 @@
                 <w:sz w:val="18"/>
                 <w:szCs w:val="18"/>
               </w:rPr>
-              <w:t xml:space="preserve">True or false</w:t>
+              <w:t xml:space="preserve">One correct option</w:t>
             </w:r>
           </w:p>
         </w:tc>
@@ -7100,7 +7100,7 @@
                 <w:sz w:val="18"/>
                 <w:szCs w:val="18"/>
               </w:rPr>
-              <w:t xml:space="preserve">D</w:t>
+              <w:t xml:space="preserve">C (leakage)</w:t>
             </w:r>
           </w:p>
         </w:tc>
@@ -7136,7 +7136,7 @@
                 <w:sz w:val="18"/>
                 <w:szCs w:val="18"/>
               </w:rPr>
-              <w:t xml:space="preserve">One correct option</w:t>
+              <w:t xml:space="preserve">Fill in the blank</w:t>
             </w:r>
           </w:p>
         </w:tc>
@@ -7208,7 +7208,7 @@
                 <w:sz w:val="18"/>
                 <w:szCs w:val="18"/>
               </w:rPr>
-              <w:t xml:space="preserve">Hard</w:t>
+              <w:t xml:space="preserve">Easy</w:t>
             </w:r>
           </w:p>
         </w:tc>
@@ -7244,7 +7244,7 @@
                 <w:sz w:val="18"/>
                 <w:szCs w:val="18"/>
               </w:rPr>
-              <w:t xml:space="preserve">[F]</w:t>
+              <w:t xml:space="preserve">[S]</w:t>
             </w:r>
           </w:p>
         </w:tc>
@@ -7316,7 +7316,7 @@
                 <w:sz w:val="18"/>
                 <w:szCs w:val="18"/>
               </w:rPr>
-              <w:t xml:space="preserve">new</w:t>
+              <w:t xml:space="preserve">bank 3</w:t>
             </w:r>
           </w:p>
         </w:tc>
@@ -7391,7 +7391,7 @@
                 <w:sz w:val="18"/>
                 <w:szCs w:val="18"/>
               </w:rPr>
-              <w:t xml:space="preserve">A (overfitting)</w:t>
+              <w:t xml:space="preserve">A</w:t>
             </w:r>
           </w:p>
         </w:tc>
@@ -7427,7 +7427,7 @@
                 <w:sz w:val="18"/>
                 <w:szCs w:val="18"/>
               </w:rPr>
-              <w:t xml:space="preserve">Fill in the blank</w:t>
+              <w:t xml:space="preserve">One correct option</w:t>
             </w:r>
           </w:p>
         </w:tc>
@@ -7499,7 +7499,7 @@
                 <w:sz w:val="18"/>
                 <w:szCs w:val="18"/>
               </w:rPr>
-              <w:t xml:space="preserve">Easy</w:t>
+              <w:t xml:space="preserve">Hard</w:t>
             </w:r>
           </w:p>
         </w:tc>
@@ -7607,7 +7607,7 @@
                 <w:sz w:val="18"/>
                 <w:szCs w:val="18"/>
               </w:rPr>
-              <w:t xml:space="preserve">bank 4</w:t>
+              <w:t xml:space="preserve">new</w:t>
             </w:r>
           </w:p>
         </w:tc>
@@ -7682,7 +7682,7 @@
                 <w:sz w:val="18"/>
                 <w:szCs w:val="18"/>
               </w:rPr>
-              <w:t xml:space="preserve">D (split)</w:t>
+              <w:t xml:space="preserve">A, B, D</w:t>
             </w:r>
           </w:p>
         </w:tc>
@@ -7718,7 +7718,7 @@
                 <w:sz w:val="18"/>
                 <w:szCs w:val="18"/>
               </w:rPr>
-              <w:t xml:space="preserve">Fill in the blank</w:t>
+              <w:t xml:space="preserve">More than one correct</w:t>
             </w:r>
           </w:p>
         </w:tc>
@@ -7898,7 +7898,7 @@
                 <w:sz w:val="18"/>
                 <w:szCs w:val="18"/>
               </w:rPr>
-              <w:t xml:space="preserve">bank 5</w:t>
+              <w:t xml:space="preserve">new</w:t>
             </w:r>
           </w:p>
         </w:tc>
@@ -7973,7 +7973,7 @@
                 <w:sz w:val="18"/>
                 <w:szCs w:val="18"/>
               </w:rPr>
-              <w:t xml:space="preserve">A</w:t>
+              <w:t xml:space="preserve">B</w:t>
             </w:r>
           </w:p>
         </w:tc>
@@ -8117,7 +8117,7 @@
                 <w:sz w:val="18"/>
                 <w:szCs w:val="18"/>
               </w:rPr>
-              <w:t xml:space="preserve">[S]</w:t>
+              <w:t xml:space="preserve">[F]</w:t>
             </w:r>
           </w:p>
         </w:tc>
@@ -8264,7 +8264,7 @@
                 <w:sz w:val="18"/>
                 <w:szCs w:val="18"/>
               </w:rPr>
-              <w:t xml:space="preserve">A, B, D</w:t>
+              <w:t xml:space="preserve">C</w:t>
             </w:r>
           </w:p>
         </w:tc>
@@ -8300,7 +8300,7 @@
                 <w:sz w:val="18"/>
                 <w:szCs w:val="18"/>
               </w:rPr>
-              <w:t xml:space="preserve">More than one correct</w:t>
+              <w:t xml:space="preserve">True or false</w:t>
             </w:r>
           </w:p>
         </w:tc>
@@ -8372,7 +8372,7 @@
                 <w:sz w:val="18"/>
                 <w:szCs w:val="18"/>
               </w:rPr>
-              <w:t xml:space="preserve">Medium</w:t>
+              <w:t xml:space="preserve">Hard</w:t>
             </w:r>
           </w:p>
         </w:tc>
@@ -8408,7 +8408,7 @@
                 <w:sz w:val="18"/>
                 <w:szCs w:val="18"/>
               </w:rPr>
-              <w:t xml:space="preserve">[F]</w:t>
+              <w:t xml:space="preserve">[D]</w:t>
             </w:r>
           </w:p>
         </w:tc>
@@ -8555,7 +8555,7 @@
                 <w:sz w:val="18"/>
                 <w:szCs w:val="18"/>
               </w:rPr>
-              <w:t xml:space="preserve">B</w:t>
+              <w:t xml:space="preserve">A (overfitting)</w:t>
             </w:r>
           </w:p>
         </w:tc>
@@ -8591,7 +8591,7 @@
                 <w:sz w:val="18"/>
                 <w:szCs w:val="18"/>
               </w:rPr>
-              <w:t xml:space="preserve">One correct option</w:t>
+              <w:t xml:space="preserve">Fill in the blank</w:t>
             </w:r>
           </w:p>
         </w:tc>
@@ -8663,7 +8663,7 @@
                 <w:sz w:val="18"/>
                 <w:szCs w:val="18"/>
               </w:rPr>
-              <w:t xml:space="preserve">Hard</w:t>
+              <w:t xml:space="preserve">Easy</w:t>
             </w:r>
           </w:p>
         </w:tc>
@@ -8699,7 +8699,7 @@
                 <w:sz w:val="18"/>
                 <w:szCs w:val="18"/>
               </w:rPr>
-              <w:t xml:space="preserve">[F]</w:t>
+              <w:t xml:space="preserve">[S]</w:t>
             </w:r>
           </w:p>
         </w:tc>
@@ -8771,7 +8771,7 @@
                 <w:sz w:val="18"/>
                 <w:szCs w:val="18"/>
               </w:rPr>
-              <w:t xml:space="preserve">new</w:t>
+              <w:t xml:space="preserve">bank 4</w:t>
             </w:r>
           </w:p>
         </w:tc>
@@ -8846,7 +8846,7 @@
                 <w:sz w:val="18"/>
                 <w:szCs w:val="18"/>
               </w:rPr>
-              <w:t xml:space="preserve">C</w:t>
+              <w:t xml:space="preserve">D (split)</w:t>
             </w:r>
           </w:p>
         </w:tc>
@@ -8882,7 +8882,7 @@
                 <w:sz w:val="18"/>
                 <w:szCs w:val="18"/>
               </w:rPr>
-              <w:t xml:space="preserve">True or false</w:t>
+              <w:t xml:space="preserve">Fill in the blank</w:t>
             </w:r>
           </w:p>
         </w:tc>
@@ -8954,7 +8954,7 @@
                 <w:sz w:val="18"/>
                 <w:szCs w:val="18"/>
               </w:rPr>
-              <w:t xml:space="preserve">Hard</w:t>
+              <w:t xml:space="preserve">Medium</w:t>
             </w:r>
           </w:p>
         </w:tc>
@@ -8990,7 +8990,7 @@
                 <w:sz w:val="18"/>
                 <w:szCs w:val="18"/>
               </w:rPr>
-              <w:t xml:space="preserve">[D]</w:t>
+              <w:t xml:space="preserve">[F]</w:t>
             </w:r>
           </w:p>
         </w:tc>
@@ -9062,7 +9062,7 @@
                 <w:sz w:val="18"/>
                 <w:szCs w:val="18"/>
               </w:rPr>
-              <w:t xml:space="preserve">new</w:t>
+              <w:t xml:space="preserve">bank 5</w:t>
             </w:r>
           </w:p>
         </w:tc>
@@ -9827,7 +9827,7 @@
                 <w:sz w:val="18"/>
                 <w:szCs w:val="18"/>
               </w:rPr>
-              <w:t xml:space="preserve">Hard</w:t>
+              <w:t xml:space="preserve">Medium</w:t>
             </w:r>
           </w:p>
         </w:tc>
@@ -10310,7 +10310,7 @@
                 <w:sz w:val="21"/>
                 <w:szCs w:val="21"/>
               </w:rPr>
-              <w:t xml:space="preserve">   Key C (test)</w:t>
+              <w:t xml:space="preserve">   Key B</w:t>
             </w:r>
             <w:r>
               <w:rPr>
@@ -10319,7 +10319,7 @@
                 <w:sz w:val="18"/>
                 <w:szCs w:val="18"/>
               </w:rPr>
-              <w:t xml:space="preserve">   Fill in the blank, Easy, [S], Mon</w:t>
+              <w:t xml:space="preserve">   One correct option, Medium, [S], Mon</w:t>
             </w:r>
           </w:p>
           <w:p>
@@ -10345,7 +10345,88 @@
                 <w:sz w:val="21"/>
                 <w:szCs w:val="21"/>
               </w:rPr>
-              <w:t xml:space="preserve">The test slice is scored once, at the end, so its number is an honest estimate of how the chosen model does on clients it never influenced. Training fits the model and validation chooses among models and thresholds, so both are read many times. The week sealed the test slice on Monday in an envelope on the wall and opened it once on Friday.</w:t>
+              <w:t xml:space="preserve">The test slice is honest only while nothing about the model was chosen by looking at it. Moving the threshold until the test score improves makes the test a second validation slice, so the reported number now carries the analyst's selection and flatters the model. The committee is told the test was spent, and the honest check is one score on calls the model has not touched, such as the next month's. Monday sealed the slice in the envelope; Friday opened it once.</w:t>
+            </w:r>
+          </w:p>
+          <w:p>
+            <w:pPr>
+              <w:keepNext/>
+              <w:spacing w:after="40" w:line="264"/>
+              <w:ind w:left="360" w:hanging="360"/>
+            </w:pPr>
+            <w:r>
+              <w:rPr>
+                <w:rFonts w:ascii="Arial" w:cs="Arial" w:eastAsia="Arial" w:hAnsi="Arial"/>
+                <w:b/>
+                <w:bCs/>
+                <w:color w:val="1C1B16"/>
+                <w:sz w:val="20"/>
+                <w:szCs w:val="20"/>
+              </w:rPr>
+              <w:t xml:space="preserve">A.  </w:t>
+            </w:r>
+            <w:r>
+              <w:rPr>
+                <w:rFonts w:ascii="Arial" w:cs="Arial" w:eastAsia="Arial" w:hAnsi="Arial"/>
+                <w:color w:val="1C1B16"/>
+                <w:sz w:val="20"/>
+                <w:szCs w:val="20"/>
+              </w:rPr>
+              <w:t xml:space="preserve">Fitting the weights is one way to use the rows; choosing a threshold on them is another, and either one spends the slice.</w:t>
+            </w:r>
+          </w:p>
+          <w:p>
+            <w:pPr>
+              <w:keepNext/>
+              <w:spacing w:after="40" w:line="264"/>
+              <w:ind w:left="360" w:hanging="360"/>
+            </w:pPr>
+            <w:r>
+              <w:rPr>
+                <w:rFonts w:ascii="Arial" w:cs="Arial" w:eastAsia="Arial" w:hAnsi="Arial"/>
+                <w:b/>
+                <w:bCs/>
+                <w:color w:val="1C1B16"/>
+                <w:sz w:val="20"/>
+                <w:szCs w:val="20"/>
+              </w:rPr>
+              <w:t xml:space="preserve">C.  </w:t>
+            </w:r>
+            <w:r>
+              <w:rPr>
+                <w:rFonts w:ascii="Arial" w:cs="Arial" w:eastAsia="Arial" w:hAnsi="Arial"/>
+                <w:color w:val="1C1B16"/>
+                <w:sz w:val="20"/>
+                <w:szCs w:val="20"/>
+              </w:rPr>
+              <w:t xml:space="preserve">A threshold set on training rows sits on rows the model has memorised, so validation is the place to set it, and the test score is still spent.</w:t>
+            </w:r>
+          </w:p>
+          <w:p>
+            <w:pPr>
+              <w:keepNext/>
+              <w:spacing w:after="40" w:line="264"/>
+              <w:ind w:left="360" w:hanging="360"/>
+            </w:pPr>
+            <w:r>
+              <w:rPr>
+                <w:rFonts w:ascii="Arial" w:cs="Arial" w:eastAsia="Arial" w:hAnsi="Arial"/>
+                <w:b/>
+                <w:bCs/>
+                <w:color w:val="1C1B16"/>
+                <w:sz w:val="20"/>
+                <w:szCs w:val="20"/>
+              </w:rPr>
+              <w:t xml:space="preserve">D.  </w:t>
+            </w:r>
+            <w:r>
+              <w:rPr>
+                <w:rFonts w:ascii="Arial" w:cs="Arial" w:eastAsia="Arial" w:hAnsi="Arial"/>
+                <w:color w:val="1C1B16"/>
+                <w:sz w:val="20"/>
+                <w:szCs w:val="20"/>
+              </w:rPr>
+              <w:t xml:space="preserve">8,238 clients is plenty for one honest score, and pooling the spent slice with validation hides the peek inside a bigger number.</w:t>
             </w:r>
           </w:p>
           <w:p>
@@ -10371,7 +10452,7 @@
                 <w:sz w:val="21"/>
                 <w:szCs w:val="21"/>
               </w:rPr>
-              <w:t xml:space="preserve">Training fits, validation chooses, and the test is spent once, at the end; once I peek and change anything, it is validation.</w:t>
+              <w:t xml:space="preserve">The test is spent the moment it changes a decision, so I tell the committee it was spent and get one clean score on data nobody has looked at.</w:t>
             </w:r>
           </w:p>
           <w:p>
@@ -10386,7 +10467,7 @@
                 <w:sz w:val="18"/>
                 <w:szCs w:val="18"/>
               </w:rPr>
-              <w:t xml:space="preserve">Anchor: Train, validation, test: what is each for, and which is spent once?</w:t>
+              <w:t xml:space="preserve">Anchor: Train, validation, test: which is spent once?</w:t>
             </w:r>
           </w:p>
         </w:tc>
@@ -10458,7 +10539,7 @@
                 <w:sz w:val="21"/>
                 <w:szCs w:val="21"/>
               </w:rPr>
-              <w:t xml:space="preserve">   Key B</w:t>
+              <w:t xml:space="preserve">   Key C</w:t>
             </w:r>
             <w:r>
               <w:rPr>
@@ -10467,7 +10548,7 @@
                 <w:sz w:val="18"/>
                 <w:szCs w:val="18"/>
               </w:rPr>
-              <w:t xml:space="preserve">   One correct option, Hard, [S], Mon</w:t>
+              <w:t xml:space="preserve">   True or false, Hard, [D], Mon</w:t>
             </w:r>
           </w:p>
           <w:p>
@@ -10493,7 +10574,7 @@
                 <w:sz w:val="21"/>
                 <w:szCs w:val="21"/>
               </w:rPr>
-              <w:t xml:space="preserve">The test slice is honest only while nothing about the model was chosen by looking at it. Moving the threshold until the test score improves makes the test a second validation slice, so the reported number now carries the analyst's selection and flatters the model. The committee is told the test was spent, and the honest check is one score on calls the model has not touched, such as the next month's. Monday sealed the slice in the envelope; Friday opened it once.</w:t>
+              <w:t xml:space="preserve">The ask is about a campaign that has not happened yet, so the honest test trains on the earlier calls and scores the later ones. A random split puts calls from the same months in training and validation, and the month and the economic indicators mark the period, so the model partly learns when a call happened. On the week's run the yes rate moved from 5.6 to 24.6 percent across the file, and Friday's split by date cut the AUC from 0.795 to 0.657. Monday raised the split by time; Friday ran it.</w:t>
             </w:r>
           </w:p>
           <w:p>
@@ -10520,7 +10601,7 @@
                 <w:sz w:val="20"/>
                 <w:szCs w:val="20"/>
               </w:rPr>
-              <w:t xml:space="preserve">Fitting the weights is one way to use the rows; choosing a threshold on them is another, and either one spends the slice.</w:t>
+              <w:t xml:space="preserve">Stratifying keeps the yes share equal, and it says nothing about mixing months, which is what lets the random split flatter the model.</w:t>
             </w:r>
           </w:p>
           <w:p>
@@ -10538,7 +10619,7 @@
                 <w:sz w:val="20"/>
                 <w:szCs w:val="20"/>
               </w:rPr>
-              <w:t xml:space="preserve">C.  </w:t>
+              <w:t xml:space="preserve">B.  </w:t>
             </w:r>
             <w:r>
               <w:rPr>
@@ -10547,7 +10628,7 @@
                 <w:sz w:val="20"/>
                 <w:szCs w:val="20"/>
               </w:rPr>
-              <w:t xml:space="preserve">A threshold set on training rows sits on rows the model has memorised, so validation is the place to set it, and the test score is still spent.</w:t>
+              <w:t xml:space="preserve">The month and the five economic indicators each mark the period a call was made in, so the model reads time without a date column.</w:t>
             </w:r>
           </w:p>
           <w:p>
@@ -10574,7 +10655,7 @@
                 <w:sz w:val="20"/>
                 <w:szCs w:val="20"/>
               </w:rPr>
-              <w:t xml:space="preserve">8,238 clients is plenty for one honest score, and pooling the spent slice with validation hides the peek inside a bigger number.</w:t>
+              <w:t xml:space="preserve">Validation holds 928 yes rows under the random split; the problem is which months they come from, never how many there are.</w:t>
             </w:r>
           </w:p>
           <w:p>
@@ -10600,7 +10681,7 @@
                 <w:sz w:val="21"/>
                 <w:szCs w:val="21"/>
               </w:rPr>
-              <w:t xml:space="preserve">The test is spent the moment it changes a decision, so I tell the committee it was spent and get one clean score on data nobody has looked at.</w:t>
+              <w:t xml:space="preserve">I split the way the model will be used: train on the past, score on the later period, and expect that score to be lower than the random split's.</w:t>
             </w:r>
           </w:p>
           <w:p>
@@ -10615,7 +10696,7 @@
                 <w:sz w:val="18"/>
                 <w:szCs w:val="18"/>
               </w:rPr>
-              <w:t xml:space="preserve">Anchor: Train, validation, test: which is spent once?</w:t>
+              <w:t xml:space="preserve">Anchor: Train, validation, test: how should the rows be split for the question being asked?</w:t>
             </w:r>
           </w:p>
         </w:tc>
@@ -10687,7 +10768,7 @@
                 <w:sz w:val="21"/>
                 <w:szCs w:val="21"/>
               </w:rPr>
-              <w:t xml:space="preserve">   Key C</w:t>
+              <w:t xml:space="preserve">   Key D</w:t>
             </w:r>
             <w:r>
               <w:rPr>
@@ -10696,7 +10777,7 @@
                 <w:sz w:val="18"/>
                 <w:szCs w:val="18"/>
               </w:rPr>
-              <w:t xml:space="preserve">   True or false, Hard, [D], Mon</w:t>
+              <w:t xml:space="preserve">   One correct option, Medium, [F], Mon</w:t>
             </w:r>
           </w:p>
           <w:p>
@@ -10722,7 +10803,7 @@
                 <w:sz w:val="21"/>
                 <w:szCs w:val="21"/>
               </w:rPr>
-              <w:t xml:space="preserve">The ask is about a campaign that has not happened yet, so the honest test trains on the earlier calls and scores the later ones. A random split puts calls from the same months in training and validation, and the month and the economic indicators mark the period, so the model partly learns when a call happened. On the week's run the yes rate moved from 5.6 to 24.6 percent across the file, and Friday's split by date cut the AUC from 0.795 to 0.657. Monday raised the split by time; Friday ran it.</w:t>
+              <w:t xml:space="preserve">A logistic model outputs an estimated probability for one client, so 0.71 says that clients with this profile say yes about 71 times in 100, as long as the scores are calibrated against what actually happens. The threshold that turns it into a call is a business choice made afterwards: at Kalpa's costs it sits near 0.03, far below 0.5. Monday bent the line into the S on the bank's data.</w:t>
             </w:r>
           </w:p>
           <w:p>
@@ -10749,7 +10830,7 @@
                 <w:sz w:val="20"/>
                 <w:szCs w:val="20"/>
               </w:rPr>
-              <w:t xml:space="preserve">Stratifying keeps the yes share equal, and it says nothing about mixing months, which is what lets the random split flatter the model.</w:t>
+              <w:t xml:space="preserve">0.5 is a default, not part of the score; the threshold is set from the costs, and 0.71 is a chance, never a verdict.</w:t>
             </w:r>
           </w:p>
           <w:p>
@@ -10776,7 +10857,7 @@
                 <w:sz w:val="20"/>
                 <w:szCs w:val="20"/>
               </w:rPr>
-              <w:t xml:space="preserve">The month and the five economic indicators each mark the period a call was made in, so the model reads time without a date column.</w:t>
+              <w:t xml:space="preserve">Accuracy across many clients is a property of the model on a slice, while 0.71 belongs to one client.</w:t>
             </w:r>
           </w:p>
           <w:p>
@@ -10794,7 +10875,7 @@
                 <w:sz w:val="20"/>
                 <w:szCs w:val="20"/>
               </w:rPr>
-              <w:t xml:space="preserve">D.  </w:t>
+              <w:t xml:space="preserve">C.  </w:t>
             </w:r>
             <w:r>
               <w:rPr>
@@ -10803,7 +10884,7 @@
                 <w:sz w:val="20"/>
                 <w:szCs w:val="20"/>
               </w:rPr>
-              <w:t xml:space="preserve">Validation holds 928 yes rows under the random split; the problem is which months they come from, never how many there are.</w:t>
+              <w:t xml:space="preserve">0.71 is a probability, not a ratio against the average; against a base rate of 11 percent it is about six times the average chance.</w:t>
             </w:r>
           </w:p>
           <w:p>
@@ -10829,7 +10910,7 @@
                 <w:sz w:val="21"/>
                 <w:szCs w:val="21"/>
               </w:rPr>
-              <w:t xml:space="preserve">I split the way the model will be used: train on the past, score on the later period, and expect that score to be lower than the random split's.</w:t>
+              <w:t xml:space="preserve">0.71 is an estimated chance for this one client, trustworthy only if calibrated, and the decision to call comes from the threshold, which the costs set.</w:t>
             </w:r>
           </w:p>
           <w:p>
@@ -10844,7 +10925,7 @@
                 <w:sz w:val="18"/>
                 <w:szCs w:val="18"/>
               </w:rPr>
-              <w:t xml:space="preserve">Anchor: Train, validation, test: how should the rows be split for the question being asked?</w:t>
+              <w:t xml:space="preserve">Anchor: What does a logistic output of 0.71 mean?</w:t>
             </w:r>
           </w:p>
         </w:tc>
@@ -10916,7 +10997,7 @@
                 <w:sz w:val="21"/>
                 <w:szCs w:val="21"/>
               </w:rPr>
-              <w:t xml:space="preserve">   Key D</w:t>
+              <w:t xml:space="preserve">   Key A, D</w:t>
             </w:r>
             <w:r>
               <w:rPr>
@@ -10925,7 +11006,7 @@
                 <w:sz w:val="18"/>
                 <w:szCs w:val="18"/>
               </w:rPr>
-              <w:t xml:space="preserve">   One correct option, Medium, [F], Mon</w:t>
+              <w:t xml:space="preserve">   More than one correct, Medium, [S], Mon</w:t>
             </w:r>
           </w:p>
           <w:p>
@@ -10951,7 +11032,7 @@
                 <w:sz w:val="21"/>
                 <w:szCs w:val="21"/>
               </w:rPr>
-              <w:t xml:space="preserve">A logistic model outputs an estimated probability for one client, so 0.71 says that clients with this profile say yes about 71 times in 100, as long as the scores are calibrated against what actually happens. The threshold that turns it into a call is a business choice made afterwards: at Kalpa's costs it sits near 0.03, far below 0.5. Monday bent the line into the S on the bank's data.</w:t>
+              <w:t xml:space="preserve">A prediction problem asks about an outcome that has not happened yet, from what is known now, and has past examples to learn from. Ranking next month's clients and scoring a client never called before both ask about a future yes. Counting 2009's yes answers and listing past successes are queries on rows that already exist. Monday's first chapter sorted Kalpa's asks into prediction, rule and query.</w:t>
             </w:r>
           </w:p>
           <w:p>
@@ -10969,7 +11050,7 @@
                 <w:sz w:val="20"/>
                 <w:szCs w:val="20"/>
               </w:rPr>
-              <w:t xml:space="preserve">A.  </w:t>
+              <w:t xml:space="preserve">B.  </w:t>
             </w:r>
             <w:r>
               <w:rPr>
@@ -10978,7 +11059,7 @@
                 <w:sz w:val="20"/>
                 <w:szCs w:val="20"/>
               </w:rPr>
-              <w:t xml:space="preserve">0.5 is a default, not part of the score; the threshold is set from the costs, and 0.71 is a chance, never a verdict.</w:t>
+              <w:t xml:space="preserve">Every 2009 answer is already in the file, so a count answers it and no model is needed.</w:t>
             </w:r>
           </w:p>
           <w:p>
@@ -10996,7 +11077,7 @@
                 <w:sz w:val="20"/>
                 <w:szCs w:val="20"/>
               </w:rPr>
-              <w:t xml:space="preserve">B.  </w:t>
+              <w:t xml:space="preserve">C.  </w:t>
             </w:r>
             <w:r>
               <w:rPr>
@@ -11005,14 +11086,13 @@
                 <w:sz w:val="20"/>
                 <w:szCs w:val="20"/>
               </w:rPr>
-              <w:t xml:space="preserve">Accuracy across many clients is a property of the model on a slice, while 0.71 belongs to one client.</w:t>
+              <w:t xml:space="preserve">poutcome already records each past result, so a filter lists them; nothing is predicted.</w:t>
             </w:r>
           </w:p>
           <w:p>
             <w:pPr>
               <w:keepNext/>
-              <w:spacing w:after="40" w:line="264"/>
-              <w:ind w:left="360" w:hanging="360"/>
+              <w:spacing w:after="40" w:before="60" w:line="276"/>
             </w:pPr>
             <w:r>
               <w:rPr>
@@ -11020,32 +11100,6 @@
                 <w:b/>
                 <w:bCs/>
                 <w:color w:val="1C1B16"/>
-                <w:sz w:val="20"/>
-                <w:szCs w:val="20"/>
-              </w:rPr>
-              <w:t xml:space="preserve">C.  </w:t>
-            </w:r>
-            <w:r>
-              <w:rPr>
-                <w:rFonts w:ascii="Arial" w:cs="Arial" w:eastAsia="Arial" w:hAnsi="Arial"/>
-                <w:color w:val="1C1B16"/>
-                <w:sz w:val="20"/>
-                <w:szCs w:val="20"/>
-              </w:rPr>
-              <w:t xml:space="preserve">0.71 is a probability, not a ratio against the average; against a base rate of 11 percent it is about six times the average chance.</w:t>
-            </w:r>
-          </w:p>
-          <w:p>
-            <w:pPr>
-              <w:keepNext/>
-              <w:spacing w:after="40" w:before="60" w:line="276"/>
-            </w:pPr>
-            <w:r>
-              <w:rPr>
-                <w:rFonts w:ascii="Arial" w:cs="Arial" w:eastAsia="Arial" w:hAnsi="Arial"/>
-                <w:b/>
-                <w:bCs/>
-                <w:color w:val="1C1B16"/>
                 <w:sz w:val="21"/>
                 <w:szCs w:val="21"/>
               </w:rPr>
@@ -11058,7 +11112,7 @@
                 <w:sz w:val="21"/>
                 <w:szCs w:val="21"/>
               </w:rPr>
-              <w:t xml:space="preserve">0.71 is an estimated chance for this one client, trustworthy only if calibrated, and the decision to call comes from the threshold, which the costs set.</w:t>
+              <w:t xml:space="preserve">If the answer is already in a table, it is a query; if it is about a future outcome I have past examples of, it is a model.</w:t>
             </w:r>
           </w:p>
           <w:p>
@@ -11073,7 +11127,7 @@
                 <w:sz w:val="18"/>
                 <w:szCs w:val="18"/>
               </w:rPr>
-              <w:t xml:space="preserve">Anchor: What does a logistic output of 0.71 mean?</w:t>
+              <w:t xml:space="preserve">Anchor: When is a business problem a machine learning problem?</w:t>
             </w:r>
           </w:p>
         </w:tc>
@@ -11145,7 +11199,7 @@
                 <w:sz w:val="21"/>
                 <w:szCs w:val="21"/>
               </w:rPr>
-              <w:t xml:space="preserve">   Key A, D</w:t>
+              <w:t xml:space="preserve">   Key C (test)</w:t>
             </w:r>
             <w:r>
               <w:rPr>
@@ -11154,7 +11208,7 @@
                 <w:sz w:val="18"/>
                 <w:szCs w:val="18"/>
               </w:rPr>
-              <w:t xml:space="preserve">   More than one correct, Medium, [S], Mon</w:t>
+              <w:t xml:space="preserve">   Fill in the blank, Easy, [S], Mon</w:t>
             </w:r>
           </w:p>
           <w:p>
@@ -11180,14 +11234,13 @@
                 <w:sz w:val="21"/>
                 <w:szCs w:val="21"/>
               </w:rPr>
-              <w:t xml:space="preserve">A prediction problem asks about an outcome that has not happened yet, from what is known now, and has past examples to learn from. Ranking next month's clients and scoring a client never called before both ask about a future yes. Counting 2009's yes answers and listing past successes are queries on rows that already exist. Monday's first chapter sorted Kalpa's asks into prediction, rule and query.</w:t>
+              <w:t xml:space="preserve">The test slice is scored once, at the end, so its number is an honest estimate of how the chosen model does on clients it never influenced. Training fits the model and validation chooses among models and thresholds, so both are read many times. The week sealed the test slice on Monday in an envelope on the wall and opened it once on Friday.</w:t>
             </w:r>
           </w:p>
           <w:p>
             <w:pPr>
               <w:keepNext/>
-              <w:spacing w:after="40" w:line="264"/>
-              <w:ind w:left="360" w:hanging="360"/>
+              <w:spacing w:after="40" w:before="60" w:line="276"/>
             </w:pPr>
             <w:r>
               <w:rPr>
@@ -11195,59 +11248,6 @@
                 <w:b/>
                 <w:bCs/>
                 <w:color w:val="1C1B16"/>
-                <w:sz w:val="20"/>
-                <w:szCs w:val="20"/>
-              </w:rPr>
-              <w:t xml:space="preserve">B.  </w:t>
-            </w:r>
-            <w:r>
-              <w:rPr>
-                <w:rFonts w:ascii="Arial" w:cs="Arial" w:eastAsia="Arial" w:hAnsi="Arial"/>
-                <w:color w:val="1C1B16"/>
-                <w:sz w:val="20"/>
-                <w:szCs w:val="20"/>
-              </w:rPr>
-              <w:t xml:space="preserve">Every 2009 answer is already in the file, so a count answers it and no model is needed.</w:t>
-            </w:r>
-          </w:p>
-          <w:p>
-            <w:pPr>
-              <w:keepNext/>
-              <w:spacing w:after="40" w:line="264"/>
-              <w:ind w:left="360" w:hanging="360"/>
-            </w:pPr>
-            <w:r>
-              <w:rPr>
-                <w:rFonts w:ascii="Arial" w:cs="Arial" w:eastAsia="Arial" w:hAnsi="Arial"/>
-                <w:b/>
-                <w:bCs/>
-                <w:color w:val="1C1B16"/>
-                <w:sz w:val="20"/>
-                <w:szCs w:val="20"/>
-              </w:rPr>
-              <w:t xml:space="preserve">C.  </w:t>
-            </w:r>
-            <w:r>
-              <w:rPr>
-                <w:rFonts w:ascii="Arial" w:cs="Arial" w:eastAsia="Arial" w:hAnsi="Arial"/>
-                <w:color w:val="1C1B16"/>
-                <w:sz w:val="20"/>
-                <w:szCs w:val="20"/>
-              </w:rPr>
-              <w:t xml:space="preserve">poutcome already records each past result, so a filter lists them; nothing is predicted.</w:t>
-            </w:r>
-          </w:p>
-          <w:p>
-            <w:pPr>
-              <w:keepNext/>
-              <w:spacing w:after="40" w:before="60" w:line="276"/>
-            </w:pPr>
-            <w:r>
-              <w:rPr>
-                <w:rFonts w:ascii="Arial" w:cs="Arial" w:eastAsia="Arial" w:hAnsi="Arial"/>
-                <w:b/>
-                <w:bCs/>
-                <w:color w:val="1C1B16"/>
                 <w:sz w:val="21"/>
                 <w:szCs w:val="21"/>
               </w:rPr>
@@ -11260,7 +11260,7 @@
                 <w:sz w:val="21"/>
                 <w:szCs w:val="21"/>
               </w:rPr>
-              <w:t xml:space="preserve">If the answer is already in a table, it is a query; if it is about a future outcome I have past examples of, it is a model.</w:t>
+              <w:t xml:space="preserve">Training fits, validation chooses, and the test is spent once, at the end; once I peek and change anything, it is validation.</w:t>
             </w:r>
           </w:p>
           <w:p>
@@ -11275,7 +11275,7 @@
                 <w:sz w:val="18"/>
                 <w:szCs w:val="18"/>
               </w:rPr>
-              <w:t xml:space="preserve">Anchor: When is a business problem a machine learning problem?</w:t>
+              <w:t xml:space="preserve">Anchor: Train, validation, test: what is each for, and which is spent once?</w:t>
             </w:r>
           </w:p>
         </w:tc>
@@ -11347,7 +11347,7 @@
                 <w:sz w:val="21"/>
                 <w:szCs w:val="21"/>
               </w:rPr>
-              <w:t xml:space="preserve">   Key B (negatives)</w:t>
+              <w:t xml:space="preserve">   Key D</w:t>
             </w:r>
             <w:r>
               <w:rPr>
@@ -11356,7 +11356,7 @@
                 <w:sz w:val="18"/>
                 <w:szCs w:val="18"/>
               </w:rPr>
-              <w:t xml:space="preserve">   Fill in the blank, Easy, [S], Tue</w:t>
+              <w:t xml:space="preserve">   True or false, Hard, [F], Tue</w:t>
             </w:r>
           </w:p>
           <w:p>
@@ -11382,7 +11382,88 @@
                 <w:sz w:val="21"/>
                 <w:szCs w:val="21"/>
               </w:rPr>
-              <w:t xml:space="preserve">Recall is true positives over every actual positive, and the actual positives the model missed are the false negatives: on Tuesday's matrix, 174 over 174 plus 754. Precision is the ratio that takes false positives below the line.</w:t>
+              <w:t xml:space="preserve">On an outcome where 89 clients in 100 say no, saying no to everyone scores 0.887, so a point of accuracy above it says almost nothing about the campaign. The model at 0.5 calls 268 people and finds 174 of the 928 buyers, a recall of 0.19, and leaves 754 buyers uncalled. Beating the majority baseline is the floor, and the case for shipping is made on recall, precision and the bill. Tuesday's case opened on this matrix: the 89 percent model that called nobody.</w:t>
+            </w:r>
+          </w:p>
+          <w:p>
+            <w:pPr>
+              <w:keepNext/>
+              <w:spacing w:after="40" w:line="264"/>
+              <w:ind w:left="360" w:hanging="360"/>
+            </w:pPr>
+            <w:r>
+              <w:rPr>
+                <w:rFonts w:ascii="Arial" w:cs="Arial" w:eastAsia="Arial" w:hAnsi="Arial"/>
+                <w:b/>
+                <w:bCs/>
+                <w:color w:val="1C1B16"/>
+                <w:sz w:val="20"/>
+                <w:szCs w:val="20"/>
+              </w:rPr>
+              <w:t xml:space="preserve">A.  </w:t>
+            </w:r>
+            <w:r>
+              <w:rPr>
+                <w:rFonts w:ascii="Arial" w:cs="Arial" w:eastAsia="Arial" w:hAnsi="Arial"/>
+                <w:color w:val="1C1B16"/>
+                <w:sz w:val="20"/>
+                <w:szCs w:val="20"/>
+              </w:rPr>
+              <w:t xml:space="preserve">Beating the baseline is necessary, and on accuracy it is nearly free here, since the baseline itself is 0.887.</w:t>
+            </w:r>
+          </w:p>
+          <w:p>
+            <w:pPr>
+              <w:keepNext/>
+              <w:spacing w:after="40" w:line="264"/>
+              <w:ind w:left="360" w:hanging="360"/>
+            </w:pPr>
+            <w:r>
+              <w:rPr>
+                <w:rFonts w:ascii="Arial" w:cs="Arial" w:eastAsia="Arial" w:hAnsi="Arial"/>
+                <w:b/>
+                <w:bCs/>
+                <w:color w:val="1C1B16"/>
+                <w:sz w:val="20"/>
+                <w:szCs w:val="20"/>
+              </w:rPr>
+              <w:t xml:space="preserve">B.  </w:t>
+            </w:r>
+            <w:r>
+              <w:rPr>
+                <w:rFonts w:ascii="Arial" w:cs="Arial" w:eastAsia="Arial" w:hAnsi="Arial"/>
+                <w:color w:val="1C1B16"/>
+                <w:sz w:val="20"/>
+                <w:szCs w:val="20"/>
+              </w:rPr>
+              <w:t xml:space="preserve">The count is right, 94 plus 754 against 928, but it weighs a wasted call and a missed buyer the same, while one costs Rs 40 and the other Rs 1,200.</w:t>
+            </w:r>
+          </w:p>
+          <w:p>
+            <w:pPr>
+              <w:keepNext/>
+              <w:spacing w:after="40" w:line="264"/>
+              <w:ind w:left="360" w:hanging="360"/>
+            </w:pPr>
+            <w:r>
+              <w:rPr>
+                <w:rFonts w:ascii="Arial" w:cs="Arial" w:eastAsia="Arial" w:hAnsi="Arial"/>
+                <w:b/>
+                <w:bCs/>
+                <w:color w:val="1C1B16"/>
+                <w:sz w:val="20"/>
+                <w:szCs w:val="20"/>
+              </w:rPr>
+              <w:t xml:space="preserve">C.  </w:t>
+            </w:r>
+            <w:r>
+              <w:rPr>
+                <w:rFonts w:ascii="Arial" w:cs="Arial" w:eastAsia="Arial" w:hAnsi="Arial"/>
+                <w:color w:val="1C1B16"/>
+                <w:sz w:val="20"/>
+                <w:szCs w:val="20"/>
+              </w:rPr>
+              <w:t xml:space="preserve">Validation is where models and thresholds are compared, so 0.897 is a fair validation number; the trouble is what accuracy measures, not where it was read.</w:t>
             </w:r>
           </w:p>
           <w:p>
@@ -11408,7 +11489,7 @@
                 <w:sz w:val="21"/>
                 <w:szCs w:val="21"/>
               </w:rPr>
-              <w:t xml:space="preserve">Recall asks, of the buyers out there, how many I found, so its denominator is every real buyer, caught or missed.</w:t>
+              <w:t xml:space="preserve">On a lopsided outcome I quote the base rate first, then recall and precision, and accuracy last if at all.</w:t>
             </w:r>
           </w:p>
           <w:p>
@@ -11423,7 +11504,7 @@
                 <w:sz w:val="18"/>
                 <w:szCs w:val="18"/>
               </w:rPr>
-              <w:t xml:space="preserve">Anchor: Precision, recall and F1 from a confusion matrix.</w:t>
+              <w:t xml:space="preserve">Anchor: Accuracy is 96 percent on a 96 to 4 split; good model?</w:t>
             </w:r>
           </w:p>
         </w:tc>
@@ -11495,7 +11576,7 @@
                 <w:sz w:val="21"/>
                 <w:szCs w:val="21"/>
               </w:rPr>
-              <w:t xml:space="preserve">   Key D</w:t>
+              <w:t xml:space="preserve">   Key Precision 174 / 268 = 0.65; recall 174 / 928 = 0.19; F1 = 2 x 174 / (2 x 174 + 94 + 754) = 348 / 1,196 = 0.29.</w:t>
             </w:r>
             <w:r>
               <w:rPr>
@@ -11504,7 +11585,7 @@
                 <w:sz w:val="18"/>
                 <w:szCs w:val="18"/>
               </w:rPr>
-              <w:t xml:space="preserve">   True or false, Medium, [F], Tue</w:t>
+              <w:t xml:space="preserve">   Applied maths, Hard, [S], Tue</w:t>
             </w:r>
           </w:p>
           <w:p>
@@ -11530,14 +11611,13 @@
                 <w:sz w:val="21"/>
                 <w:szCs w:val="21"/>
               </w:rPr>
-              <w:t xml:space="preserve">On an outcome where 89 clients in 100 say no, saying no to everyone scores 0.887, so a point of accuracy above it says almost nothing about the campaign. The model at 0.5 calls 268 people and finds 174 of the 928 buyers, a recall of 0.19, and leaves 754 buyers uncalled. Beating the majority baseline is the floor, never the case for shipping; the case is made on recall, precision and the bill. Tuesday's case opened on this matrix: the 89 percent model that called nobody.</w:t>
+              <w:t xml:space="preserve">Precision divides the caught buyers by everyone called, 174 over 174 plus 94, 0.649. Recall divides them by every buyer, 174 over 174 plus 754, 0.1875. F1 is the harmonic mean, 2PR over P plus R, which on counts is 2TP over 2TP plus FP plus FN: 348 over 1,196, 0.291. The harmonic mean sits near the smaller of the two, which is why a low recall drags F1 down. Tuesday's deck taught precision and recall on this matrix and named F1 last.</w:t>
             </w:r>
           </w:p>
           <w:p>
             <w:pPr>
               <w:keepNext/>
-              <w:spacing w:after="40" w:line="264"/>
-              <w:ind w:left="360" w:hanging="360"/>
+              <w:spacing w:after="40" w:before="60" w:line="276"/>
             </w:pPr>
             <w:r>
               <w:rPr>
@@ -11545,86 +11625,6 @@
                 <w:b/>
                 <w:bCs/>
                 <w:color w:val="1C1B16"/>
-                <w:sz w:val="20"/>
-                <w:szCs w:val="20"/>
-              </w:rPr>
-              <w:t xml:space="preserve">A.  </w:t>
-            </w:r>
-            <w:r>
-              <w:rPr>
-                <w:rFonts w:ascii="Arial" w:cs="Arial" w:eastAsia="Arial" w:hAnsi="Arial"/>
-                <w:color w:val="1C1B16"/>
-                <w:sz w:val="20"/>
-                <w:szCs w:val="20"/>
-              </w:rPr>
-              <w:t xml:space="preserve">Beating the baseline is necessary, and on accuracy it is nearly free here, since the baseline itself is 0.887.</w:t>
-            </w:r>
-          </w:p>
-          <w:p>
-            <w:pPr>
-              <w:keepNext/>
-              <w:spacing w:after="40" w:line="264"/>
-              <w:ind w:left="360" w:hanging="360"/>
-            </w:pPr>
-            <w:r>
-              <w:rPr>
-                <w:rFonts w:ascii="Arial" w:cs="Arial" w:eastAsia="Arial" w:hAnsi="Arial"/>
-                <w:b/>
-                <w:bCs/>
-                <w:color w:val="1C1B16"/>
-                <w:sz w:val="20"/>
-                <w:szCs w:val="20"/>
-              </w:rPr>
-              <w:t xml:space="preserve">B.  </w:t>
-            </w:r>
-            <w:r>
-              <w:rPr>
-                <w:rFonts w:ascii="Arial" w:cs="Arial" w:eastAsia="Arial" w:hAnsi="Arial"/>
-                <w:color w:val="1C1B16"/>
-                <w:sz w:val="20"/>
-                <w:szCs w:val="20"/>
-              </w:rPr>
-              <w:t xml:space="preserve">The count is right, 94 plus 754 against 928, but it weighs a wasted call and a missed buyer the same, while one costs Rs 40 and the other Rs 1,200.</w:t>
-            </w:r>
-          </w:p>
-          <w:p>
-            <w:pPr>
-              <w:keepNext/>
-              <w:spacing w:after="40" w:line="264"/>
-              <w:ind w:left="360" w:hanging="360"/>
-            </w:pPr>
-            <w:r>
-              <w:rPr>
-                <w:rFonts w:ascii="Arial" w:cs="Arial" w:eastAsia="Arial" w:hAnsi="Arial"/>
-                <w:b/>
-                <w:bCs/>
-                <w:color w:val="1C1B16"/>
-                <w:sz w:val="20"/>
-                <w:szCs w:val="20"/>
-              </w:rPr>
-              <w:t xml:space="preserve">C.  </w:t>
-            </w:r>
-            <w:r>
-              <w:rPr>
-                <w:rFonts w:ascii="Arial" w:cs="Arial" w:eastAsia="Arial" w:hAnsi="Arial"/>
-                <w:color w:val="1C1B16"/>
-                <w:sz w:val="20"/>
-                <w:szCs w:val="20"/>
-              </w:rPr>
-              <w:t xml:space="preserve">Validation is where models and thresholds are compared, so 0.897 is a fair validation number; the trouble is what accuracy measures, not where it was read.</w:t>
-            </w:r>
-          </w:p>
-          <w:p>
-            <w:pPr>
-              <w:keepNext/>
-              <w:spacing w:after="40" w:before="60" w:line="276"/>
-            </w:pPr>
-            <w:r>
-              <w:rPr>
-                <w:rFonts w:ascii="Arial" w:cs="Arial" w:eastAsia="Arial" w:hAnsi="Arial"/>
-                <w:b/>
-                <w:bCs/>
-                <w:color w:val="1C1B16"/>
                 <w:sz w:val="21"/>
                 <w:szCs w:val="21"/>
               </w:rPr>
@@ -11637,7 +11637,7 @@
                 <w:sz w:val="21"/>
                 <w:szCs w:val="21"/>
               </w:rPr>
-              <w:t xml:space="preserve">On a lopsided outcome I quote the base rate first, then recall and precision, and accuracy last if at all.</w:t>
+              <w:t xml:space="preserve">Precision is of those I called, recall is of those out there, and F1 is their harmonic mean, 2TP over 2TP plus FP plus FN.</w:t>
             </w:r>
           </w:p>
           <w:p>
@@ -11652,7 +11652,7 @@
                 <w:sz w:val="18"/>
                 <w:szCs w:val="18"/>
               </w:rPr>
-              <w:t xml:space="preserve">Anchor: Accuracy is 96 percent on a 96 to 4 split; good model?</w:t>
+              <w:t xml:space="preserve">Anchor: Precision, recall and F1 from a confusion matrix.</w:t>
             </w:r>
           </w:p>
         </w:tc>
@@ -11724,7 +11724,7 @@
                 <w:sz w:val="21"/>
                 <w:szCs w:val="21"/>
               </w:rPr>
-              <w:t xml:space="preserve">   Key Precision 174 / 268 = 0.65; recall 174 / 928 = 0.19; F1 = 2 x 174 / (2 x 174 + 94 + 754) = 348 / 1,196 = 0.29.</w:t>
+              <w:t xml:space="preserve">   Key Call when p x 1,200 &gt; (1 - p) x 40, so p &gt; 40 / 1,240 = 1 / 31, about 0.032; the line moves down from 0.5 and recall leads.</w:t>
             </w:r>
             <w:r>
               <w:rPr>
@@ -11733,7 +11733,7 @@
                 <w:sz w:val="18"/>
                 <w:szCs w:val="18"/>
               </w:rPr>
-              <w:t xml:space="preserve">   Applied maths, Hard, [S], Tue</w:t>
+              <w:t xml:space="preserve">   Applied maths, Medium, [S], Tue</w:t>
             </w:r>
           </w:p>
           <w:p>
@@ -11759,7 +11759,7 @@
                 <w:sz w:val="21"/>
                 <w:szCs w:val="21"/>
               </w:rPr>
-              <w:t xml:space="preserve">Precision divides the caught buyers by everyone called, 174 over 174 plus 94, 0.649. Recall divides them by every buyer, 174 over 174 plus 754, 0.1875. F1 is the harmonic mean, 2PR over P plus R, which on counts is 2TP over 2TP plus FP plus FN: 348 over 1,196, 0.291. The harmonic mean sits near the smaller of the two, which is why a low recall drags F1 down. Tuesday's deck taught precision and recall on this matrix and named F1 last.</w:t>
+              <w:t xml:space="preserve">Call when the expected loss of not calling, p times Rs 1,200, is above the expected loss of calling, (1 minus p) times Rs 40. That gives p above 40 over 1,240, 1 in 31, about 0.032. In plain words, one caught buyer pays for 30 wasted calls, so a call is worth it above about a 1-in-31 chance. The line moves far below 0.5, so recall leads, because a miss costs thirty times a wasted call. The rule assumes calibrated scores. Tuesday's chapter on what each mistake costs taught the 1-in-N test as coins.</w:t>
             </w:r>
           </w:p>
           <w:p>
@@ -11785,7 +11785,7 @@
                 <w:sz w:val="21"/>
                 <w:szCs w:val="21"/>
               </w:rPr>
-              <w:t xml:space="preserve">Precision is of those I called, recall is of those out there, and F1 is their harmonic mean, 2TP over 2TP plus FP plus FN.</w:t>
+              <w:t xml:space="preserve">The line sits at the cost of a false alarm over the sum of both costs, so when a miss costs thirty times a false alarm I act on about a 1-in-31 chance.</w:t>
             </w:r>
           </w:p>
           <w:p>
@@ -11800,7 +11800,7 @@
                 <w:sz w:val="18"/>
                 <w:szCs w:val="18"/>
               </w:rPr>
-              <w:t xml:space="preserve">Anchor: Precision, recall and F1 from a confusion matrix.</w:t>
+              <w:t xml:space="preserve">Anchor: How do you set a threshold when the two errors cost differently?</w:t>
             </w:r>
           </w:p>
         </w:tc>
@@ -11872,7 +11872,7 @@
                 <w:sz w:val="21"/>
                 <w:szCs w:val="21"/>
               </w:rPr>
-              <w:t xml:space="preserve">   Key Call when p x 1,200 &gt; (1 - p) x 40, so p &gt; 40 / 1,240 = 1 / 31, about 0.032; the line moves down from 0.5 and recall leads.</w:t>
+              <w:t xml:space="preserve">   Key B</w:t>
             </w:r>
             <w:r>
               <w:rPr>
@@ -11881,7 +11881,7 @@
                 <w:sz w:val="18"/>
                 <w:szCs w:val="18"/>
               </w:rPr>
-              <w:t xml:space="preserve">   Applied maths, Medium, [S], Tue</w:t>
+              <w:t xml:space="preserve">   One correct option, Hard, [S], Tue</w:t>
             </w:r>
           </w:p>
           <w:p>
@@ -11907,7 +11907,88 @@
                 <w:sz w:val="21"/>
                 <w:szCs w:val="21"/>
               </w:rPr>
-              <w:t xml:space="preserve">Call when the expected loss of not calling, p times Rs 1,200, is above the expected loss of calling, (1 minus p) times Rs 40. That gives p above 40 over 1,240, 1 in 31, about 0.032. In plain words, one caught buyer pays for 30 wasted calls, so a call is worth it above about a 1-in-31 chance. The line moves far below 0.5, so recall leads, because a miss costs thirty times a wasted call. The rule assumes calibrated scores. Tuesday's chapter on what each mistake costs taught the 1-in-N test as coins.</w:t>
+              <w:t xml:space="preserve">The bill adds each wasted call at Rs 40 and each missed buyer at Rs 1,200. At 0.5 that is 94 times 40 plus 754 times 1,200, Rs 3,760 plus Rs 904,800, Rs 908,560. At 0.10 it is 2,138 times 40 plus 312 times 1,200, Rs 85,520 plus Rs 374,400, Rs 459,920. Lowering the line wastes 2,044 more calls and catches 442 more buyers, and the bill falls by Rs 448,640. Tuesday's slider drew this bill against the threshold.</w:t>
+            </w:r>
+          </w:p>
+          <w:p>
+            <w:pPr>
+              <w:keepNext/>
+              <w:spacing w:after="40" w:line="264"/>
+              <w:ind w:left="360" w:hanging="360"/>
+            </w:pPr>
+            <w:r>
+              <w:rPr>
+                <w:rFonts w:ascii="Arial" w:cs="Arial" w:eastAsia="Arial" w:hAnsi="Arial"/>
+                <w:b/>
+                <w:bCs/>
+                <w:color w:val="1C1B16"/>
+                <w:sz w:val="20"/>
+                <w:szCs w:val="20"/>
+              </w:rPr>
+              <w:t xml:space="preserve">A.  </w:t>
+            </w:r>
+            <w:r>
+              <w:rPr>
+                <w:rFonts w:ascii="Arial" w:cs="Arial" w:eastAsia="Arial" w:hAnsi="Arial"/>
+                <w:color w:val="1C1B16"/>
+                <w:sz w:val="20"/>
+                <w:szCs w:val="20"/>
+              </w:rPr>
+              <w:t xml:space="preserve">This swaps the two prices, charging Rs 1,200 for each wasted call and Rs 40 for each miss.</w:t>
+            </w:r>
+          </w:p>
+          <w:p>
+            <w:pPr>
+              <w:keepNext/>
+              <w:spacing w:after="40" w:line="264"/>
+              <w:ind w:left="360" w:hanging="360"/>
+            </w:pPr>
+            <w:r>
+              <w:rPr>
+                <w:rFonts w:ascii="Arial" w:cs="Arial" w:eastAsia="Arial" w:hAnsi="Arial"/>
+                <w:b/>
+                <w:bCs/>
+                <w:color w:val="1C1B16"/>
+                <w:sz w:val="20"/>
+                <w:szCs w:val="20"/>
+              </w:rPr>
+              <w:t xml:space="preserve">C.  </w:t>
+            </w:r>
+            <w:r>
+              <w:rPr>
+                <w:rFonts w:ascii="Arial" w:cs="Arial" w:eastAsia="Arial" w:hAnsi="Arial"/>
+                <w:color w:val="1C1B16"/>
+                <w:sz w:val="20"/>
+                <w:szCs w:val="20"/>
+              </w:rPr>
+              <w:t xml:space="preserve">This counts only the wasted calls and forgets the missed buyers, the larger cost by far.</w:t>
+            </w:r>
+          </w:p>
+          <w:p>
+            <w:pPr>
+              <w:keepNext/>
+              <w:spacing w:after="40" w:line="264"/>
+              <w:ind w:left="360" w:hanging="360"/>
+            </w:pPr>
+            <w:r>
+              <w:rPr>
+                <w:rFonts w:ascii="Arial" w:cs="Arial" w:eastAsia="Arial" w:hAnsi="Arial"/>
+                <w:b/>
+                <w:bCs/>
+                <w:color w:val="1C1B16"/>
+                <w:sz w:val="20"/>
+                <w:szCs w:val="20"/>
+              </w:rPr>
+              <w:t xml:space="preserve">D.  </w:t>
+            </w:r>
+            <w:r>
+              <w:rPr>
+                <w:rFonts w:ascii="Arial" w:cs="Arial" w:eastAsia="Arial" w:hAnsi="Arial"/>
+                <w:color w:val="1C1B16"/>
+                <w:sz w:val="20"/>
+                <w:szCs w:val="20"/>
+              </w:rPr>
+              <w:t xml:space="preserve">This counts only the missed buyers and forgets the 94 and 2,138 wasted calls.</w:t>
             </w:r>
           </w:p>
           <w:p>
@@ -11933,7 +12014,7 @@
                 <w:sz w:val="21"/>
                 <w:szCs w:val="21"/>
               </w:rPr>
-              <w:t xml:space="preserve">The line sits at the cost of a false alarm over the sum of both costs, so when a miss costs thirty times a false alarm I act on about a 1-in-31 chance.</w:t>
+              <w:t xml:space="preserve">I price both boxes of errors at each threshold and add them, because the threshold that looks wasteful on calls can be the cheaper one once misses are priced.</w:t>
             </w:r>
           </w:p>
           <w:p>
@@ -12020,7 +12101,7 @@
                 <w:sz w:val="21"/>
                 <w:szCs w:val="21"/>
               </w:rPr>
-              <w:t xml:space="preserve">   Key B</w:t>
+              <w:t xml:space="preserve">   Key C</w:t>
             </w:r>
             <w:r>
               <w:rPr>
@@ -12029,7 +12110,7 @@
                 <w:sz w:val="18"/>
                 <w:szCs w:val="18"/>
               </w:rPr>
-              <w:t xml:space="preserve">   One correct option, Hard, [S], Tue</w:t>
+              <w:t xml:space="preserve">   One correct option, Hard, [D], Tue</w:t>
             </w:r>
           </w:p>
           <w:p>
@@ -12055,7 +12136,7 @@
                 <w:sz w:val="21"/>
                 <w:szCs w:val="21"/>
               </w:rPr>
-              <w:t xml:space="preserve">The bill adds each wasted call at Rs 40 and each missed buyer at Rs 1,200. At 0.5 that is 94 times 40 plus 754 times 1,200, Rs 3,760 plus Rs 904,800, Rs 908,560. At 0.10 it is 2,138 times 40 plus 312 times 1,200, Rs 85,520 plus Rs 374,400, Rs 459,920. Lowering the line wastes 2,044 more calls and catches 442 more buyers, and the bill falls by Rs 448,640. Tuesday's slider drew this bill against the threshold.</w:t>
+              <w:t xml:space="preserve">When the budget binds before the cost line does, the ranking carries the decision: call the 1,000 highest scores. On validation they hold 404 buyers, a precision at 1,000 of 0.404, against the base rate of 0.113, about 3.6 times. This is the flip condition of the cost rule: at Rs 40 against Rs 1,200 the line says call nearly everyone, and the binding constraint is the budget. Tuesday's budget cut, precision at k, set Kalpa's 5,000 nudges the same way.</w:t>
             </w:r>
           </w:p>
           <w:p>
@@ -12082,7 +12163,7 @@
                 <w:sz w:val="20"/>
                 <w:szCs w:val="20"/>
               </w:rPr>
-              <w:t xml:space="preserve">This swaps the two prices, charging Rs 1,200 for each wasted call and Rs 40 for each miss.</w:t>
+              <w:t xml:space="preserve">The file's order is not the score's order, so the first 1,000 above the line convert at about the base rate and waste the ranking.</w:t>
             </w:r>
           </w:p>
           <w:p>
@@ -12100,7 +12181,7 @@
                 <w:sz w:val="20"/>
                 <w:szCs w:val="20"/>
               </w:rPr>
-              <w:t xml:space="preserve">C.  </w:t>
+              <w:t xml:space="preserve">B.  </w:t>
             </w:r>
             <w:r>
               <w:rPr>
@@ -12109,7 +12190,7 @@
                 <w:sz w:val="20"/>
                 <w:szCs w:val="20"/>
               </w:rPr>
-              <w:t xml:space="preserve">This counts only the wasted calls and forgets the missed buyers, the larger cost by far.</w:t>
+              <w:t xml:space="preserve">268 calls leave 732 of the budget unused, and the next 732 by score still convert far above the base rate.</w:t>
             </w:r>
           </w:p>
           <w:p>
@@ -12136,7 +12217,7 @@
                 <w:sz w:val="20"/>
                 <w:szCs w:val="20"/>
               </w:rPr>
-              <w:t xml:space="preserve">This counts only the missed buyers and forgets the 94 and 2,138 wasted calls.</w:t>
+              <w:t xml:space="preserve">A random 1,000 converts at about the base rate, 0.113, while the top 1,000 convert at 0.404, so the ranking is far from noise.</w:t>
             </w:r>
           </w:p>
           <w:p>
@@ -12162,7 +12243,7 @@
                 <w:sz w:val="21"/>
                 <w:szCs w:val="21"/>
               </w:rPr>
-              <w:t xml:space="preserve">I price both boxes of errors at each threshold and add them, because the threshold that looks wasteful on calls can be the cheaper one once misses are priced.</w:t>
+              <w:t xml:space="preserve">When the budget binds, I rank and cut at the budget and report precision at that cut against the base rate, which is what the money buys.</w:t>
             </w:r>
           </w:p>
           <w:p>
@@ -12177,7 +12258,7 @@
                 <w:sz w:val="18"/>
                 <w:szCs w:val="18"/>
               </w:rPr>
-              <w:t xml:space="preserve">Anchor: How do you set a threshold when the two errors cost differently?</w:t>
+              <w:t xml:space="preserve">Anchor: The cost rule says call nearly everyone, and the budget says 1,000 calls: which wins, and what do you report?</w:t>
             </w:r>
           </w:p>
         </w:tc>
@@ -12249,7 +12330,7 @@
                 <w:sz w:val="21"/>
                 <w:szCs w:val="21"/>
               </w:rPr>
-              <w:t xml:space="preserve">   Key C</w:t>
+              <w:t xml:space="preserve">   Key B (negatives)</w:t>
             </w:r>
             <w:r>
               <w:rPr>
@@ -12258,7 +12339,7 @@
                 <w:sz w:val="18"/>
                 <w:szCs w:val="18"/>
               </w:rPr>
-              <w:t xml:space="preserve">   One correct option, Hard, [D], Tue</w:t>
+              <w:t xml:space="preserve">   Fill in the blank, Easy, [S], Tue</w:t>
             </w:r>
           </w:p>
           <w:p>
@@ -12284,14 +12365,13 @@
                 <w:sz w:val="21"/>
                 <w:szCs w:val="21"/>
               </w:rPr>
-              <w:t xml:space="preserve">When the budget binds before the cost line does, the ranking carries the decision: call the 1,000 highest scores. On validation they hold 404 buyers, a precision at 1,000 of 0.404, against the base rate of 0.113, about 3.6 times. This is the flip condition of the cost rule: at Rs 40 against Rs 1,200 the line says call nearly everyone, and the binding constraint is the budget. Tuesday's budget cut, precision at k, set Kalpa's 5,000 nudges the same way.</w:t>
+              <w:t xml:space="preserve">Recall is true positives over every actual positive, and the actual positives the model missed are the false negatives: on Tuesday's matrix, 174 over 174 plus 754. Precision is the ratio that takes false positives below the line.</w:t>
             </w:r>
           </w:p>
           <w:p>
             <w:pPr>
               <w:keepNext/>
-              <w:spacing w:after="40" w:line="264"/>
-              <w:ind w:left="360" w:hanging="360"/>
+              <w:spacing w:after="40" w:before="60" w:line="276"/>
             </w:pPr>
             <w:r>
               <w:rPr>
@@ -12299,86 +12379,6 @@
                 <w:b/>
                 <w:bCs/>
                 <w:color w:val="1C1B16"/>
-                <w:sz w:val="20"/>
-                <w:szCs w:val="20"/>
-              </w:rPr>
-              <w:t xml:space="preserve">A.  </w:t>
-            </w:r>
-            <w:r>
-              <w:rPr>
-                <w:rFonts w:ascii="Arial" w:cs="Arial" w:eastAsia="Arial" w:hAnsi="Arial"/>
-                <w:color w:val="1C1B16"/>
-                <w:sz w:val="20"/>
-                <w:szCs w:val="20"/>
-              </w:rPr>
-              <w:t xml:space="preserve">The file's order is not the score's order, so the first 1,000 above the line convert at about the base rate and waste the ranking.</w:t>
-            </w:r>
-          </w:p>
-          <w:p>
-            <w:pPr>
-              <w:keepNext/>
-              <w:spacing w:after="40" w:line="264"/>
-              <w:ind w:left="360" w:hanging="360"/>
-            </w:pPr>
-            <w:r>
-              <w:rPr>
-                <w:rFonts w:ascii="Arial" w:cs="Arial" w:eastAsia="Arial" w:hAnsi="Arial"/>
-                <w:b/>
-                <w:bCs/>
-                <w:color w:val="1C1B16"/>
-                <w:sz w:val="20"/>
-                <w:szCs w:val="20"/>
-              </w:rPr>
-              <w:t xml:space="preserve">B.  </w:t>
-            </w:r>
-            <w:r>
-              <w:rPr>
-                <w:rFonts w:ascii="Arial" w:cs="Arial" w:eastAsia="Arial" w:hAnsi="Arial"/>
-                <w:color w:val="1C1B16"/>
-                <w:sz w:val="20"/>
-                <w:szCs w:val="20"/>
-              </w:rPr>
-              <w:t xml:space="preserve">268 calls leave 732 of the budget unused, and the next 732 by score still convert far above the base rate.</w:t>
-            </w:r>
-          </w:p>
-          <w:p>
-            <w:pPr>
-              <w:keepNext/>
-              <w:spacing w:after="40" w:line="264"/>
-              <w:ind w:left="360" w:hanging="360"/>
-            </w:pPr>
-            <w:r>
-              <w:rPr>
-                <w:rFonts w:ascii="Arial" w:cs="Arial" w:eastAsia="Arial" w:hAnsi="Arial"/>
-                <w:b/>
-                <w:bCs/>
-                <w:color w:val="1C1B16"/>
-                <w:sz w:val="20"/>
-                <w:szCs w:val="20"/>
-              </w:rPr>
-              <w:t xml:space="preserve">D.  </w:t>
-            </w:r>
-            <w:r>
-              <w:rPr>
-                <w:rFonts w:ascii="Arial" w:cs="Arial" w:eastAsia="Arial" w:hAnsi="Arial"/>
-                <w:color w:val="1C1B16"/>
-                <w:sz w:val="20"/>
-                <w:szCs w:val="20"/>
-              </w:rPr>
-              <w:t xml:space="preserve">A random 1,000 converts at about the base rate, 0.113, while the top 1,000 convert at 0.404, so the ranking is far from noise.</w:t>
-            </w:r>
-          </w:p>
-          <w:p>
-            <w:pPr>
-              <w:keepNext/>
-              <w:spacing w:after="40" w:before="60" w:line="276"/>
-            </w:pPr>
-            <w:r>
-              <w:rPr>
-                <w:rFonts w:ascii="Arial" w:cs="Arial" w:eastAsia="Arial" w:hAnsi="Arial"/>
-                <w:b/>
-                <w:bCs/>
-                <w:color w:val="1C1B16"/>
                 <w:sz w:val="21"/>
                 <w:szCs w:val="21"/>
               </w:rPr>
@@ -12391,7 +12391,7 @@
                 <w:sz w:val="21"/>
                 <w:szCs w:val="21"/>
               </w:rPr>
-              <w:t xml:space="preserve">When the budget binds, I rank and cut at the budget and report precision at that cut against the base rate, which is what the money buys.</w:t>
+              <w:t xml:space="preserve">Recall asks, of the buyers out there, how many I found, so its denominator is every real buyer, caught or missed.</w:t>
             </w:r>
           </w:p>
           <w:p>
@@ -12406,7 +12406,7 @@
                 <w:sz w:val="18"/>
                 <w:szCs w:val="18"/>
               </w:rPr>
-              <w:t xml:space="preserve">Anchor: The cost rule says call nearly everyone, and the budget says 1,000 calls: which wins, and what do you report?</w:t>
+              <w:t xml:space="preserve">Anchor: Precision, recall and F1 from a confusion matrix.</w:t>
             </w:r>
           </w:p>
         </w:tc>
@@ -12478,7 +12478,7 @@
                 <w:sz w:val="21"/>
                 <w:szCs w:val="21"/>
               </w:rPr>
-              <w:t xml:space="preserve">   Key C (leakage)</w:t>
+              <w:t xml:space="preserve">   Key C</w:t>
             </w:r>
             <w:r>
               <w:rPr>
@@ -12487,7 +12487,7 @@
                 <w:sz w:val="18"/>
                 <w:szCs w:val="18"/>
               </w:rPr>
-              <w:t xml:space="preserve">   Fill in the blank, Easy, [S], Wed</w:t>
+              <w:t xml:space="preserve">   One correct option, Hard, [S], Wed</w:t>
             </w:r>
           </w:p>
           <w:p>
@@ -12513,7 +12513,88 @@
                 <w:sz w:val="21"/>
                 <w:szCs w:val="21"/>
               </w:rPr>
-              <w:t xml:space="preserve">A column the model could not have at the moment of prediction leaks the answer into training, which is data leakage; duration is the week's example, known only once the call ends. Drift is the world changing after training, and collinearity is columns moving together, Wednesday's sign flip.</w:t>
+              <w:t xml:space="preserve">On the morning the list is built no call has happened, so its duration does not exist; a model that uses it learns from the answer. The dataset's own notes say so and ask for it to be discarded for a realistic model. The honest score is the one without it, 0.795. A jump this large from one column is the alarm, and the prediction-time question is the check. Wednesday read the notes aloud; Kalpa's settlement_status was the same leak.</w:t>
+            </w:r>
+          </w:p>
+          <w:p>
+            <w:pPr>
+              <w:keepNext/>
+              <w:spacing w:after="40" w:line="264"/>
+              <w:ind w:left="360" w:hanging="360"/>
+            </w:pPr>
+            <w:r>
+              <w:rPr>
+                <w:rFonts w:ascii="Arial" w:cs="Arial" w:eastAsia="Arial" w:hAnsi="Arial"/>
+                <w:b/>
+                <w:bCs/>
+                <w:color w:val="1C1B16"/>
+                <w:sz w:val="20"/>
+                <w:szCs w:val="20"/>
+              </w:rPr>
+              <w:t xml:space="preserve">A.  </w:t>
+            </w:r>
+            <w:r>
+              <w:rPr>
+                <w:rFonts w:ascii="Arial" w:cs="Arial" w:eastAsia="Arial" w:hAnsi="Arial"/>
+                <w:color w:val="1C1B16"/>
+                <w:sz w:val="20"/>
+                <w:szCs w:val="20"/>
+              </w:rPr>
+              <w:t xml:space="preserve">The authors include it for benchmarks and say to discard it for a realistic model, which is what a call list is.</w:t>
+            </w:r>
+          </w:p>
+          <w:p>
+            <w:pPr>
+              <w:keepNext/>
+              <w:spacing w:after="40" w:line="264"/>
+              <w:ind w:left="360" w:hanging="360"/>
+            </w:pPr>
+            <w:r>
+              <w:rPr>
+                <w:rFonts w:ascii="Arial" w:cs="Arial" w:eastAsia="Arial" w:hAnsi="Arial"/>
+                <w:b/>
+                <w:bCs/>
+                <w:color w:val="1C1B16"/>
+                <w:sz w:val="20"/>
+                <w:szCs w:val="20"/>
+              </w:rPr>
+              <w:t xml:space="preserve">B.  </w:t>
+            </w:r>
+            <w:r>
+              <w:rPr>
+                <w:rFonts w:ascii="Arial" w:cs="Arial" w:eastAsia="Arial" w:hAnsi="Arial"/>
+                <w:color w:val="1C1B16"/>
+                <w:sz w:val="20"/>
+                <w:szCs w:val="20"/>
+              </w:rPr>
+              <w:t xml:space="preserve">Accuracy barely moves on an 89 percent no outcome even when the leak is large; the recall nearly doubles, 174 to 390 buyers found, and that is the leak showing.</w:t>
+            </w:r>
+          </w:p>
+          <w:p>
+            <w:pPr>
+              <w:keepNext/>
+              <w:spacing w:after="40" w:line="264"/>
+              <w:ind w:left="360" w:hanging="360"/>
+            </w:pPr>
+            <w:r>
+              <w:rPr>
+                <w:rFonts w:ascii="Arial" w:cs="Arial" w:eastAsia="Arial" w:hAnsi="Arial"/>
+                <w:b/>
+                <w:bCs/>
+                <w:color w:val="1C1B16"/>
+                <w:sz w:val="20"/>
+                <w:szCs w:val="20"/>
+              </w:rPr>
+              <w:t xml:space="preserve">D.  </w:t>
+            </w:r>
+            <w:r>
+              <w:rPr>
+                <w:rFonts w:ascii="Arial" w:cs="Arial" w:eastAsia="Arial" w:hAnsi="Arial"/>
+                <w:color w:val="1C1B16"/>
+                <w:sz w:val="20"/>
+                <w:szCs w:val="20"/>
+              </w:rPr>
+              <w:t xml:space="preserve">Scaling changes a column's units, never what it knows; the leak is the timing.</w:t>
             </w:r>
           </w:p>
           <w:p>
@@ -12539,7 +12620,7 @@
                 <w:sz w:val="21"/>
                 <w:szCs w:val="21"/>
               </w:rPr>
-              <w:t xml:space="preserve">Leakage is a column from the future, so I ask of every column when it would exist on the morning the list is built.</w:t>
+              <w:t xml:space="preserve">A score that jumps on one column is a question about that column's timing, so I ask when it exists and drop it if it is after the prediction moment.</w:t>
             </w:r>
           </w:p>
           <w:p>
@@ -12626,7 +12707,7 @@
                 <w:sz w:val="21"/>
                 <w:szCs w:val="21"/>
               </w:rPr>
-              <w:t xml:space="preserve">   Key C</w:t>
+              <w:t xml:space="preserve">   Key B, C, D</w:t>
             </w:r>
             <w:r>
               <w:rPr>
@@ -12635,7 +12716,7 @@
                 <w:sz w:val="18"/>
                 <w:szCs w:val="18"/>
               </w:rPr>
-              <w:t xml:space="preserve">   One correct option, Hard, [S], Wed</w:t>
+              <w:t xml:space="preserve">   More than one correct, Hard, [S], Wed</w:t>
             </w:r>
           </w:p>
           <w:p>
@@ -12661,7 +12742,7 @@
                 <w:sz w:val="21"/>
                 <w:szCs w:val="21"/>
               </w:rPr>
-              <w:t xml:space="preserve">On the morning the list is built no call has happened, so its duration does not exist; a model that uses it learns from the answer. The dataset's own notes say so and ask for it to be discarded for a realistic model. The honest score is the one without it, 0.795. A jump this large from one column is the alarm, and the prediction-time question is the check. Wednesday read the notes aloud; Kalpa's settlement_status was the same leak.</w:t>
+              <w:t xml:space="preserve">A column passes when its value exists at the prediction moment. Age, job and housing, the previous campaign's result and the rate published that morning all exist before any call. The previous result is strongly predictive, 65 percent yes among past successes, and still legitimate, because it was recorded before this campaign began, so it passes the timing test however strong it is. Duration exists only after this campaign's call. Wednesday's chapter interrogated every column with this one question.</w:t>
             </w:r>
           </w:p>
           <w:p>
@@ -12688,14 +12769,13 @@
                 <w:sz w:val="20"/>
                 <w:szCs w:val="20"/>
               </w:rPr>
-              <w:t xml:space="preserve">The authors include it for benchmarks and say to discard it for a realistic model, which is what a call list is.</w:t>
+              <w:t xml:space="preserve">This campaign's last call has not happened on the morning the list is built, so its length is from the future.</w:t>
             </w:r>
           </w:p>
           <w:p>
             <w:pPr>
               <w:keepNext/>
-              <w:spacing w:after="40" w:line="264"/>
-              <w:ind w:left="360" w:hanging="360"/>
+              <w:spacing w:after="40" w:before="60" w:line="276"/>
             </w:pPr>
             <w:r>
               <w:rPr>
@@ -12703,59 +12783,6 @@
                 <w:b/>
                 <w:bCs/>
                 <w:color w:val="1C1B16"/>
-                <w:sz w:val="20"/>
-                <w:szCs w:val="20"/>
-              </w:rPr>
-              <w:t xml:space="preserve">B.  </w:t>
-            </w:r>
-            <w:r>
-              <w:rPr>
-                <w:rFonts w:ascii="Arial" w:cs="Arial" w:eastAsia="Arial" w:hAnsi="Arial"/>
-                <w:color w:val="1C1B16"/>
-                <w:sz w:val="20"/>
-                <w:szCs w:val="20"/>
-              </w:rPr>
-              <w:t xml:space="preserve">Accuracy barely moves on an 89 percent no outcome even when the leak is large; the recall nearly doubles, 174 to 390 buyers found, and that is the leak showing.</w:t>
-            </w:r>
-          </w:p>
-          <w:p>
-            <w:pPr>
-              <w:keepNext/>
-              <w:spacing w:after="40" w:line="264"/>
-              <w:ind w:left="360" w:hanging="360"/>
-            </w:pPr>
-            <w:r>
-              <w:rPr>
-                <w:rFonts w:ascii="Arial" w:cs="Arial" w:eastAsia="Arial" w:hAnsi="Arial"/>
-                <w:b/>
-                <w:bCs/>
-                <w:color w:val="1C1B16"/>
-                <w:sz w:val="20"/>
-                <w:szCs w:val="20"/>
-              </w:rPr>
-              <w:t xml:space="preserve">D.  </w:t>
-            </w:r>
-            <w:r>
-              <w:rPr>
-                <w:rFonts w:ascii="Arial" w:cs="Arial" w:eastAsia="Arial" w:hAnsi="Arial"/>
-                <w:color w:val="1C1B16"/>
-                <w:sz w:val="20"/>
-                <w:szCs w:val="20"/>
-              </w:rPr>
-              <w:t xml:space="preserve">Scaling changes a column's units, never what it knows; the leak is the timing.</w:t>
-            </w:r>
-          </w:p>
-          <w:p>
-            <w:pPr>
-              <w:keepNext/>
-              <w:spacing w:after="40" w:before="60" w:line="276"/>
-            </w:pPr>
-            <w:r>
-              <w:rPr>
-                <w:rFonts w:ascii="Arial" w:cs="Arial" w:eastAsia="Arial" w:hAnsi="Arial"/>
-                <w:b/>
-                <w:bCs/>
-                <w:color w:val="1C1B16"/>
                 <w:sz w:val="21"/>
                 <w:szCs w:val="21"/>
               </w:rPr>
@@ -12768,7 +12795,7 @@
                 <w:sz w:val="21"/>
                 <w:szCs w:val="21"/>
               </w:rPr>
-              <w:t xml:space="preserve">A score that jumps on one column is a question about that column's timing, so I ask when it exists and drop it if it is after the prediction moment.</w:t>
+              <w:t xml:space="preserve">I test a column by when it exists: a strong column from the past is a feature, and a weak one from the future is a leak.</w:t>
             </w:r>
           </w:p>
           <w:p>
@@ -12855,7 +12882,7 @@
                 <w:sz w:val="21"/>
                 <w:szCs w:val="21"/>
               </w:rPr>
-              <w:t xml:space="preserve">   Key B, C, D</w:t>
+              <w:t xml:space="preserve">   Key A</w:t>
             </w:r>
             <w:r>
               <w:rPr>
@@ -12864,7 +12891,7 @@
                 <w:sz w:val="18"/>
                 <w:szCs w:val="18"/>
               </w:rPr>
-              <w:t xml:space="preserve">   More than one correct, Hard, [S], Wed</w:t>
+              <w:t xml:space="preserve">   True or false, Medium, [F], Wed</w:t>
             </w:r>
           </w:p>
           <w:p>
@@ -12890,7 +12917,7 @@
                 <w:sz w:val="21"/>
                 <w:szCs w:val="21"/>
               </w:rPr>
-              <w:t xml:space="preserve">A column passes when its value exists at the prediction moment. Age, job and housing, the previous campaign's result and the rate published that morning all exist before any call. The previous result is strongly predictive, 65 percent yes among past successes, and still legitimate, because it was recorded before this campaign began; predictive power is not the test, timing is. Duration exists only after this campaign's call. Wednesday's chapter interrogated every column with this one question.</w:t>
+              <w:t xml:space="preserve">Importance says how much the model leans on a column to predict, never what causes the outcome. Here the arrow plausibly runs backwards: a client who has decided to buy stays on to open the deposit, so a yes makes a call long. Coaching agents to keep people talking would lengthen calls without creating buyers. Testing it would need an experiment, such as a random half of agents coached. Wednesday's last chapter was what the importance chart cannot tell you.</w:t>
             </w:r>
           </w:p>
           <w:p>
@@ -12908,7 +12935,7 @@
                 <w:sz w:val="20"/>
                 <w:szCs w:val="20"/>
               </w:rPr>
-              <w:t xml:space="preserve">A.  </w:t>
+              <w:t xml:space="preserve">B.  </w:t>
             </w:r>
             <w:r>
               <w:rPr>
@@ -12917,7 +12944,61 @@
                 <w:sz w:val="20"/>
                 <w:szCs w:val="20"/>
               </w:rPr>
-              <w:t xml:space="preserve">This campaign's last call has not happened on the morning the list is built, so its length is from the future.</w:t>
+              <w:t xml:space="preserve">Importance charts are drawn for linear and tree models alike; the limit is causal, not the model family.</w:t>
+            </w:r>
+          </w:p>
+          <w:p>
+            <w:pPr>
+              <w:keepNext/>
+              <w:spacing w:after="40" w:line="264"/>
+              <w:ind w:left="360" w:hanging="360"/>
+            </w:pPr>
+            <w:r>
+              <w:rPr>
+                <w:rFonts w:ascii="Arial" w:cs="Arial" w:eastAsia="Arial" w:hAnsi="Arial"/>
+                <w:b/>
+                <w:bCs/>
+                <w:color w:val="1C1B16"/>
+                <w:sz w:val="20"/>
+                <w:szCs w:val="20"/>
+              </w:rPr>
+              <w:t xml:space="preserve">C.  </w:t>
+            </w:r>
+            <w:r>
+              <w:rPr>
+                <w:rFonts w:ascii="Arial" w:cs="Arial" w:eastAsia="Arial" w:hAnsi="Arial"/>
+                <w:color w:val="1C1B16"/>
+                <w:sz w:val="20"/>
+                <w:szCs w:val="20"/>
+              </w:rPr>
+              <w:t xml:space="preserve">A large weight says the model leans on the column to predict; a column can predict because the outcome causes it.</w:t>
+            </w:r>
+          </w:p>
+          <w:p>
+            <w:pPr>
+              <w:keepNext/>
+              <w:spacing w:after="40" w:line="264"/>
+              <w:ind w:left="360" w:hanging="360"/>
+            </w:pPr>
+            <w:r>
+              <w:rPr>
+                <w:rFonts w:ascii="Arial" w:cs="Arial" w:eastAsia="Arial" w:hAnsi="Arial"/>
+                <w:b/>
+                <w:bCs/>
+                <w:color w:val="1C1B16"/>
+                <w:sz w:val="20"/>
+                <w:szCs w:val="20"/>
+              </w:rPr>
+              <w:t xml:space="preserve">D.  </w:t>
+            </w:r>
+            <w:r>
+              <w:rPr>
+                <w:rFonts w:ascii="Arial" w:cs="Arial" w:eastAsia="Arial" w:hAnsi="Arial"/>
+                <w:color w:val="1C1B16"/>
+                <w:sz w:val="20"/>
+                <w:szCs w:val="20"/>
+              </w:rPr>
+              <w:t xml:space="preserve">A gap that is not chance can still run from the outcome to the column, so size proves the link, never its direction.</w:t>
             </w:r>
           </w:p>
           <w:p>
@@ -12943,7 +13024,7 @@
                 <w:sz w:val="21"/>
                 <w:szCs w:val="21"/>
               </w:rPr>
-              <w:t xml:space="preserve">I test a column by when it exists, never by how well it predicts; a strong column from the past is a feature, a weak one from the future is a leak.</w:t>
+              <w:t xml:space="preserve">Importance is about prediction, so before I claim a cause I ask which way the arrow runs and what experiment would test it.</w:t>
             </w:r>
           </w:p>
           <w:p>
@@ -12958,7 +13039,7 @@
                 <w:sz w:val="18"/>
                 <w:szCs w:val="18"/>
               </w:rPr>
-              <w:t xml:space="preserve">Anchor: What is data leakage, and how do you catch it before it ships?</w:t>
+              <w:t xml:space="preserve">Anchor: What does a feature importance chart prove, and what does it not?</w:t>
             </w:r>
           </w:p>
         </w:tc>
@@ -13030,7 +13111,7 @@
                 <w:sz w:val="21"/>
                 <w:szCs w:val="21"/>
               </w:rPr>
-              <w:t xml:space="preserve">   Key A</w:t>
+              <w:t xml:space="preserve">   Key D</w:t>
             </w:r>
             <w:r>
               <w:rPr>
@@ -13039,7 +13120,7 @@
                 <w:sz w:val="18"/>
                 <w:szCs w:val="18"/>
               </w:rPr>
-              <w:t xml:space="preserve">   True or false, Hard, [F], Wed</w:t>
+              <w:t xml:space="preserve">   One correct option, Hard, [F], Wed</w:t>
             </w:r>
           </w:p>
           <w:p>
@@ -13065,7 +13146,7 @@
                 <w:sz w:val="21"/>
                 <w:szCs w:val="21"/>
               </w:rPr>
-              <w:t xml:space="preserve">Importance says how much the model leans on a column to predict, never what causes the outcome. Here the arrow plausibly runs backwards: a client who has decided to buy stays on to open the deposit, so a yes makes a call long. Coaching agents to keep people talking would lengthen calls without creating buyers. Testing it would need an experiment, such as a random half of agents coached. Wednesday's last chapter was what the importance chart cannot tell you.</w:t>
+              <w:t xml:space="preserve">The five economic indicators rise and fall together across the period, so once they sit in one model, the weight on any one of them is what it adds after the others, and its sign can reverse. The prediction can be just as good while no single coefficient reads as an effect. So the memo answers the marketing head with the group: alone, higher rates go with fewer yeses, and the five indicators carry that one economic signal together, so no single coefficient is quoted as the effect of rates. Reading the group, keeping one representative or regularising are the fixes. Wednesday's case showed euribor3m flip with the economic trio.</w:t>
             </w:r>
           </w:p>
           <w:p>
@@ -13083,7 +13164,7 @@
                 <w:sz w:val="20"/>
                 <w:szCs w:val="20"/>
               </w:rPr>
-              <w:t xml:space="preserve">B.  </w:t>
+              <w:t xml:space="preserve">A.  </w:t>
             </w:r>
             <w:r>
               <w:rPr>
@@ -13092,7 +13173,7 @@
                 <w:sz w:val="20"/>
                 <w:szCs w:val="20"/>
               </w:rPr>
-              <w:t xml:space="preserve">Importance charts are drawn for linear and tree models alike; the limit is causal, not the model family.</w:t>
+              <w:t xml:space="preserve">The flip appears with every solver, because it comes from the data; refitting moves nothing.</w:t>
             </w:r>
           </w:p>
           <w:p>
@@ -13110,7 +13191,7 @@
                 <w:sz w:val="20"/>
                 <w:szCs w:val="20"/>
               </w:rPr>
-              <w:t xml:space="preserve">C.  </w:t>
+              <w:t xml:space="preserve">B.  </w:t>
             </w:r>
             <w:r>
               <w:rPr>
@@ -13119,7 +13200,7 @@
                 <w:sz w:val="20"/>
                 <w:szCs w:val="20"/>
               </w:rPr>
-              <w:t xml:space="preserve">A large weight says the model leans on the column to predict; a column can predict because the outcome causes it.</w:t>
+              <w:t xml:space="preserve">+0.39 is the rate's weight once the other four indicators are held fixed, which says nothing about this year's campaign on its own.</w:t>
             </w:r>
           </w:p>
           <w:p>
@@ -13137,7 +13218,7 @@
                 <w:sz w:val="20"/>
                 <w:szCs w:val="20"/>
               </w:rPr>
-              <w:t xml:space="preserve">D.  </w:t>
+              <w:t xml:space="preserve">C.  </w:t>
             </w:r>
             <w:r>
               <w:rPr>
@@ -13146,7 +13227,7 @@
                 <w:sz w:val="20"/>
                 <w:szCs w:val="20"/>
               </w:rPr>
-              <w:t xml:space="preserve">A gap that is not chance can still run from the outcome to the column, so size proves the link, never its direction.</w:t>
+              <w:t xml:space="preserve">Imbalance moves the intercept and the calibration and never flips one column's sign as others join; the -0.92 alone carries the other four indicators' signal inside it.</w:t>
             </w:r>
           </w:p>
           <w:p>
@@ -13172,7 +13253,7 @@
                 <w:sz w:val="21"/>
                 <w:szCs w:val="21"/>
               </w:rPr>
-              <w:t xml:space="preserve">Importance is about prediction, so before I claim a cause I ask which way the arrow runs and what experiment would test it.</w:t>
+              <w:t xml:space="preserve">When a sign flips as a column joins, I check the correlations first and read correlated columns as a group.</w:t>
             </w:r>
           </w:p>
           <w:p>
@@ -13259,7 +13340,7 @@
                 <w:sz w:val="21"/>
                 <w:szCs w:val="21"/>
               </w:rPr>
-              <w:t xml:space="preserve">   Key D</w:t>
+              <w:t xml:space="preserve">   Key C (leakage)</w:t>
             </w:r>
             <w:r>
               <w:rPr>
@@ -13268,7 +13349,7 @@
                 <w:sz w:val="18"/>
                 <w:szCs w:val="18"/>
               </w:rPr>
-              <w:t xml:space="preserve">   One correct option, Hard, [F], Wed</w:t>
+              <w:t xml:space="preserve">   Fill in the blank, Easy, [S], Wed</w:t>
             </w:r>
           </w:p>
           <w:p>
@@ -13294,14 +13375,13 @@
                 <w:sz w:val="21"/>
                 <w:szCs w:val="21"/>
               </w:rPr>
-              <w:t xml:space="preserve">The five economic indicators rise and fall together across the period, so once they sit in one model, the weight on any one of them is what it adds after the others, and its sign can reverse. The prediction can be just as good while no single coefficient reads as an effect. The fix is to read the group together, keep one representative, or regularise, and never to narrate one coefficient as a cause. Wednesday's case showed euribor3m flip with the economic trio.</w:t>
+              <w:t xml:space="preserve">A column the model could not have at the moment of prediction leaks the answer into training, which is data leakage; duration is the week's example, known only once the call ends. Drift is the world changing after training, and collinearity is columns moving together, Wednesday's sign flip.</w:t>
             </w:r>
           </w:p>
           <w:p>
             <w:pPr>
               <w:keepNext/>
-              <w:spacing w:after="40" w:line="264"/>
-              <w:ind w:left="360" w:hanging="360"/>
+              <w:spacing w:after="40" w:before="60" w:line="276"/>
             </w:pPr>
             <w:r>
               <w:rPr>
@@ -13309,86 +13389,6 @@
                 <w:b/>
                 <w:bCs/>
                 <w:color w:val="1C1B16"/>
-                <w:sz w:val="20"/>
-                <w:szCs w:val="20"/>
-              </w:rPr>
-              <w:t xml:space="preserve">A.  </w:t>
-            </w:r>
-            <w:r>
-              <w:rPr>
-                <w:rFonts w:ascii="Arial" w:cs="Arial" w:eastAsia="Arial" w:hAnsi="Arial"/>
-                <w:color w:val="1C1B16"/>
-                <w:sz w:val="20"/>
-                <w:szCs w:val="20"/>
-              </w:rPr>
-              <w:t xml:space="preserve">The flip appears in every solver and every library, because it comes from the data, not the code.</w:t>
-            </w:r>
-          </w:p>
-          <w:p>
-            <w:pPr>
-              <w:keepNext/>
-              <w:spacing w:after="40" w:line="264"/>
-              <w:ind w:left="360" w:hanging="360"/>
-            </w:pPr>
-            <w:r>
-              <w:rPr>
-                <w:rFonts w:ascii="Arial" w:cs="Arial" w:eastAsia="Arial" w:hAnsi="Arial"/>
-                <w:b/>
-                <w:bCs/>
-                <w:color w:val="1C1B16"/>
-                <w:sz w:val="20"/>
-                <w:szCs w:val="20"/>
-              </w:rPr>
-              <w:t xml:space="preserve">B.  </w:t>
-            </w:r>
-            <w:r>
-              <w:rPr>
-                <w:rFonts w:ascii="Arial" w:cs="Arial" w:eastAsia="Arial" w:hAnsi="Arial"/>
-                <w:color w:val="1C1B16"/>
-                <w:sz w:val="20"/>
-                <w:szCs w:val="20"/>
-              </w:rPr>
-              <w:t xml:space="preserve">24,712 rows is plenty for five coefficients; the trouble is that the columns carry the same information.</w:t>
-            </w:r>
-          </w:p>
-          <w:p>
-            <w:pPr>
-              <w:keepNext/>
-              <w:spacing w:after="40" w:line="264"/>
-              <w:ind w:left="360" w:hanging="360"/>
-            </w:pPr>
-            <w:r>
-              <w:rPr>
-                <w:rFonts w:ascii="Arial" w:cs="Arial" w:eastAsia="Arial" w:hAnsi="Arial"/>
-                <w:b/>
-                <w:bCs/>
-                <w:color w:val="1C1B16"/>
-                <w:sz w:val="20"/>
-                <w:szCs w:val="20"/>
-              </w:rPr>
-              <w:t xml:space="preserve">C.  </w:t>
-            </w:r>
-            <w:r>
-              <w:rPr>
-                <w:rFonts w:ascii="Arial" w:cs="Arial" w:eastAsia="Arial" w:hAnsi="Arial"/>
-                <w:color w:val="1C1B16"/>
-                <w:sz w:val="20"/>
-                <w:szCs w:val="20"/>
-              </w:rPr>
-              <w:t xml:space="preserve">Imbalance shifts the intercept and the calibration, and it does not flip one column's sign when another column joins.</w:t>
-            </w:r>
-          </w:p>
-          <w:p>
-            <w:pPr>
-              <w:keepNext/>
-              <w:spacing w:after="40" w:before="60" w:line="276"/>
-            </w:pPr>
-            <w:r>
-              <w:rPr>
-                <w:rFonts w:ascii="Arial" w:cs="Arial" w:eastAsia="Arial" w:hAnsi="Arial"/>
-                <w:b/>
-                <w:bCs/>
-                <w:color w:val="1C1B16"/>
                 <w:sz w:val="21"/>
                 <w:szCs w:val="21"/>
               </w:rPr>
@@ -13401,7 +13401,7 @@
                 <w:sz w:val="21"/>
                 <w:szCs w:val="21"/>
               </w:rPr>
-              <w:t xml:space="preserve">When a sign flips as a column joins, I check the correlations first and read correlated columns as a group.</w:t>
+              <w:t xml:space="preserve">Leakage is a column from the future, so I ask of every column when it would exist on the morning the list is built.</w:t>
             </w:r>
           </w:p>
           <w:p>
@@ -13416,7 +13416,7 @@
                 <w:sz w:val="18"/>
                 <w:szCs w:val="18"/>
               </w:rPr>
-              <w:t xml:space="preserve">Anchor: What does a feature importance chart prove, and what does it not?</w:t>
+              <w:t xml:space="preserve">Anchor: What is data leakage, and how do you catch it before it ships?</w:t>
             </w:r>
           </w:p>
         </w:tc>
@@ -13488,7 +13488,7 @@
                 <w:sz w:val="21"/>
                 <w:szCs w:val="21"/>
               </w:rPr>
-              <w:t xml:space="preserve">   Key A (overfitting)</w:t>
+              <w:t xml:space="preserve">   Key A</w:t>
             </w:r>
             <w:r>
               <w:rPr>
@@ -13497,7 +13497,7 @@
                 <w:sz w:val="18"/>
                 <w:szCs w:val="18"/>
               </w:rPr>
-              <w:t xml:space="preserve">   Fill in the blank, Easy, [S], Thu</w:t>
+              <w:t xml:space="preserve">   One correct option, Hard, [S], Thu</w:t>
             </w:r>
           </w:p>
           <w:p>
@@ -13523,7 +13523,88 @@
                 <w:sz w:val="21"/>
                 <w:szCs w:val="21"/>
               </w:rPr>
-              <w:t xml:space="preserve">Perfect on training and far lower on validation is a model that memorised its training rows, which is overfitting; the room's unlimited tree scored 0.996 against 0.837. Underfitting scores low on both.</w:t>
+              <w:t xml:space="preserve">Training near 1.0 with validation below the do-nothing baseline is memorising: grown without a limit, the tree carves leaves so small they fit individual clients. The fix is a brake chosen on data the tree did not fit: validation accuracy is flat near 0.90 from depth 3 to 8, and validation AUC peaks at depth 5, 0.783, so depth 5 is the cap to confirm by cross-validation. Thursday drew the unlimited tree as one leaf per customer.</w:t>
+            </w:r>
+          </w:p>
+          <w:p>
+            <w:pPr>
+              <w:keepNext/>
+              <w:spacing w:after="40" w:line="264"/>
+              <w:ind w:left="360" w:hanging="360"/>
+            </w:pPr>
+            <w:r>
+              <w:rPr>
+                <w:rFonts w:ascii="Arial" w:cs="Arial" w:eastAsia="Arial" w:hAnsi="Arial"/>
+                <w:b/>
+                <w:bCs/>
+                <w:color w:val="1C1B16"/>
+                <w:sz w:val="20"/>
+                <w:szCs w:val="20"/>
+              </w:rPr>
+              <w:t xml:space="preserve">B.  </w:t>
+            </w:r>
+            <w:r>
+              <w:rPr>
+                <w:rFonts w:ascii="Arial" w:cs="Arial" w:eastAsia="Arial" w:hAnsi="Arial"/>
+                <w:color w:val="1C1B16"/>
+                <w:sz w:val="20"/>
+                <w:szCs w:val="20"/>
+              </w:rPr>
+              <w:t xml:space="preserve">The call log is duration, Wednesday's leak, and more columns give a tree more to memorise.</w:t>
+            </w:r>
+          </w:p>
+          <w:p>
+            <w:pPr>
+              <w:keepNext/>
+              <w:spacing w:after="40" w:line="264"/>
+              <w:ind w:left="360" w:hanging="360"/>
+            </w:pPr>
+            <w:r>
+              <w:rPr>
+                <w:rFonts w:ascii="Arial" w:cs="Arial" w:eastAsia="Arial" w:hAnsi="Arial"/>
+                <w:b/>
+                <w:bCs/>
+                <w:color w:val="1C1B16"/>
+                <w:sz w:val="20"/>
+                <w:szCs w:val="20"/>
+              </w:rPr>
+              <w:t xml:space="preserve">C.  </w:t>
+            </w:r>
+            <w:r>
+              <w:rPr>
+                <w:rFonts w:ascii="Arial" w:cs="Arial" w:eastAsia="Arial" w:hAnsi="Arial"/>
+                <w:color w:val="1C1B16"/>
+                <w:sz w:val="20"/>
+                <w:szCs w:val="20"/>
+              </w:rPr>
+              <w:t xml:space="preserve">An unlimited tree is fully grown already; growing it further is impossible, and it is the growth that overfits.</w:t>
+            </w:r>
+          </w:p>
+          <w:p>
+            <w:pPr>
+              <w:keepNext/>
+              <w:spacing w:after="40" w:line="264"/>
+              <w:ind w:left="360" w:hanging="360"/>
+            </w:pPr>
+            <w:r>
+              <w:rPr>
+                <w:rFonts w:ascii="Arial" w:cs="Arial" w:eastAsia="Arial" w:hAnsi="Arial"/>
+                <w:b/>
+                <w:bCs/>
+                <w:color w:val="1C1B16"/>
+                <w:sz w:val="20"/>
+                <w:szCs w:val="20"/>
+              </w:rPr>
+              <w:t xml:space="preserve">D.  </w:t>
+            </w:r>
+            <w:r>
+              <w:rPr>
+                <w:rFonts w:ascii="Arial" w:cs="Arial" w:eastAsia="Arial" w:hAnsi="Arial"/>
+                <w:color w:val="1C1B16"/>
+                <w:sz w:val="20"/>
+                <w:szCs w:val="20"/>
+              </w:rPr>
+              <w:t xml:space="preserve">A fit on validation spends validation, and the gap is the tree's, as the depth-capped trees on the same rows show.</w:t>
             </w:r>
           </w:p>
           <w:p>
@@ -13549,7 +13630,7 @@
                 <w:sz w:val="21"/>
                 <w:szCs w:val="21"/>
               </w:rPr>
-              <w:t xml:space="preserve">A big gap between training and validation is memorising, so I add a brake and choose its strength on validation or by cross-validation.</w:t>
+              <w:t xml:space="preserve">High training with low validation is memorising, so I add a brake and choose its strength on validation, then confirm it by cross-validation.</w:t>
             </w:r>
           </w:p>
           <w:p>
@@ -13636,7 +13717,7 @@
                 <w:sz w:val="21"/>
                 <w:szCs w:val="21"/>
               </w:rPr>
-              <w:t xml:space="preserve">   Key D (split)</w:t>
+              <w:t xml:space="preserve">   Key A, B, D</w:t>
             </w:r>
             <w:r>
               <w:rPr>
@@ -13645,7 +13726,7 @@
                 <w:sz w:val="18"/>
                 <w:szCs w:val="18"/>
               </w:rPr>
-              <w:t xml:space="preserve">   Fill in the blank, Medium, [F], Thu</w:t>
+              <w:t xml:space="preserve">   More than one correct, Medium, [F], Thu</w:t>
             </w:r>
           </w:p>
           <w:p>
@@ -13671,7 +13752,34 @@
                 <w:sz w:val="21"/>
                 <w:szCs w:val="21"/>
               </w:rPr>
-              <w:t xml:space="preserve">One split can be lucky or unlucky in which clients land in validation; cross-validation gives every row a turn in validation and averages the scores, so the luck of one split averages away. The week's five folds ran from 0.769 to 0.798.</w:t>
+              <w:t xml:space="preserve">A depth cap and a minimum leaf size limit how finely a tree can carve the rows; a stronger penalty, which in scikit-learn's logistic regression is a smaller C, shrinks the weights and loosens the fit to the training rows; and cross-validation chooses either brake's strength on rows the model did not fit. Refitting until training scores 1.0 is the overfitting itself. Thursday's chapter put the brakes on the model.</w:t>
+            </w:r>
+          </w:p>
+          <w:p>
+            <w:pPr>
+              <w:keepNext/>
+              <w:spacing w:after="40" w:line="264"/>
+              <w:ind w:left="360" w:hanging="360"/>
+            </w:pPr>
+            <w:r>
+              <w:rPr>
+                <w:rFonts w:ascii="Arial" w:cs="Arial" w:eastAsia="Arial" w:hAnsi="Arial"/>
+                <w:b/>
+                <w:bCs/>
+                <w:color w:val="1C1B16"/>
+                <w:sz w:val="20"/>
+                <w:szCs w:val="20"/>
+              </w:rPr>
+              <w:t xml:space="preserve">C.  </w:t>
+            </w:r>
+            <w:r>
+              <w:rPr>
+                <w:rFonts w:ascii="Arial" w:cs="Arial" w:eastAsia="Arial" w:hAnsi="Arial"/>
+                <w:color w:val="1C1B16"/>
+                <w:sz w:val="20"/>
+                <w:szCs w:val="20"/>
+              </w:rPr>
+              <w:t xml:space="preserve">Training at 1.0 is the symptom on Exhibit 4A, the unlimited tree's 0.996, never a brake.</w:t>
             </w:r>
           </w:p>
           <w:p>
@@ -13697,7 +13805,7 @@
                 <w:sz w:val="21"/>
                 <w:szCs w:val="21"/>
               </w:rPr>
-              <w:t xml:space="preserve">One split is one draw; five folds are five draws, so I quote the mean and the spread.</w:t>
+              <w:t xml:space="preserve">Brakes limit what the model can memorise, and cross-validation chooses how hard to press them.</w:t>
             </w:r>
           </w:p>
           <w:p>
@@ -13712,7 +13820,7 @@
                 <w:sz w:val="18"/>
                 <w:szCs w:val="18"/>
               </w:rPr>
-              <w:t xml:space="preserve">Anchor: Why cross-validation instead of one split?</w:t>
+              <w:t xml:space="preserve">Anchor: Overfitting: what it is, how you detect it, how you fix it.</w:t>
             </w:r>
           </w:p>
         </w:tc>
@@ -13784,7 +13892,7 @@
                 <w:sz w:val="21"/>
                 <w:szCs w:val="21"/>
               </w:rPr>
-              <w:t xml:space="preserve">   Key A</w:t>
+              <w:t xml:space="preserve">   Key B</w:t>
             </w:r>
             <w:r>
               <w:rPr>
@@ -13793,7 +13901,7 @@
                 <w:sz w:val="18"/>
                 <w:szCs w:val="18"/>
               </w:rPr>
-              <w:t xml:space="preserve">   One correct option, Hard, [S], Thu</w:t>
+              <w:t xml:space="preserve">   One correct option, Hard, [F], Thu</w:t>
             </w:r>
           </w:p>
           <w:p>
@@ -13819,7 +13927,7 @@
                 <w:sz w:val="21"/>
                 <w:szCs w:val="21"/>
               </w:rPr>
-              <w:t xml:space="preserve">Training near 1.0 with validation below the do-nothing baseline is memorising: grown without a limit, the tree carves leaves so small they fit individual clients. The fix is a brake chosen on data the tree did not fit: validation accuracy is flat near 0.90 from depth 3 to 8, and validation AUC peaks at depth 5, 0.783, so depth 5 is the cap to confirm by cross-validation. Thursday drew the unlimited tree as one leaf per customer.</w:t>
+              <w:t xml:space="preserve">Five-fold cross-validation fits five models, each on four of the five folds, about 19,770 of the 24,712 training clients, and scores each on the fifth, about 4,942. The five scores ran from 0.769 to 0.798, so a single split could have reported anything in that band; the mean, 0.786, with its spread is the honest estimate, and the spread is the size of the luck one split carries. Thursday's chapter set five exams instead of one.</w:t>
             </w:r>
           </w:p>
           <w:p>
@@ -13837,7 +13945,7 @@
                 <w:sz w:val="20"/>
                 <w:szCs w:val="20"/>
               </w:rPr>
-              <w:t xml:space="preserve">B.  </w:t>
+              <w:t xml:space="preserve">A.  </w:t>
             </w:r>
             <w:r>
               <w:rPr>
@@ -13846,7 +13954,7 @@
                 <w:sz w:val="20"/>
                 <w:szCs w:val="20"/>
               </w:rPr>
-              <w:t xml:space="preserve">The call log is duration, Wednesday's leak, and more columns give a tree more to memorise.</w:t>
+              <w:t xml:space="preserve">Each fold trains its own model on the other four folds; one model scored five times would have seen the rows it is scored on.</w:t>
             </w:r>
           </w:p>
           <w:p>
@@ -13873,7 +13981,7 @@
                 <w:sz w:val="20"/>
                 <w:szCs w:val="20"/>
               </w:rPr>
-              <w:t xml:space="preserve">An unlimited tree is fully grown already; growing it further is impossible, and it is the growth that overfits.</w:t>
+              <w:t xml:space="preserve">4,942 is each fold's validation share; each model trains on the other four-fifths.</w:t>
             </w:r>
           </w:p>
           <w:p>
@@ -13900,7 +14008,7 @@
                 <w:sz w:val="20"/>
                 <w:szCs w:val="20"/>
               </w:rPr>
-              <w:t xml:space="preserve">A fit on validation spends validation, and the gap is the tree's, as the depth-capped trees on the same rows show.</w:t>
+              <w:t xml:space="preserve">A model fitted on all the rows is scored on rows it saw, and the spread is exactly what one split's luck looks like.</w:t>
             </w:r>
           </w:p>
           <w:p>
@@ -13926,7 +14034,7 @@
                 <w:sz w:val="21"/>
                 <w:szCs w:val="21"/>
               </w:rPr>
-              <w:t xml:space="preserve">High training with low validation is memorising, so I add a brake and choose its strength on validation, then confirm it by cross-validation.</w:t>
+              <w:t xml:space="preserve">k folds fit k models on (k minus 1) over k of the rows; I report the mean and the spread, and a gap smaller than the spread is a tie.</w:t>
             </w:r>
           </w:p>
           <w:p>
@@ -13941,7 +14049,7 @@
                 <w:sz w:val="18"/>
                 <w:szCs w:val="18"/>
               </w:rPr>
-              <w:t xml:space="preserve">Anchor: Overfitting: what it is, how you detect it, how you fix it.</w:t>
+              <w:t xml:space="preserve">Anchor: Why cross-validation instead of one split?</w:t>
             </w:r>
           </w:p>
         </w:tc>
@@ -14013,7 +14121,7 @@
                 <w:sz w:val="21"/>
                 <w:szCs w:val="21"/>
               </w:rPr>
-              <w:t xml:space="preserve">   Key A, B, D</w:t>
+              <w:t xml:space="preserve">   Key C</w:t>
             </w:r>
             <w:r>
               <w:rPr>
@@ -14022,7 +14130,7 @@
                 <w:sz w:val="18"/>
                 <w:szCs w:val="18"/>
               </w:rPr>
-              <w:t xml:space="preserve">   More than one correct, Medium, [F], Thu</w:t>
+              <w:t xml:space="preserve">   True or false, Hard, [D], Thu</w:t>
             </w:r>
           </w:p>
           <w:p>
@@ -14048,7 +14156,7 @@
                 <w:sz w:val="21"/>
                 <w:szCs w:val="21"/>
               </w:rPr>
-              <w:t xml:space="preserve">A depth cap and a minimum leaf size limit how finely a tree can carve the rows; a stronger penalty, which in scikit-learn's logistic regression is a smaller C, shrinks the weights and loosens the fit to the training rows; and cross-validation chooses either brake's strength on rows the model did not fit. Refitting until training scores 1.0 is the overfitting itself. Thursday's chapter put the brakes on the model.</w:t>
+              <w:t xml:space="preserve">The three families sit within 0.011 AUC of each other, while the five folds of one model moved by about 0.03, so the ranking is inside the noise. On a tie the simpler model is the better recommendation: it is explained to a committee in one line per weight, monitored easily, and moved to lending with less to re-check. The flip is a gap that clears the folds' spread and is worth more in rupees, at the same budget of calls, than the cost of explaining and running the complex model. Thursday closed on why the boring model often ships.</w:t>
             </w:r>
           </w:p>
           <w:p>
@@ -14066,7 +14174,7 @@
                 <w:sz w:val="20"/>
                 <w:szCs w:val="20"/>
               </w:rPr>
-              <w:t xml:space="preserve">C.  </w:t>
+              <w:t xml:space="preserve">A.  </w:t>
             </w:r>
             <w:r>
               <w:rPr>
@@ -14075,7 +14183,61 @@
                 <w:sz w:val="20"/>
                 <w:szCs w:val="20"/>
               </w:rPr>
-              <w:t xml:space="preserve">Training at 1.0 is the symptom on Exhibit 4A, the unlimited tree's 0.996, never a brake.</w:t>
+              <w:t xml:space="preserve">The best number found on one validation slice carries that slice's luck, which Exhibit 4B sizes at about 0.03.</w:t>
+            </w:r>
+          </w:p>
+          <w:p>
+            <w:pPr>
+              <w:keepNext/>
+              <w:spacing w:after="40" w:line="264"/>
+              <w:ind w:left="360" w:hanging="360"/>
+            </w:pPr>
+            <w:r>
+              <w:rPr>
+                <w:rFonts w:ascii="Arial" w:cs="Arial" w:eastAsia="Arial" w:hAnsi="Arial"/>
+                <w:b/>
+                <w:bCs/>
+                <w:color w:val="1C1B16"/>
+                <w:sz w:val="20"/>
+                <w:szCs w:val="20"/>
+              </w:rPr>
+              <w:t xml:space="preserve">B.  </w:t>
+            </w:r>
+            <w:r>
+              <w:rPr>
+                <w:rFonts w:ascii="Arial" w:cs="Arial" w:eastAsia="Arial" w:hAnsi="Arial"/>
+                <w:color w:val="1C1B16"/>
+                <w:sz w:val="20"/>
+                <w:szCs w:val="20"/>
+              </w:rPr>
+              <w:t xml:space="preserve">Boosting can generalise well, and it can also overfit; how it fits says nothing about whether it beats the others here.</w:t>
+            </w:r>
+          </w:p>
+          <w:p>
+            <w:pPr>
+              <w:keepNext/>
+              <w:spacing w:after="40" w:line="264"/>
+              <w:ind w:left="360" w:hanging="360"/>
+            </w:pPr>
+            <w:r>
+              <w:rPr>
+                <w:rFonts w:ascii="Arial" w:cs="Arial" w:eastAsia="Arial" w:hAnsi="Arial"/>
+                <w:b/>
+                <w:bCs/>
+                <w:color w:val="1C1B16"/>
+                <w:sz w:val="20"/>
+                <w:szCs w:val="20"/>
+              </w:rPr>
+              <w:t xml:space="preserve">D.  </w:t>
+            </w:r>
+            <w:r>
+              <w:rPr>
+                <w:rFonts w:ascii="Arial" w:cs="Arial" w:eastAsia="Arial" w:hAnsi="Arial"/>
+                <w:color w:val="1C1B16"/>
+                <w:sz w:val="20"/>
+                <w:szCs w:val="20"/>
+              </w:rPr>
+              <w:t xml:space="preserve">AUC compares the ranking of any two models scored on the same rows, whatever their family.</w:t>
             </w:r>
           </w:p>
           <w:p>
@@ -14101,7 +14263,7 @@
                 <w:sz w:val="21"/>
                 <w:szCs w:val="21"/>
               </w:rPr>
-              <w:t xml:space="preserve">Brakes limit what the model can memorise, and cross-validation chooses how hard to press them.</w:t>
+              <w:t xml:space="preserve">Inside the noise the simpler model ships, and I name the gap, in AUC and in rupees, at which the complex one would.</w:t>
             </w:r>
           </w:p>
           <w:p>
@@ -14116,7 +14278,7 @@
                 <w:sz w:val="18"/>
                 <w:szCs w:val="18"/>
               </w:rPr>
-              <w:t xml:space="preserve">Anchor: Overfitting: what it is, how you detect it, how you fix it.</w:t>
+              <w:t xml:space="preserve">Anchor: Your tuned model beats a simpler one by a hair: which ships, and why?</w:t>
             </w:r>
           </w:p>
         </w:tc>
@@ -14188,7 +14350,7 @@
                 <w:sz w:val="21"/>
                 <w:szCs w:val="21"/>
               </w:rPr>
-              <w:t xml:space="preserve">   Key B</w:t>
+              <w:t xml:space="preserve">   Key A (overfitting)</w:t>
             </w:r>
             <w:r>
               <w:rPr>
@@ -14197,7 +14359,7 @@
                 <w:sz w:val="18"/>
                 <w:szCs w:val="18"/>
               </w:rPr>
-              <w:t xml:space="preserve">   One correct option, Hard, [F], Thu</w:t>
+              <w:t xml:space="preserve">   Fill in the blank, Easy, [S], Thu</w:t>
             </w:r>
           </w:p>
           <w:p>
@@ -14223,14 +14385,13 @@
                 <w:sz w:val="21"/>
                 <w:szCs w:val="21"/>
               </w:rPr>
-              <w:t xml:space="preserve">Five-fold cross-validation fits five models, each on four of the five folds, about 19,770 of the 24,712 training clients, and scores each on the fifth, about 4,942. The five scores ran from 0.769 to 0.798, so a single split could have reported anything in that band; the mean, 0.786, with its spread is the honest estimate, and the spread is the size of the luck one split carries. Thursday's chapter set five exams instead of one.</w:t>
+              <w:t xml:space="preserve">Perfect on training and far lower on validation is a model that memorised its training rows, which is overfitting; the room's unlimited tree scored 0.996 against 0.837. Underfitting scores low on both.</w:t>
             </w:r>
           </w:p>
           <w:p>
             <w:pPr>
               <w:keepNext/>
-              <w:spacing w:after="40" w:line="264"/>
-              <w:ind w:left="360" w:hanging="360"/>
+              <w:spacing w:after="40" w:before="60" w:line="276"/>
             </w:pPr>
             <w:r>
               <w:rPr>
@@ -14238,86 +14399,6 @@
                 <w:b/>
                 <w:bCs/>
                 <w:color w:val="1C1B16"/>
-                <w:sz w:val="20"/>
-                <w:szCs w:val="20"/>
-              </w:rPr>
-              <w:t xml:space="preserve">A.  </w:t>
-            </w:r>
-            <w:r>
-              <w:rPr>
-                <w:rFonts w:ascii="Arial" w:cs="Arial" w:eastAsia="Arial" w:hAnsi="Arial"/>
-                <w:color w:val="1C1B16"/>
-                <w:sz w:val="20"/>
-                <w:szCs w:val="20"/>
-              </w:rPr>
-              <w:t xml:space="preserve">Each fold trains its own model on the other four folds; one model scored five times would have seen the rows it is scored on.</w:t>
-            </w:r>
-          </w:p>
-          <w:p>
-            <w:pPr>
-              <w:keepNext/>
-              <w:spacing w:after="40" w:line="264"/>
-              <w:ind w:left="360" w:hanging="360"/>
-            </w:pPr>
-            <w:r>
-              <w:rPr>
-                <w:rFonts w:ascii="Arial" w:cs="Arial" w:eastAsia="Arial" w:hAnsi="Arial"/>
-                <w:b/>
-                <w:bCs/>
-                <w:color w:val="1C1B16"/>
-                <w:sz w:val="20"/>
-                <w:szCs w:val="20"/>
-              </w:rPr>
-              <w:t xml:space="preserve">C.  </w:t>
-            </w:r>
-            <w:r>
-              <w:rPr>
-                <w:rFonts w:ascii="Arial" w:cs="Arial" w:eastAsia="Arial" w:hAnsi="Arial"/>
-                <w:color w:val="1C1B16"/>
-                <w:sz w:val="20"/>
-                <w:szCs w:val="20"/>
-              </w:rPr>
-              <w:t xml:space="preserve">4,942 is each fold's validation share; each model trains on the other four-fifths.</w:t>
-            </w:r>
-          </w:p>
-          <w:p>
-            <w:pPr>
-              <w:keepNext/>
-              <w:spacing w:after="40" w:line="264"/>
-              <w:ind w:left="360" w:hanging="360"/>
-            </w:pPr>
-            <w:r>
-              <w:rPr>
-                <w:rFonts w:ascii="Arial" w:cs="Arial" w:eastAsia="Arial" w:hAnsi="Arial"/>
-                <w:b/>
-                <w:bCs/>
-                <w:color w:val="1C1B16"/>
-                <w:sz w:val="20"/>
-                <w:szCs w:val="20"/>
-              </w:rPr>
-              <w:t xml:space="preserve">D.  </w:t>
-            </w:r>
-            <w:r>
-              <w:rPr>
-                <w:rFonts w:ascii="Arial" w:cs="Arial" w:eastAsia="Arial" w:hAnsi="Arial"/>
-                <w:color w:val="1C1B16"/>
-                <w:sz w:val="20"/>
-                <w:szCs w:val="20"/>
-              </w:rPr>
-              <w:t xml:space="preserve">A model fitted on all the rows is scored on rows it saw, and the spread is exactly what one split's luck looks like.</w:t>
-            </w:r>
-          </w:p>
-          <w:p>
-            <w:pPr>
-              <w:keepNext/>
-              <w:spacing w:after="40" w:before="60" w:line="276"/>
-            </w:pPr>
-            <w:r>
-              <w:rPr>
-                <w:rFonts w:ascii="Arial" w:cs="Arial" w:eastAsia="Arial" w:hAnsi="Arial"/>
-                <w:b/>
-                <w:bCs/>
-                <w:color w:val="1C1B16"/>
                 <w:sz w:val="21"/>
                 <w:szCs w:val="21"/>
               </w:rPr>
@@ -14330,7 +14411,7 @@
                 <w:sz w:val="21"/>
                 <w:szCs w:val="21"/>
               </w:rPr>
-              <w:t xml:space="preserve">k folds fit k models on (k minus 1) over k of the rows; I report the mean and the spread, and a gap smaller than the spread is a tie.</w:t>
+              <w:t xml:space="preserve">A big gap between training and validation is memorising, so I add a brake and choose its strength on validation or by cross-validation.</w:t>
             </w:r>
           </w:p>
           <w:p>
@@ -14345,7 +14426,7 @@
                 <w:sz w:val="18"/>
                 <w:szCs w:val="18"/>
               </w:rPr>
-              <w:t xml:space="preserve">Anchor: Why cross-validation instead of one split?</w:t>
+              <w:t xml:space="preserve">Anchor: Overfitting: what it is, how you detect it, how you fix it.</w:t>
             </w:r>
           </w:p>
         </w:tc>
@@ -14417,7 +14498,7 @@
                 <w:sz w:val="21"/>
                 <w:szCs w:val="21"/>
               </w:rPr>
-              <w:t xml:space="preserve">   Key C</w:t>
+              <w:t xml:space="preserve">   Key D (split)</w:t>
             </w:r>
             <w:r>
               <w:rPr>
@@ -14426,7 +14507,7 @@
                 <w:sz w:val="18"/>
                 <w:szCs w:val="18"/>
               </w:rPr>
-              <w:t xml:space="preserve">   True or false, Hard, [D], Thu</w:t>
+              <w:t xml:space="preserve">   Fill in the blank, Medium, [F], Thu</w:t>
             </w:r>
           </w:p>
           <w:p>
@@ -14452,14 +14533,13 @@
                 <w:sz w:val="21"/>
                 <w:szCs w:val="21"/>
               </w:rPr>
-              <w:t xml:space="preserve">The three families sit within 0.011 AUC of each other, while the five folds of one model moved by about 0.03, so the ranking is inside the noise. On a tie the simpler model is the better recommendation: it is explained to a committee in one line per weight, monitored easily, and moved to lending with less to re-check. The flip is a gap that clears the folds' spread and is worth more in rupees, at the same budget of calls, than the cost of explaining and running the complex model. Thursday closed on why the boring model often ships.</w:t>
+              <w:t xml:space="preserve">One split can be lucky or unlucky in which clients land in validation; cross-validation gives every row a turn in validation and averages the scores, so the luck of one split averages away. The week's five folds ran from 0.769 to 0.798.</w:t>
             </w:r>
           </w:p>
           <w:p>
             <w:pPr>
               <w:keepNext/>
-              <w:spacing w:after="40" w:line="264"/>
-              <w:ind w:left="360" w:hanging="360"/>
+              <w:spacing w:after="40" w:before="60" w:line="276"/>
             </w:pPr>
             <w:r>
               <w:rPr>
@@ -14467,86 +14547,6 @@
                 <w:b/>
                 <w:bCs/>
                 <w:color w:val="1C1B16"/>
-                <w:sz w:val="20"/>
-                <w:szCs w:val="20"/>
-              </w:rPr>
-              <w:t xml:space="preserve">A.  </w:t>
-            </w:r>
-            <w:r>
-              <w:rPr>
-                <w:rFonts w:ascii="Arial" w:cs="Arial" w:eastAsia="Arial" w:hAnsi="Arial"/>
-                <w:color w:val="1C1B16"/>
-                <w:sz w:val="20"/>
-                <w:szCs w:val="20"/>
-              </w:rPr>
-              <w:t xml:space="preserve">The best number found on one validation slice carries that slice's luck, which Exhibit 4B sizes at about 0.03.</w:t>
-            </w:r>
-          </w:p>
-          <w:p>
-            <w:pPr>
-              <w:keepNext/>
-              <w:spacing w:after="40" w:line="264"/>
-              <w:ind w:left="360" w:hanging="360"/>
-            </w:pPr>
-            <w:r>
-              <w:rPr>
-                <w:rFonts w:ascii="Arial" w:cs="Arial" w:eastAsia="Arial" w:hAnsi="Arial"/>
-                <w:b/>
-                <w:bCs/>
-                <w:color w:val="1C1B16"/>
-                <w:sz w:val="20"/>
-                <w:szCs w:val="20"/>
-              </w:rPr>
-              <w:t xml:space="preserve">B.  </w:t>
-            </w:r>
-            <w:r>
-              <w:rPr>
-                <w:rFonts w:ascii="Arial" w:cs="Arial" w:eastAsia="Arial" w:hAnsi="Arial"/>
-                <w:color w:val="1C1B16"/>
-                <w:sz w:val="20"/>
-                <w:szCs w:val="20"/>
-              </w:rPr>
-              <w:t xml:space="preserve">Boosting can generalise well, and it can also overfit; how it fits says nothing about whether it beats the others here.</w:t>
-            </w:r>
-          </w:p>
-          <w:p>
-            <w:pPr>
-              <w:keepNext/>
-              <w:spacing w:after="40" w:line="264"/>
-              <w:ind w:left="360" w:hanging="360"/>
-            </w:pPr>
-            <w:r>
-              <w:rPr>
-                <w:rFonts w:ascii="Arial" w:cs="Arial" w:eastAsia="Arial" w:hAnsi="Arial"/>
-                <w:b/>
-                <w:bCs/>
-                <w:color w:val="1C1B16"/>
-                <w:sz w:val="20"/>
-                <w:szCs w:val="20"/>
-              </w:rPr>
-              <w:t xml:space="preserve">D.  </w:t>
-            </w:r>
-            <w:r>
-              <w:rPr>
-                <w:rFonts w:ascii="Arial" w:cs="Arial" w:eastAsia="Arial" w:hAnsi="Arial"/>
-                <w:color w:val="1C1B16"/>
-                <w:sz w:val="20"/>
-                <w:szCs w:val="20"/>
-              </w:rPr>
-              <w:t xml:space="preserve">AUC compares the ranking of any two models scored on the same rows, whatever their family.</w:t>
-            </w:r>
-          </w:p>
-          <w:p>
-            <w:pPr>
-              <w:keepNext/>
-              <w:spacing w:after="40" w:before="60" w:line="276"/>
-            </w:pPr>
-            <w:r>
-              <w:rPr>
-                <w:rFonts w:ascii="Arial" w:cs="Arial" w:eastAsia="Arial" w:hAnsi="Arial"/>
-                <w:b/>
-                <w:bCs/>
-                <w:color w:val="1C1B16"/>
                 <w:sz w:val="21"/>
                 <w:szCs w:val="21"/>
               </w:rPr>
@@ -14559,7 +14559,7 @@
                 <w:sz w:val="21"/>
                 <w:szCs w:val="21"/>
               </w:rPr>
-              <w:t xml:space="preserve">Inside the noise the simpler model ships, and I name the gap, in AUC and in rupees, at which the complex one would.</w:t>
+              <w:t xml:space="preserve">One split is one draw; five folds are five draws, so I quote the mean and the spread.</w:t>
             </w:r>
           </w:p>
           <w:p>
@@ -14574,7 +14574,7 @@
                 <w:sz w:val="18"/>
                 <w:szCs w:val="18"/>
               </w:rPr>
-              <w:t xml:space="preserve">Anchor: Your tuned model beats a simpler one by a hair: which ships, and why?</w:t>
+              <w:t xml:space="preserve">Anchor: Why cross-validation instead of one split?</w:t>
             </w:r>
           </w:p>
         </w:tc>
@@ -14681,7 +14681,7 @@
                 <w:sz w:val="21"/>
                 <w:szCs w:val="21"/>
               </w:rPr>
-              <w:t xml:space="preserve">Staleness shows on fresh outcomes, so the rule compares what the model predicted with what happened, every month, against a gap stated in advance. On the bank's late rows the mean score was 0.152 while 24.6 percent said yes: the probabilities fell out of step even though the ranking held at an AUC of 0.657, and the cost line, which assumes calibrated scores, was drawn in the wrong place. Instacart's alarm was the same kind: a monitored metric falling from 93 to 61 percent, and its first fix was a threshold change while retraining caught up. Friday's chapter was when the model goes stale.</w:t>
+              <w:t xml:space="preserve">Staleness shows on fresh outcomes, so the rule compares what the model predicted with what happened, every month, against a gap stated in advance. On the bank's late rows the mean score was 0.152 while 24.6 percent said yes: the probabilities fell out of step even though the ranking still held at an AUC of 0.657, and the cost line, which reads the scores as probabilities, was drawn on numbers that understate every client's chance. Instacart's alarm was the same kind: a monitored metric falling from 93 to 61 percent, and its first fix was a threshold change while retraining caught up. Friday's chapter was when the model goes stale.</w:t>
             </w:r>
           </w:p>
           <w:p>
@@ -14708,7 +14708,7 @@
                 <w:sz w:val="20"/>
                 <w:szCs w:val="20"/>
               </w:rPr>
-              <w:t xml:space="preserve">Retraining with no measurement can neither tell whether the old model failed nor whether the new one is better, and it needs outcomes that arrive weeks late.</w:t>
+              <w:t xml:space="preserve">Retraining with no measurement can neither tell whether the old model failed nor whether the new one is better, and the outcomes it needs arrive weeks late.</w:t>
             </w:r>
           </w:p>
           <w:p>
@@ -14735,7 +14735,7 @@
                 <w:sz w:val="20"/>
                 <w:szCs w:val="20"/>
               </w:rPr>
-              <w:t xml:space="preserve">Training accuracy is measured on rows the model already saw, so it stays high while the world moves.</w:t>
+              <w:t xml:space="preserve">Training accuracy is measured on rows the model already saw, so it stays high while the world moves, and a line drawn on scores that run low is wrong whatever training says.</w:t>
             </w:r>
           </w:p>
           <w:p>
@@ -14762,7 +14762,7 @@
                 <w:sz w:val="20"/>
                 <w:szCs w:val="20"/>
               </w:rPr>
-              <w:t xml:space="preserve">A feeling arrives after the money is spent; a stated floor on a measured metric arrives first.</w:t>
+              <w:t xml:space="preserve">A ranking can hold while the probabilities drift, as the late rows' AUC of 0.657 did, and the cost line reads probabilities, so the ranking cannot vouch for it.</w:t>
             </w:r>
           </w:p>
           <w:p>
@@ -15086,7 +15086,7 @@
                 <w:sz w:val="18"/>
                 <w:szCs w:val="18"/>
               </w:rPr>
-              <w:t xml:space="preserve">   One correct option, Hard, [D], Fri</w:t>
+              <w:t xml:space="preserve">   One correct option, Medium, [D], Fri</w:t>
             </w:r>
           </w:p>
           <w:p>
@@ -15508,7 +15508,7 @@
           <w:sz w:val="21"/>
           <w:szCs w:val="21"/>
         </w:rPr>
-        <w:t xml:space="preserve">[S] (12): Q1, Q2, Q5, Q6, Q8, Q9, Q10, Q12, Q13, Q14, Q17, Q19</w:t>
+        <w:t xml:space="preserve">[S] (12): Q1, Q4, Q5, Q7, Q8, Q9, Q11, Q12, Q13, Q16, Q17, Q21</w:t>
       </w:r>
     </w:p>
     <w:p>
@@ -15527,7 +15527,7 @@
           <w:sz w:val="21"/>
           <w:szCs w:val="21"/>
         </w:rPr>
-        <w:t xml:space="preserve">[F] (8): Q4, Q7, Q15, Q16, Q18, Q20, Q21, Q23</w:t>
+        <w:t xml:space="preserve">[F] (8): Q3, Q6, Q14, Q15, Q18, Q19, Q22, Q23</w:t>
       </w:r>
     </w:p>
     <w:p>
@@ -15565,7 +15565,7 @@
           <w:sz w:val="21"/>
           <w:szCs w:val="21"/>
         </w:rPr>
-        <w:t xml:space="preserve">[D] (6): Q3, Q11, Q22, Q24, Q25, Q26</w:t>
+        <w:t xml:space="preserve">[D] (6): Q2, Q10, Q20, Q24, Q25, Q26</w:t>
       </w:r>
     </w:p>
     <w:p>
@@ -15584,7 +15584,7 @@
           <w:sz w:val="21"/>
           <w:szCs w:val="21"/>
         </w:rPr>
-        <w:t xml:space="preserve">Easy (4): Q1, Q6, Q12, Q17</w:t>
+        <w:t xml:space="preserve">Easy (4): Q5, Q11, Q16, Q21</w:t>
       </w:r>
     </w:p>
     <w:p>
@@ -15603,7 +15603,7 @@
           <w:sz w:val="21"/>
           <w:szCs w:val="21"/>
         </w:rPr>
-        <w:t xml:space="preserve">Medium (7): Q4, Q5, Q7, Q9, Q18, Q20, Q24</w:t>
+        <w:t xml:space="preserve">Medium (9): Q1, Q3, Q4, Q8, Q14, Q18, Q22, Q24, Q25</w:t>
       </w:r>
     </w:p>
     <w:p>
@@ -15622,7 +15622,7 @@
           <w:sz w:val="21"/>
           <w:szCs w:val="21"/>
         </w:rPr>
-        <w:t xml:space="preserve">Hard (15): Q2, Q3, Q8, Q10, Q11, Q13, Q14, Q15, Q16, Q19, Q21, Q22, Q23, Q25, Q26</w:t>
+        <w:t xml:space="preserve">Hard (13): Q2, Q6, Q7, Q9, Q10, Q12, Q13, Q15, Q17, Q19, Q20, Q23, Q26</w:t>
       </w:r>
     </w:p>
     <w:p>
@@ -15768,7 +15768,7 @@
           <w:sz w:val="21"/>
           <w:szCs w:val="21"/>
         </w:rPr>
-        <w:t xml:space="preserve">Q2 (One correct option, Hard, [S]): On Thursday an analyst opens the sealed test slice, sees 0.79, moves the threshold until the test score improves and reports the new test score to the committee. What is wrong, and what should the committee be told?</w:t>
+        <w:t xml:space="preserve">Q1 (One correct option, Medium, [S]): On Thursday an analyst opens the sealed test slice, sees 0.79, moves the threshold until the test score improves and reports the new test score to the committee. What is wrong, and what should the committee be told?</w:t>
       </w:r>
     </w:p>
     <w:p>
@@ -15787,7 +15787,7 @@
           <w:sz w:val="21"/>
           <w:szCs w:val="21"/>
         </w:rPr>
-        <w:t xml:space="preserve">Q3 (True or false, Hard, [D]): The calls run in date order. On the week's run the earliest 70 percent of rows say yes 5.6 percent of the time and the latest 30 percent say yes 24.6 percent of the time. Statement: for the question "whom do we call in the next campaign", a random split of all the rows estimates the model's score as honestly as a split by date. True or false, and why?</w:t>
+        <w:t xml:space="preserve">Q2 (True or false, Hard, [D]): The calls run in date order. On the week's run the earliest 70 percent of rows say yes 5.6 percent of the time and the latest 30 percent say yes 24.6 percent of the time. Statement: for the question "whom do we call in the next campaign", a random split of all the rows estimates the model's score as honestly as a split by date. True or false, and why?</w:t>
       </w:r>
     </w:p>
     <w:p>
@@ -15806,7 +15806,7 @@
           <w:sz w:val="21"/>
           <w:szCs w:val="21"/>
         </w:rPr>
-        <w:t xml:space="preserve">Q4 (One correct option, Medium, [F]): The logistic model gives one client a score of 0.71. What does the 0.71 say?</w:t>
+        <w:t xml:space="preserve">Q3 (One correct option, Medium, [F]): The logistic model gives one client a score of 0.71. What does the 0.71 say?</w:t>
       </w:r>
     </w:p>
     <w:p>
@@ -15825,7 +15825,7 @@
           <w:sz w:val="21"/>
           <w:szCs w:val="21"/>
         </w:rPr>
-        <w:t xml:space="preserve">Q5 (More than one correct, Medium, [S]): The bank's marketing head brings four asks. Which need a model that predicts? Circle every correct letter.</w:t>
+        <w:t xml:space="preserve">Q4 (More than one correct, Medium, [S]): The bank's marketing head brings four asks. Which need a model that predicts? Circle every correct letter.</w:t>
       </w:r>
     </w:p>
     <w:p>
@@ -15844,7 +15844,7 @@
           <w:sz w:val="21"/>
           <w:szCs w:val="21"/>
         </w:rPr>
-        <w:t xml:space="preserve">Q7 (True or false, Medium, [F]): Statement: an accuracy of 0.897 against 0.887 for calling nobody shows that the model at 0.5 is good enough to run the campaign. True or false, and why?</w:t>
+        <w:t xml:space="preserve">Q6 (True or false, Hard, [F]): Statement: an accuracy of 0.897 against 0.887 for calling nobody shows that the model at 0.5 is good enough to run the campaign. True or false, and why?</w:t>
       </w:r>
     </w:p>
     <w:p>
@@ -15863,7 +15863,7 @@
           <w:sz w:val="21"/>
           <w:szCs w:val="21"/>
         </w:rPr>
-        <w:t xml:space="preserve">Q8 (Applied maths, Hard, [S]): From the model's row of Exhibit 2A, compute its precision, recall and F1 at the threshold of 0.5, each to two decimal places. Show the working.</w:t>
+        <w:t xml:space="preserve">Q7 (Applied maths, Hard, [S]): From the model's row of Exhibit 2A, compute its precision, recall and F1 at the threshold of 0.5, each to two decimal places. Show the working.</w:t>
       </w:r>
     </w:p>
     <w:p>
@@ -15882,7 +15882,7 @@
           <w:sz w:val="21"/>
           <w:szCs w:val="21"/>
         </w:rPr>
-        <w:t xml:space="preserve">Q9 (Applied maths, Medium, [S]): A call to a client who says no wastes Rs 40, and a buyer left off the list loses about Rs 1,200. Above what chance of a yes is a call worth making, and which way does that move the threshold from 0.5? Show the working.</w:t>
+        <w:t xml:space="preserve">Q8 (Applied maths, Medium, [S]): A call to a client who says no wastes Rs 40, and a buyer left off the list loses about Rs 1,200. Above what chance of a yes is a call worth making, and which way does that move the threshold from 0.5? Show the working.</w:t>
       </w:r>
     </w:p>
     <w:p>
@@ -15901,7 +15901,7 @@
           <w:sz w:val="21"/>
           <w:szCs w:val="21"/>
         </w:rPr>
-        <w:t xml:space="preserve">Q10 (One correct option, Hard, [S]): At Rs 40 a wasted call and Rs 1,200 a missed buyer, what is the error bill at the thresholds of 0.5 and 0.10 in Exhibit 2B, and which costs less?</w:t>
+        <w:t xml:space="preserve">Q9 (One correct option, Hard, [S]): At Rs 40 a wasted call and Rs 1,200 a missed buyer, what is the error bill at the thresholds of 0.5 and 0.10 in Exhibit 2B, and which costs less?</w:t>
       </w:r>
     </w:p>
     <w:p>
@@ -15920,7 +15920,7 @@
           <w:sz w:val="21"/>
           <w:szCs w:val="21"/>
         </w:rPr>
-        <w:t xml:space="preserve">Q11 (One correct option, Hard, [D]): The call centre can make 1,000 calls in the next campaign, and the cost line would call 7,438 of these 8,238 clients (Exhibit 2B). Which plan goes to the marketing head?</w:t>
+        <w:t xml:space="preserve">Q10 (One correct option, Hard, [D]): The call centre can make 1,000 calls in the next campaign, and the cost line would call 7,438 of these 8,238 clients (Exhibit 2B). Which plan goes to the marketing head?</w:t>
       </w:r>
     </w:p>
     <w:p>
@@ -15939,7 +15939,7 @@
           <w:sz w:val="21"/>
           <w:szCs w:val="21"/>
         </w:rPr>
-        <w:t xml:space="preserve">Q13 (One correct option, Hard, [S]): The junior's message reads: "Adding duration lifts AUC from 0.795 to 0.932. Shipping tonight." What is the reply?</w:t>
+        <w:t xml:space="preserve">Q12 (One correct option, Hard, [S]): The junior's message reads: "Adding duration lifts AUC from 0.795 to 0.932. Shipping tonight." What is the reply?</w:t>
       </w:r>
     </w:p>
     <w:p>
@@ -15958,7 +15958,7 @@
           <w:sz w:val="21"/>
           <w:szCs w:val="21"/>
         </w:rPr>
-        <w:t xml:space="preserve">Q14 (More than one correct, Hard, [S]): The list for next month's campaign is built on the morning before the first call. Which columns pass the prediction-time question? Circle every correct letter.</w:t>
+        <w:t xml:space="preserve">Q13 (More than one correct, Hard, [S]): The list for next month's campaign is built on the morning before the first call. Which columns pass the prediction-time question? Circle every correct letter.</w:t>
       </w:r>
     </w:p>
     <w:p>
@@ -15977,7 +15977,7 @@
           <w:sz w:val="21"/>
           <w:szCs w:val="21"/>
         </w:rPr>
-        <w:t xml:space="preserve">Q15 (True or false, Hard, [F]): In the leaky model duration tops the importance chart, and clients who said yes talked 553 seconds on average against 221 for those who said no. Statement: longer calls cause deposits, so agents should be coached to keep clients on the line. True or false, and why?</w:t>
+        <w:t xml:space="preserve">Q14 (True or false, Medium, [F]): In the model with duration, duration tops the importance chart, and clients who said yes talked 553 seconds on average against 221 for those who said no. Statement: longer calls cause deposits, so agents should be coached to keep clients on the line. True or false, and why?</w:t>
       </w:r>
     </w:p>
     <w:p>
@@ -15996,7 +15996,7 @@
           <w:sz w:val="21"/>
           <w:szCs w:val="21"/>
         </w:rPr>
-        <w:t xml:space="preserve">Q16 (One correct option, Hard, [F]): On its own, euribor3m takes a coefficient of -0.92 on the standardised scale; beside the four other economic indicators it takes +0.39. What is the likeliest cause?</w:t>
+        <w:t xml:space="preserve">Q15 (One correct option, Hard, [F]): On its own, euribor3m takes a coefficient of -0.92 on the standardised scale; beside the four other economic indicators it takes +0.39. The marketing head asks whether higher rates help the campaign. What is the likeliest cause of the flip, and what does the memo say?</w:t>
       </w:r>
     </w:p>
     <w:p>
@@ -16015,7 +16015,7 @@
           <w:sz w:val="21"/>
           <w:szCs w:val="21"/>
         </w:rPr>
-        <w:t xml:space="preserve">Q19 (One correct option, Hard, [S]): The unlimited tree scores 0.996 on training and 0.837 on validation, below calling nobody. Which reading and which next step are right?</w:t>
+        <w:t xml:space="preserve">Q17 (One correct option, Hard, [S]): The unlimited tree scores 0.996 on training and 0.837 on validation, below calling nobody. Which reading and which next step are right?</w:t>
       </w:r>
     </w:p>
     <w:p>
@@ -16034,7 +16034,7 @@
           <w:sz w:val="21"/>
           <w:szCs w:val="21"/>
         </w:rPr>
-        <w:t xml:space="preserve">Q20 (More than one correct, Medium, [F]): Which of these put a brake on overfitting? Circle every correct letter.</w:t>
+        <w:t xml:space="preserve">Q18 (More than one correct, Medium, [F]): Which of these put a brake on overfitting? Circle every correct letter.</w:t>
       </w:r>
     </w:p>
     <w:p>
@@ -16053,7 +16053,7 @@
           <w:sz w:val="21"/>
           <w:szCs w:val="21"/>
         </w:rPr>
-        <w:t xml:space="preserve">Q21 (One correct option, Hard, [F]): Five-fold cross-validation of the logistic model gave the five fold scores in Exhibit 4B. How many models were fitted, on about how many clients each, and what does the spread tell the committee?</w:t>
+        <w:t xml:space="preserve">Q19 (One correct option, Hard, [F]): Five-fold cross-validation of the logistic model gave the five fold scores in Exhibit 4B. How many models were fitted, on about how many clients each, and what does the spread tell the committee?</w:t>
       </w:r>
     </w:p>
     <w:p>
@@ -16072,7 +16072,7 @@
           <w:sz w:val="21"/>
           <w:szCs w:val="21"/>
         </w:rPr>
-        <w:t xml:space="preserve">Q22 (True or false, Hard, [D]): Statement: gradient boosting should go into the memo, since it scores the highest validation AUC of the three families in Exhibit 4B. True or false, and why?</w:t>
+        <w:t xml:space="preserve">Q20 (True or false, Hard, [D]): Statement: gradient boosting should go into the memo, since it scores the highest validation AUC of the three families in Exhibit 4B. True or false, and why?</w:t>
       </w:r>
     </w:p>
     <w:p>
@@ -16091,7 +16091,7 @@
           <w:sz w:val="21"/>
           <w:szCs w:val="21"/>
         </w:rPr>
-        <w:t xml:space="preserve">Q23 (One correct option, Hard, [F]): Which monitoring rule would have caught the bank's model going stale earliest?</w:t>
+        <w:t xml:space="preserve">Q23 (One correct option, Hard, [F]): On the latest 30 percent of calls the model's mean score was 0.152 while 24.6 percent said yes (Exhibit 5A). Which monitoring rule catches this first, and what does it mean for the cost line drawn on these scores?</w:t>
       </w:r>
     </w:p>
     <w:p>
@@ -16129,7 +16129,7 @@
           <w:sz w:val="21"/>
           <w:szCs w:val="21"/>
         </w:rPr>
-        <w:t xml:space="preserve">Q25 (One correct option, Hard, [D]): Anand Iyer asks what evidence would make him sign. Across 23 comparisons, Booking.com found offline gains and business gains almost uncorrelated (Exhibit 5B). What does the memo propose?</w:t>
+        <w:t xml:space="preserve">Q25 (One correct option, Medium, [D]): Anand Iyer asks what evidence would make him sign. Across 23 comparisons, Booking.com found offline gains and business gains almost uncorrelated (Exhibit 5B). What does the memo propose?</w:t>
       </w:r>
     </w:p>
     <w:p>
@@ -16199,7 +16199,7 @@
           <w:sz w:val="21"/>
           <w:szCs w:val="21"/>
         </w:rPr>
-        <w:t xml:space="preserve">Bank 6 (True or false, Easy, Tue), folded into Q7: The printed statement is bank 6's trap on the week's own rows, where calling nobody already scores 0.887 on an 89 to 11 outcome, and option d keys the reason accuracy says little there.</w:t>
+        <w:t xml:space="preserve">Bank 6 (True or false, Easy, Tue), folded into Q6: The printed statement is bank 6's trap on the week's own rows, where calling nobody already scores 0.887 on an 89 to 11 outcome, and option d keys the reason accuracy says little there.</w:t>
       </w:r>
     </w:p>
     <w:p>
@@ -16218,7 +16218,7 @@
           <w:sz w:val="21"/>
           <w:szCs w:val="21"/>
         </w:rPr>
-        <w:t xml:space="preserve">Bank 7 (True or false, Medium, Wed), folded into Q15: The statement reads the top of an importance chart as a cause, and the key refuses it because the yes drives the call's length as much as the reverse, which is bank 7's false statement judged with its reason.</w:t>
+        <w:t xml:space="preserve">Bank 7 (True or false, Medium, Wed), folded into Q14: The statement reads the top of an importance chart as a cause, and the key refuses it because the yes drives the call's length as much as the reverse, which is bank 7's false statement judged with its reason.</w:t>
       </w:r>
     </w:p>
     <w:p>
@@ -16237,7 +16237,7 @@
           <w:sz w:val="21"/>
           <w:szCs w:val="21"/>
         </w:rPr>
-        <w:t xml:space="preserve">Bank 8 (True or false, Easy, Thu), folded into Q20: Option b is a stronger penalty on the weights, which loosens the fit to the training rows, and option c, fitting the training rows until they score 1.0, is bank 8's false statement offered as a brake.</w:t>
+        <w:t xml:space="preserve">Bank 8 (True or false, Easy, Thu), folded into Q18: Option b is a stronger penalty on the weights, which loosens the fit to the training rows, and option c, fitting the training rows until they score 1.0, is bank 8's false statement offered as a brake.</w:t>
       </w:r>
     </w:p>
     <w:p>
@@ -16256,7 +16256,7 @@
           <w:sz w:val="21"/>
           <w:szCs w:val="21"/>
         </w:rPr>
-        <w:t xml:space="preserve">Bank 9 (True or false, Hard, Fri), folded into Q22: The key is bank 9's statement on the week's three families, a gap of 0.011 AUC inside the 0.03 one split moves by, so the simpler, explainable model is the recommendation.</w:t>
+        <w:t xml:space="preserve">Bank 9 (True or false, Hard, Fri), folded into Q20: The key is bank 9's statement on the week's three families, a gap of 0.011 AUC inside the 0.03 one split moves by, so the simpler, explainable model is the recommendation.</w:t>
       </w:r>
     </w:p>
     <w:p>
@@ -16275,7 +16275,7 @@
           <w:sz w:val="21"/>
           <w:szCs w:val="21"/>
         </w:rPr>
-        <w:t xml:space="preserve">Bank 10 (One correct option, Easy, Mon), folded into Q5: The item sorts four of the bank's asks into the two that need a prediction and the two a query answers, which is bank 10's question with two keys where the bank has one.</w:t>
+        <w:t xml:space="preserve">Bank 10 (One correct option, Easy, Mon), folded into Q4: The item sorts four of the bank's asks into the two that need a prediction and the two a query answers, which is bank 10's question with two keys where the bank has one.</w:t>
       </w:r>
     </w:p>
     <w:p>
@@ -16294,7 +16294,7 @@
           <w:sz w:val="21"/>
           <w:szCs w:val="21"/>
         </w:rPr>
-        <w:t xml:space="preserve">Bank 11 (One correct option, Medium, Mon), folded into Q4: The item asks what a logistic score of 0.71 says about one client, with bank 11's three misreadings as the distractors and the calibration condition added to the key.</w:t>
+        <w:t xml:space="preserve">Bank 11 (One correct option, Medium, Mon), folded into Q3: The item asks what a logistic score of 0.71 says about one client, with bank 11's three misreadings as the distractors and the calibration condition added to the key.</w:t>
       </w:r>
     </w:p>
     <w:p>
@@ -16313,7 +16313,7 @@
           <w:sz w:val="21"/>
           <w:szCs w:val="21"/>
         </w:rPr>
-        <w:t xml:space="preserve">Bank 12 (One correct option, Medium, Tue), folded into Q9: The working puts the line at 1 in 31, about 0.032, far below 0.5, and the answer names the direction and that recall leads, which is bank 12's key derived where the bank only asks for it.</w:t>
+        <w:t xml:space="preserve">Bank 12 (One correct option, Medium, Tue), folded into Q8: The working puts the line at 1 in 31, about 0.032, far below 0.5, and the answer names the direction and that recall leads, which is bank 12's key derived where the bank only asks for it.</w:t>
       </w:r>
     </w:p>
     <w:p>
@@ -16351,7 +16351,7 @@
           <w:sz w:val="21"/>
           <w:szCs w:val="21"/>
         </w:rPr>
-        <w:t xml:space="preserve">Bank 14 (One correct option, Medium, Wed), folded into Q13: The item is bank 14's leak on the week's real column, duration, which the dataset's own notes say is known only after the call, and its key removes it and reports the honest 0.795.</w:t>
+        <w:t xml:space="preserve">Bank 14 (One correct option, Medium, Wed), folded into Q12: The item is bank 14's leak on the week's real column, duration, which the dataset's own notes say is known only after the call, and its key removes it and reports the honest 0.795.</w:t>
       </w:r>
     </w:p>
     <w:p>
@@ -16370,7 +16370,7 @@
           <w:sz w:val="21"/>
           <w:szCs w:val="21"/>
         </w:rPr>
-        <w:t xml:space="preserve">Bank 15 (One correct option, Hard, Wed), folded into Q16: The item is bank 15's sign flip as the week measured it, euribor3m from -0.92 alone to +0.39 beside the other indicators, with the same four causes as options.</w:t>
+        <w:t xml:space="preserve">Bank 15 (One correct option, Hard, Wed), folded into Q15: The item is bank 15's sign flip as the week measured it, euribor3m from -0.92 alone to +0.39 beside the other indicators, with the same four causes as options.</w:t>
       </w:r>
     </w:p>
     <w:p>
@@ -16389,7 +16389,7 @@
           <w:sz w:val="21"/>
           <w:szCs w:val="21"/>
         </w:rPr>
-        <w:t xml:space="preserve">Bank 16 (One correct option, Medium, Thu), folded into Q19: The exhibit is bank 16's curve on the room's own tree, training rising to 0.996 while validation falls to 0.837, and the key caps the depth at the validation peak, which is bank 16's prescription.</w:t>
+        <w:t xml:space="preserve">Bank 16 (One correct option, Medium, Thu), folded into Q17: The exhibit is bank 16's curve on the room's own tree, training rising to 0.996 while validation falls to 0.837, and the key caps the depth at the validation peak, which is bank 16's prescription.</w:t>
       </w:r>
     </w:p>
     <w:p>
@@ -16427,7 +16427,7 @@
           <w:sz w:val="21"/>
           <w:szCs w:val="21"/>
         </w:rPr>
-        <w:t xml:space="preserve">Bank 18 (More than one correct, Medium, Mon), folded into Q7: The statement sets the model against the majority-class baseline on the same validation rows, bank 18's options a and c, and its key says why beating the baseline on accuracy alone does not earn a ship, bank 18's option b.</w:t>
+        <w:t xml:space="preserve">Bank 18 (More than one correct, Medium, Mon), folded into Q6: The statement sets the model against the majority-class baseline on the same validation rows, bank 18's options a and c, and its key says why beating the baseline on accuracy alone does not earn a ship, bank 18's option b.</w:t>
       </w:r>
     </w:p>
     <w:p>
@@ -16446,7 +16446,7 @@
           <w:sz w:val="21"/>
           <w:szCs w:val="21"/>
         </w:rPr>
-        <w:t xml:space="preserve">Bank 19 (More than one correct, Medium, Wed), folded into Q14: The item is bank 19's prediction-time test on the bank's own columns, with the tempting legitimate column, the previous campaign's result, beside the call's duration.</w:t>
+        <w:t xml:space="preserve">Bank 19 (More than one correct, Medium, Wed), folded into Q13: The item is bank 19's prediction-time test on the bank's own columns, with the tempting legitimate column, the previous campaign's result, beside the call's duration.</w:t>
       </w:r>
     </w:p>
     <w:p>
@@ -16465,7 +16465,7 @@
           <w:sz w:val="21"/>
           <w:szCs w:val="21"/>
         </w:rPr>
-        <w:t xml:space="preserve">Bank 20 (More than one correct, Medium, Thu), folded into Q20: The item is bank 20 on the week's two families, a depth cap, a stronger penalty and cross-validation as the brakes, with fitting the training rows harder as the false one.</w:t>
+        <w:t xml:space="preserve">Bank 20 (More than one correct, Medium, Thu), folded into Q18: The item is bank 20 on the week's two families, a depth cap, a stronger penalty and cross-validation as the brakes, with fitting the training rows harder as the false one.</w:t>
       </w:r>
     </w:p>
     <w:p>
@@ -16503,7 +16503,7 @@
           <w:sz w:val="21"/>
           <w:szCs w:val="21"/>
         </w:rPr>
-        <w:t xml:space="preserve">Bank 22 (Scenario set, Easy, Tue), folded into Q8: The working computes precision on the week's real matrix, 174 of the 268 called, which is bank 22's arithmetic on numbers the room ran.</w:t>
+        <w:t xml:space="preserve">Bank 22 (Scenario set, Easy, Tue), folded into Q7: The working computes precision on the week's real matrix, 174 of the 268 called, which is bank 22's arithmetic on numbers the room ran.</w:t>
       </w:r>
     </w:p>
     <w:p>
@@ -16522,7 +16522,7 @@
           <w:sz w:val="21"/>
           <w:szCs w:val="21"/>
         </w:rPr>
-        <w:t xml:space="preserve">Bank 23 (Scenario set, Easy, Tue), folded into Q8: The working computes recall on the same matrix, 174 of the 928 buyers, which is bank 23's arithmetic.</w:t>
+        <w:t xml:space="preserve">Bank 23 (Scenario set, Easy, Tue), folded into Q7: The working computes recall on the same matrix, 174 of the 928 buyers, which is bank 23's arithmetic.</w:t>
       </w:r>
     </w:p>
     <w:p>
@@ -16541,7 +16541,7 @@
           <w:sz w:val="21"/>
           <w:szCs w:val="21"/>
         </w:rPr>
-        <w:t xml:space="preserve">Bank 24 (Scenario set, Medium, Tue), folded into Q10: The item prices the week's real matrix at bank 24's costs, Rs 40 a wasted call and Rs 1,200 a missed buyer, which is bank 24's error bill.</w:t>
+        <w:t xml:space="preserve">Bank 24 (Scenario set, Medium, Tue), folded into Q9: The item prices the week's real matrix at bank 24's costs, Rs 40 a wasted call and Rs 1,200 a missed buyer, which is bank 24's error bill.</w:t>
       </w:r>
     </w:p>
     <w:p>
@@ -16560,7 +16560,7 @@
           <w:sz w:val="21"/>
           <w:szCs w:val="21"/>
         </w:rPr>
-        <w:t xml:space="preserve">Bank 25 (Scenario set, Hard, Tue), folded into Q10: The item compares the bill at two thresholds and asks which costs less, which is bank 25's question on the week's own thresholds, and its distractors are the three ways the bill is usually miscounted.</w:t>
+        <w:t xml:space="preserve">Bank 25 (Scenario set, Hard, Tue), folded into Q9: The item compares the bill at two thresholds and asks which costs less, which is bank 25's question on the week's own thresholds, and its distractors are the three ways the bill is usually miscounted.</w:t>
       </w:r>
     </w:p>
     <w:p>
@@ -16579,7 +16579,7 @@
           <w:sz w:val="21"/>
           <w:szCs w:val="21"/>
         </w:rPr>
-        <w:t xml:space="preserve">Bank 26 (Scenario set, Medium, Tue), folded into Q7: The key reads 0.897 accuracy beside 174 of 928 buyers found, which is bank 26's point that an accuracy figure says little about how many buyers were found.</w:t>
+        <w:t xml:space="preserve">Bank 26 (Scenario set, Medium, Tue), folded into Q6: The key reads 0.897 accuracy beside 174 of 928 buyers found, which is bank 26's point that an accuracy figure says little about how many buyers were found.</w:t>
       </w:r>
     </w:p>
     <w:p>
@@ -16598,7 +16598,7 @@
           <w:sz w:val="21"/>
           <w:szCs w:val="21"/>
         </w:rPr>
-        <w:t xml:space="preserve">Bank 27 (Applied maths, Hard, Tue), folded into Q8: The item asks for precision, recall and F1 from one matrix, bank 27's three figures, on the week's real counts.</w:t>
+        <w:t xml:space="preserve">Bank 27 (Applied maths, Hard, Tue), folded into Q7: The item asks for precision, recall and F1 from one matrix, bank 27's three figures, on the week's real counts.</w:t>
       </w:r>
     </w:p>
     <w:p>
@@ -16617,7 +16617,7 @@
           <w:sz w:val="21"/>
           <w:szCs w:val="21"/>
         </w:rPr>
-        <w:t xml:space="preserve">Bank 28 (Applied maths, Medium, Tue), folded into Q9: The working states that one caught buyer pays for 30 wasted calls, which is bank 28's answer, and turns it into the threshold.</w:t>
+        <w:t xml:space="preserve">Bank 28 (Applied maths, Medium, Tue), folded into Q8: The working states that one caught buyer pays for 30 wasted calls, which is bank 28's answer, and turns it into the threshold.</w:t>
       </w:r>
     </w:p>
     <w:p>
@@ -16636,7 +16636,7 @@
           <w:sz w:val="21"/>
           <w:szCs w:val="21"/>
         </w:rPr>
-        <w:t xml:space="preserve">Bank 29 (Applied maths, Easy, Thu), folded into Q21: The key states five models fitted on about four-fifths of the training rows each, which is bank 29's count on the week's 24,712 rows.</w:t>
+        <w:t xml:space="preserve">Bank 29 (Applied maths, Easy, Thu), folded into Q19: The key states five models fitted on about four-fifths of the training rows each, which is bank 29's count on the week's 24,712 rows.</w:t>
       </w:r>
     </w:p>
     <w:p>
@@ -17067,7 +17067,7 @@
                       <w:sz w:val="16"/>
                       <w:szCs w:val="16"/>
                     </w:rPr>
-                    <w:t xml:space="preserve">Q2</w:t>
+                    <w:t xml:space="preserve">Q1</w:t>
                   </w:r>
                 </w:p>
               </w:tc>
@@ -17248,7 +17248,7 @@
                       <w:sz w:val="16"/>
                       <w:szCs w:val="16"/>
                     </w:rPr>
-                    <w:t xml:space="preserve">Q3</w:t>
+                    <w:t xml:space="preserve">Q2</w:t>
                   </w:r>
                 </w:p>
               </w:tc>
@@ -17429,7 +17429,7 @@
                       <w:sz w:val="16"/>
                       <w:szCs w:val="16"/>
                     </w:rPr>
-                    <w:t xml:space="preserve">Q4</w:t>
+                    <w:t xml:space="preserve">Q3</w:t>
                   </w:r>
                 </w:p>
               </w:tc>
@@ -17610,7 +17610,7 @@
                       <w:sz w:val="16"/>
                       <w:szCs w:val="16"/>
                     </w:rPr>
-                    <w:t xml:space="preserve">Q5*</w:t>
+                    <w:t xml:space="preserve">Q4*</w:t>
                   </w:r>
                 </w:p>
               </w:tc>
@@ -17791,7 +17791,7 @@
                       <w:sz w:val="16"/>
                       <w:szCs w:val="16"/>
                     </w:rPr>
-                    <w:t xml:space="preserve">Q7</w:t>
+                    <w:t xml:space="preserve">Q6</w:t>
                   </w:r>
                 </w:p>
               </w:tc>
@@ -17972,7 +17972,7 @@
                       <w:sz w:val="16"/>
                       <w:szCs w:val="16"/>
                     </w:rPr>
-                    <w:t xml:space="preserve">Q10</w:t>
+                    <w:t xml:space="preserve">Q9</w:t>
                   </w:r>
                 </w:p>
               </w:tc>
@@ -18153,7 +18153,7 @@
                       <w:sz w:val="16"/>
                       <w:szCs w:val="16"/>
                     </w:rPr>
-                    <w:t xml:space="preserve">Q11</w:t>
+                    <w:t xml:space="preserve">Q10</w:t>
                   </w:r>
                 </w:p>
               </w:tc>
@@ -18575,7 +18575,7 @@
                       <w:sz w:val="16"/>
                       <w:szCs w:val="16"/>
                     </w:rPr>
-                    <w:t xml:space="preserve">Q13</w:t>
+                    <w:t xml:space="preserve">Q12</w:t>
                   </w:r>
                 </w:p>
               </w:tc>
@@ -18756,7 +18756,7 @@
                       <w:sz w:val="16"/>
                       <w:szCs w:val="16"/>
                     </w:rPr>
-                    <w:t xml:space="preserve">Q14*</w:t>
+                    <w:t xml:space="preserve">Q13*</w:t>
                   </w:r>
                 </w:p>
               </w:tc>
@@ -18937,7 +18937,7 @@
                       <w:sz w:val="16"/>
                       <w:szCs w:val="16"/>
                     </w:rPr>
-                    <w:t xml:space="preserve">Q15</w:t>
+                    <w:t xml:space="preserve">Q14</w:t>
                   </w:r>
                 </w:p>
               </w:tc>
@@ -19118,7 +19118,7 @@
                       <w:sz w:val="16"/>
                       <w:szCs w:val="16"/>
                     </w:rPr>
-                    <w:t xml:space="preserve">Q16</w:t>
+                    <w:t xml:space="preserve">Q15</w:t>
                   </w:r>
                 </w:p>
               </w:tc>
@@ -19299,7 +19299,7 @@
                       <w:sz w:val="16"/>
                       <w:szCs w:val="16"/>
                     </w:rPr>
-                    <w:t xml:space="preserve">Q19</w:t>
+                    <w:t xml:space="preserve">Q17</w:t>
                   </w:r>
                 </w:p>
               </w:tc>
@@ -19480,7 +19480,7 @@
                       <w:sz w:val="16"/>
                       <w:szCs w:val="16"/>
                     </w:rPr>
-                    <w:t xml:space="preserve">Q20*</w:t>
+                    <w:t xml:space="preserve">Q18*</w:t>
                   </w:r>
                 </w:p>
               </w:tc>
@@ -19661,7 +19661,7 @@
                       <w:sz w:val="16"/>
                       <w:szCs w:val="16"/>
                     </w:rPr>
-                    <w:t xml:space="preserve">Q21</w:t>
+                    <w:t xml:space="preserve">Q19</w:t>
                   </w:r>
                 </w:p>
               </w:tc>
@@ -20083,7 +20083,7 @@
                       <w:sz w:val="16"/>
                       <w:szCs w:val="16"/>
                     </w:rPr>
-                    <w:t xml:space="preserve">Q22</w:t>
+                    <w:t xml:space="preserve">Q20</w:t>
                   </w:r>
                 </w:p>
               </w:tc>
@@ -21195,7 +21195,7 @@
                       <w:sz w:val="16"/>
                       <w:szCs w:val="16"/>
                     </w:rPr>
-                    <w:t xml:space="preserve">Q1</w:t>
+                    <w:t xml:space="preserve">Q5</w:t>
                   </w:r>
                 </w:p>
               </w:tc>
@@ -21306,7 +21306,7 @@
                       <w:sz w:val="16"/>
                       <w:szCs w:val="16"/>
                     </w:rPr>
-                    <w:t xml:space="preserve">Q6</w:t>
+                    <w:t xml:space="preserve">Q7</w:t>
                   </w:r>
                 </w:p>
               </w:tc>
@@ -21341,7 +21341,7 @@
                       <w:sz w:val="14"/>
                       <w:szCs w:val="14"/>
                     </w:rPr>
-                    <w:t xml:space="preserve">Letter</w:t>
+                    <w:t xml:space="preserve">Final answer</w:t>
                   </w:r>
                 </w:p>
               </w:tc>
@@ -21376,7 +21376,7 @@
                       <w:sz w:val="16"/>
                       <w:szCs w:val="16"/>
                     </w:rPr>
-                    <w:t xml:space="preserve">B</w:t>
+                    <w:t xml:space="preserve">Precision 174 / 268 = 0.65; recall 174 / 928 = 0.19; F1 = 2 x 174 / (2 x 174 + 94 + 754) = 348 / 1,196 = 0.29.</w:t>
                   </w:r>
                 </w:p>
               </w:tc>
@@ -21487,7 +21487,7 @@
                       <w:sz w:val="16"/>
                       <w:szCs w:val="16"/>
                     </w:rPr>
-                    <w:t xml:space="preserve">Precision 174 / 268 = 0.65; recall 174 / 928 = 0.19; F1 = 2 x 174 / (2 x 174 + 94 + 754) = 348 / 1,196 = 0.29.</w:t>
+                    <w:t xml:space="preserve">Call when p x 1,200 &gt; (1 - p) x 40, so p &gt; 40 / 1,240 = 1 / 31, about 0.032; the line moves down from 0.5 and recall leads.</w:t>
                   </w:r>
                 </w:p>
               </w:tc>
@@ -21528,7 +21528,7 @@
                       <w:sz w:val="16"/>
                       <w:szCs w:val="16"/>
                     </w:rPr>
-                    <w:t xml:space="preserve">Q9</w:t>
+                    <w:t xml:space="preserve">Q11</w:t>
                   </w:r>
                 </w:p>
               </w:tc>
@@ -21563,7 +21563,7 @@
                       <w:sz w:val="14"/>
                       <w:szCs w:val="14"/>
                     </w:rPr>
-                    <w:t xml:space="preserve">Final answer</w:t>
+                    <w:t xml:space="preserve">Letter</w:t>
                   </w:r>
                 </w:p>
               </w:tc>
@@ -21598,7 +21598,7 @@
                       <w:sz w:val="16"/>
                       <w:szCs w:val="16"/>
                     </w:rPr>
-                    <w:t xml:space="preserve">Call when p x 1,200 &gt; (1 - p) x 40, so p &gt; 40 / 1,240 = 1 / 31, about 0.032; the line moves down from 0.5 and recall leads.</w:t>
+                    <w:t xml:space="preserve">B</w:t>
                   </w:r>
                 </w:p>
               </w:tc>
@@ -21806,7 +21806,7 @@
                       <w:sz w:val="16"/>
                       <w:szCs w:val="16"/>
                     </w:rPr>
-                    <w:t xml:space="preserve">Q12</w:t>
+                    <w:t xml:space="preserve">Q16</w:t>
                   </w:r>
                 </w:p>
               </w:tc>
@@ -21917,7 +21917,7 @@
                       <w:sz w:val="16"/>
                       <w:szCs w:val="16"/>
                     </w:rPr>
-                    <w:t xml:space="preserve">Q17</w:t>
+                    <w:t xml:space="preserve">Q21</w:t>
                   </w:r>
                 </w:p>
               </w:tc>
@@ -22028,7 +22028,7 @@
                       <w:sz w:val="16"/>
                       <w:szCs w:val="16"/>
                     </w:rPr>
-                    <w:t xml:space="preserve">Q18</w:t>
+                    <w:t xml:space="preserve">Q22</w:t>
                   </w:r>
                 </w:p>
               </w:tc>

</xml_diff>

<commit_message>
W05 SAT: the blind sitting's fix pass
Two statements now read True, the memo boxes, Q10's precision and the top
1,000 row no longer answer other items, banks 4 and 5 fold into the items
that test them, Q13 and Q24 each take two steps, five options read one way
only, and the levels are relabelled by the exercise-builder bar: 24 items at
57 minutes, 3 easy, 14 medium and 7 hard. The sources file records each
finding and its change.

Co-Authored-By: Claude Opus 5.5 <noreply@anthropic.com>
Claude-Session: https://claude.ai/code/session_01TK2R2uaDnJSEF8EjfT4zg9
</commit_message>
<xml_diff>
--- a/content/W05/SAT/answer-key/C2_W05_SAT_answer_key_TRAINER.docx
+++ b/content/W05/SAT/answer-key/C2_W05_SAT_answer_key_TRAINER.docx
@@ -28,7 +28,7 @@
           <w:sz w:val="21"/>
           <w:szCs w:val="21"/>
         </w:rPr>
-        <w:t xml:space="preserve">TRAINER | Cohort 2 | Week 5 | Saturday 7 November 2026 | 60 minutes | 26 items</w:t>
+        <w:t xml:space="preserve">TRAINER | Cohort 2 | Week 5 | Saturday 7 November 2026 | 60 minutes | 24 items</w:t>
       </w:r>
     </w:p>
     <w:p>
@@ -129,7 +129,7 @@
           <w:sz w:val="21"/>
           <w:szCs w:val="21"/>
         </w:rPr>
-        <w:t xml:space="preserve">The marker writes each part's ticks in its box beside the learner's rating, and their total as Items right, out of 26, then hands the paper back, so each learner reads their rating against their score part by part.</w:t>
+        <w:t xml:space="preserve">The marker writes each part's ticks in its box beside the learner's rating, and their total as Items right, out of 24, then hands the paper back, so each learner reads their rating against their score part by part.</w:t>
       </w:r>
     </w:p>
     <w:p>
@@ -1052,7 +1052,7 @@
                 <w:sz w:val="18"/>
                 <w:szCs w:val="18"/>
               </w:rPr>
-              <w:t xml:space="preserve">1</w:t>
+              <w:t xml:space="preserve">4</w:t>
             </w:r>
           </w:p>
         </w:tc>
@@ -1088,7 +1088,7 @@
                 <w:sz w:val="18"/>
                 <w:szCs w:val="18"/>
               </w:rPr>
-              <w:t xml:space="preserve">4</w:t>
+              <w:t xml:space="preserve">1</w:t>
             </w:r>
           </w:p>
         </w:tc>
@@ -1343,7 +1343,7 @@
                 <w:sz w:val="18"/>
                 <w:szCs w:val="18"/>
               </w:rPr>
-              <w:t xml:space="preserve">1</w:t>
+              <w:t xml:space="preserve">3</w:t>
             </w:r>
           </w:p>
         </w:tc>
@@ -1379,7 +1379,7 @@
                 <w:sz w:val="18"/>
                 <w:szCs w:val="18"/>
               </w:rPr>
-              <w:t xml:space="preserve">3</w:t>
+              <w:t xml:space="preserve">1</w:t>
             </w:r>
           </w:p>
         </w:tc>
@@ -1490,7 +1490,7 @@
                 <w:sz w:val="18"/>
                 <w:szCs w:val="18"/>
               </w:rPr>
-              <w:t xml:space="preserve">Q17 to Q22 (6)</w:t>
+              <w:t xml:space="preserve">Q17 to Q20 (4)</w:t>
             </w:r>
           </w:p>
         </w:tc>
@@ -1562,7 +1562,7 @@
                 <w:sz w:val="18"/>
                 <w:szCs w:val="18"/>
               </w:rPr>
-              <w:t xml:space="preserve">12</w:t>
+              <w:t xml:space="preserve">10</w:t>
             </w:r>
           </w:p>
         </w:tc>
@@ -1598,7 +1598,7 @@
                 <w:sz w:val="18"/>
                 <w:szCs w:val="18"/>
               </w:rPr>
-              <w:t xml:space="preserve">1</w:t>
+              <w:t xml:space="preserve">0</w:t>
             </w:r>
           </w:p>
         </w:tc>
@@ -1670,7 +1670,7 @@
                 <w:sz w:val="18"/>
                 <w:szCs w:val="18"/>
               </w:rPr>
-              <w:t xml:space="preserve">3</w:t>
+              <w:t xml:space="preserve">2</w:t>
             </w:r>
           </w:p>
         </w:tc>
@@ -1781,7 +1781,7 @@
                 <w:sz w:val="18"/>
                 <w:szCs w:val="18"/>
               </w:rPr>
-              <w:t xml:space="preserve">Q23 to Q26 (4)</w:t>
+              <w:t xml:space="preserve">Q21 to Q24 (4)</w:t>
             </w:r>
           </w:p>
         </w:tc>
@@ -2074,7 +2074,7 @@
                 <w:sz w:val="18"/>
                 <w:szCs w:val="18"/>
               </w:rPr>
-              <w:t xml:space="preserve">26</w:t>
+              <w:t xml:space="preserve">24</w:t>
             </w:r>
           </w:p>
         </w:tc>
@@ -2146,7 +2146,7 @@
                 <w:sz w:val="18"/>
                 <w:szCs w:val="18"/>
               </w:rPr>
-              <w:t xml:space="preserve">59</w:t>
+              <w:t xml:space="preserve">57</w:t>
             </w:r>
           </w:p>
         </w:tc>
@@ -2182,7 +2182,7 @@
                 <w:sz w:val="18"/>
                 <w:szCs w:val="18"/>
               </w:rPr>
-              <w:t xml:space="preserve">4</w:t>
+              <w:t xml:space="preserve">3</w:t>
             </w:r>
           </w:p>
         </w:tc>
@@ -2218,7 +2218,7 @@
                 <w:sz w:val="18"/>
                 <w:szCs w:val="18"/>
               </w:rPr>
-              <w:t xml:space="preserve">9</w:t>
+              <w:t xml:space="preserve">14</w:t>
             </w:r>
           </w:p>
         </w:tc>
@@ -2254,7 +2254,7 @@
                 <w:sz w:val="18"/>
                 <w:szCs w:val="18"/>
               </w:rPr>
-              <w:t xml:space="preserve">13</w:t>
+              <w:t xml:space="preserve">7</w:t>
             </w:r>
           </w:p>
         </w:tc>
@@ -2289,7 +2289,7 @@
           <w:sz w:val="21"/>
           <w:szCs w:val="21"/>
         </w:rPr>
-        <w:t xml:space="preserve">A learner who guessed every item blind would average 5.0 of 26, since a written answer cannot be guessed from a list, and fewer than one guesser in twenty would reach 9. A score of 8 or below is therefore within reach of guessing alone, and the tally reads such a paper as a conversation to have on Monday, never as a result.</w:t>
+        <w:t xml:space="preserve">A learner who guessed every item blind would average 4.7 of 24, since a written answer cannot be guessed from a list, and fewer than one guesser in twenty would reach 9. A score of 8 or below is therefore within reach of guessing alone, and the tally reads such a paper as a conversation to have on Monday, never as a result.</w:t>
       </w:r>
     </w:p>
     <w:p>
@@ -3026,7 +3026,7 @@
                 <w:sz w:val="18"/>
                 <w:szCs w:val="18"/>
               </w:rPr>
-              <w:t xml:space="preserve">C</w:t>
+              <w:t xml:space="preserve">A</w:t>
             </w:r>
           </w:p>
         </w:tc>
@@ -4298,7 +4298,7 @@
                 <w:sz w:val="18"/>
                 <w:szCs w:val="18"/>
               </w:rPr>
-              <w:t xml:space="preserve">Hard</w:t>
+              <w:t xml:space="preserve">Medium</w:t>
             </w:r>
           </w:p>
         </w:tc>
@@ -4589,7 +4589,7 @@
                 <w:sz w:val="18"/>
                 <w:szCs w:val="18"/>
               </w:rPr>
-              <w:t xml:space="preserve">Hard</w:t>
+              <w:t xml:space="preserve">Medium</w:t>
             </w:r>
           </w:p>
         </w:tc>
@@ -4772,7 +4772,7 @@
                 <w:sz w:val="18"/>
                 <w:szCs w:val="18"/>
               </w:rPr>
-              <w:t xml:space="preserve">Call when p x 1,200 &gt; (1 - p) x 40, so p &gt; 40 / 1,240 = 1 / 31, about 0.032; the line moves down from 0.5 and recall leads.</w:t>
+              <w:t xml:space="preserve">Call when p x 1,200 &gt; (1 - p) x 40, so p &gt; 40 / 1,240 = 1 / 31, about 0.032 (1 in 30, 0.033, from one buyer paying for 30 calls, is accepted); the line moves down from 0.5 and recall leads.</w:t>
             </w:r>
           </w:p>
         </w:tc>
@@ -5171,7 +5171,7 @@
                 <w:sz w:val="18"/>
                 <w:szCs w:val="18"/>
               </w:rPr>
-              <w:t xml:space="preserve">Hard</w:t>
+              <w:t xml:space="preserve">Medium</w:t>
             </w:r>
           </w:p>
         </w:tc>
@@ -6044,7 +6044,7 @@
                 <w:sz w:val="18"/>
                 <w:szCs w:val="18"/>
               </w:rPr>
-              <w:t xml:space="preserve">Hard</w:t>
+              <w:t xml:space="preserve">Medium</w:t>
             </w:r>
           </w:p>
         </w:tc>
@@ -6227,7 +6227,7 @@
                 <w:sz w:val="18"/>
                 <w:szCs w:val="18"/>
               </w:rPr>
-              <w:t xml:space="preserve">B, C, D</w:t>
+              <w:t xml:space="preserve">B, C</w:t>
             </w:r>
           </w:p>
         </w:tc>
@@ -6917,7 +6917,7 @@
                 <w:sz w:val="18"/>
                 <w:szCs w:val="18"/>
               </w:rPr>
-              <w:t xml:space="preserve">Hard</w:t>
+              <w:t xml:space="preserve">Medium</w:t>
             </w:r>
           </w:p>
         </w:tc>
@@ -7499,7 +7499,7 @@
                 <w:sz w:val="18"/>
                 <w:szCs w:val="18"/>
               </w:rPr>
-              <w:t xml:space="preserve">Hard</w:t>
+              <w:t xml:space="preserve">Medium</w:t>
             </w:r>
           </w:p>
         </w:tc>
@@ -8264,7 +8264,7 @@
                 <w:sz w:val="18"/>
                 <w:szCs w:val="18"/>
               </w:rPr>
-              <w:t xml:space="preserve">C</w:t>
+              <w:t xml:space="preserve">B</w:t>
             </w:r>
           </w:p>
         </w:tc>
@@ -8555,7 +8555,7 @@
                 <w:sz w:val="18"/>
                 <w:szCs w:val="18"/>
               </w:rPr>
-              <w:t xml:space="preserve">A (overfitting)</w:t>
+              <w:t xml:space="preserve">A</w:t>
             </w:r>
           </w:p>
         </w:tc>
@@ -8591,7 +8591,7 @@
                 <w:sz w:val="18"/>
                 <w:szCs w:val="18"/>
               </w:rPr>
-              <w:t xml:space="preserve">Fill in the blank</w:t>
+              <w:t xml:space="preserve">One correct option</w:t>
             </w:r>
           </w:p>
         </w:tc>
@@ -8627,7 +8627,7 @@
                 <w:sz w:val="18"/>
                 <w:szCs w:val="18"/>
               </w:rPr>
-              <w:t xml:space="preserve">4</w:t>
+              <w:t xml:space="preserve">5</w:t>
             </w:r>
           </w:p>
         </w:tc>
@@ -8663,7 +8663,7 @@
                 <w:sz w:val="18"/>
                 <w:szCs w:val="18"/>
               </w:rPr>
-              <w:t xml:space="preserve">Easy</w:t>
+              <w:t xml:space="preserve">Hard</w:t>
             </w:r>
           </w:p>
         </w:tc>
@@ -8699,7 +8699,7 @@
                 <w:sz w:val="18"/>
                 <w:szCs w:val="18"/>
               </w:rPr>
-              <w:t xml:space="preserve">[S]</w:t>
+              <w:t xml:space="preserve">[F]</w:t>
             </w:r>
           </w:p>
         </w:tc>
@@ -8735,7 +8735,7 @@
                 <w:sz w:val="18"/>
                 <w:szCs w:val="18"/>
               </w:rPr>
-              <w:t xml:space="preserve">Thu</w:t>
+              <w:t xml:space="preserve">Fri</w:t>
             </w:r>
           </w:p>
         </w:tc>
@@ -8771,7 +8771,7 @@
                 <w:sz w:val="18"/>
                 <w:szCs w:val="18"/>
               </w:rPr>
-              <w:t xml:space="preserve">bank 4</w:t>
+              <w:t xml:space="preserve">new</w:t>
             </w:r>
           </w:p>
         </w:tc>
@@ -8846,7 +8846,7 @@
                 <w:sz w:val="18"/>
                 <w:szCs w:val="18"/>
               </w:rPr>
-              <w:t xml:space="preserve">D (split)</w:t>
+              <w:t xml:space="preserve">B, C</w:t>
             </w:r>
           </w:p>
         </w:tc>
@@ -8882,7 +8882,7 @@
                 <w:sz w:val="18"/>
                 <w:szCs w:val="18"/>
               </w:rPr>
-              <w:t xml:space="preserve">Fill in the blank</w:t>
+              <w:t xml:space="preserve">More than one correct</w:t>
             </w:r>
           </w:p>
         </w:tc>
@@ -8918,7 +8918,7 @@
                 <w:sz w:val="18"/>
                 <w:szCs w:val="18"/>
               </w:rPr>
-              <w:t xml:space="preserve">4</w:t>
+              <w:t xml:space="preserve">5</w:t>
             </w:r>
           </w:p>
         </w:tc>
@@ -8990,7 +8990,7 @@
                 <w:sz w:val="18"/>
                 <w:szCs w:val="18"/>
               </w:rPr>
-              <w:t xml:space="preserve">[F]</w:t>
+              <w:t xml:space="preserve">[D]</w:t>
             </w:r>
           </w:p>
         </w:tc>
@@ -9026,7 +9026,7 @@
                 <w:sz w:val="18"/>
                 <w:szCs w:val="18"/>
               </w:rPr>
-              <w:t xml:space="preserve">Thu</w:t>
+              <w:t xml:space="preserve">Fri</w:t>
             </w:r>
           </w:p>
         </w:tc>
@@ -9062,7 +9062,7 @@
                 <w:sz w:val="18"/>
                 <w:szCs w:val="18"/>
               </w:rPr>
-              <w:t xml:space="preserve">bank 5</w:t>
+              <w:t xml:space="preserve">new</w:t>
             </w:r>
           </w:p>
         </w:tc>
@@ -9137,7 +9137,7 @@
                 <w:sz w:val="18"/>
                 <w:szCs w:val="18"/>
               </w:rPr>
-              <w:t xml:space="preserve">A</w:t>
+              <w:t xml:space="preserve">C</w:t>
             </w:r>
           </w:p>
         </w:tc>
@@ -9245,7 +9245,7 @@
                 <w:sz w:val="18"/>
                 <w:szCs w:val="18"/>
               </w:rPr>
-              <w:t xml:space="preserve">Hard</w:t>
+              <w:t xml:space="preserve">Medium</w:t>
             </w:r>
           </w:p>
         </w:tc>
@@ -9281,7 +9281,7 @@
                 <w:sz w:val="18"/>
                 <w:szCs w:val="18"/>
               </w:rPr>
-              <w:t xml:space="preserve">[F]</w:t>
+              <w:t xml:space="preserve">[D]</w:t>
             </w:r>
           </w:p>
         </w:tc>
@@ -9428,589 +9428,7 @@
                 <w:sz w:val="18"/>
                 <w:szCs w:val="18"/>
               </w:rPr>
-              <w:t xml:space="preserve">B, C</w:t>
-            </w:r>
-          </w:p>
-        </w:tc>
-        <w:tc>
-          <w:tcPr>
-            <w:tcW w:type="dxa" w:w="2100"/>
-            <w:tcBorders>
-              <w:top w:val="single" w:color="D5D0C4" w:sz="4"/>
-              <w:left w:val="single" w:color="D5D0C4" w:sz="4"/>
-              <w:bottom w:val="single" w:color="D5D0C4" w:sz="4"/>
-              <w:right w:val="single" w:color="D5D0C4" w:sz="4"/>
-            </w:tcBorders>
-            <w:tcMar>
-              <w:top w:type="dxa" w:w="40"/>
-              <w:left w:type="dxa" w:w="100"/>
-              <w:bottom w:type="dxa" w:w="40"/>
-              <w:right w:type="dxa" w:w="100"/>
-            </w:tcMar>
-            <w:vAlign w:val="center"/>
-          </w:tcPr>
-          <w:p>
-            <w:pPr>
-              <w:keepNext w:val="false"/>
-              <w:spacing w:after="0" w:line="252"/>
-              <w:jc w:val="left"/>
-            </w:pPr>
-            <w:r>
-              <w:rPr>
-                <w:rFonts w:ascii="Arial" w:cs="Arial" w:eastAsia="Arial" w:hAnsi="Arial"/>
-                <w:b w:val="false"/>
-                <w:bCs w:val="false"/>
-                <w:color w:val="1C1B16"/>
-                <w:sz w:val="18"/>
-                <w:szCs w:val="18"/>
-              </w:rPr>
-              <w:t xml:space="preserve">More than one correct</w:t>
-            </w:r>
-          </w:p>
-        </w:tc>
-        <w:tc>
-          <w:tcPr>
-            <w:tcW w:type="dxa" w:w="600"/>
-            <w:tcBorders>
-              <w:top w:val="single" w:color="D5D0C4" w:sz="4"/>
-              <w:left w:val="single" w:color="D5D0C4" w:sz="4"/>
-              <w:bottom w:val="single" w:color="D5D0C4" w:sz="4"/>
-              <w:right w:val="single" w:color="D5D0C4" w:sz="4"/>
-            </w:tcBorders>
-            <w:tcMar>
-              <w:top w:type="dxa" w:w="40"/>
-              <w:left w:type="dxa" w:w="100"/>
-              <w:bottom w:type="dxa" w:w="40"/>
-              <w:right w:type="dxa" w:w="100"/>
-            </w:tcMar>
-            <w:vAlign w:val="center"/>
-          </w:tcPr>
-          <w:p>
-            <w:pPr>
-              <w:keepNext w:val="false"/>
-              <w:spacing w:after="0" w:line="252"/>
-              <w:jc w:val="center"/>
-            </w:pPr>
-            <w:r>
-              <w:rPr>
-                <w:rFonts w:ascii="Arial" w:cs="Arial" w:eastAsia="Arial" w:hAnsi="Arial"/>
-                <w:b w:val="false"/>
-                <w:bCs w:val="false"/>
-                <w:color w:val="1C1B16"/>
-                <w:sz w:val="18"/>
-                <w:szCs w:val="18"/>
-              </w:rPr>
-              <w:t xml:space="preserve">5</w:t>
-            </w:r>
-          </w:p>
-        </w:tc>
-        <w:tc>
-          <w:tcPr>
-            <w:tcW w:type="dxa" w:w="900"/>
-            <w:tcBorders>
-              <w:top w:val="single" w:color="D5D0C4" w:sz="4"/>
-              <w:left w:val="single" w:color="D5D0C4" w:sz="4"/>
-              <w:bottom w:val="single" w:color="D5D0C4" w:sz="4"/>
-              <w:right w:val="single" w:color="D5D0C4" w:sz="4"/>
-            </w:tcBorders>
-            <w:tcMar>
-              <w:top w:type="dxa" w:w="40"/>
-              <w:left w:type="dxa" w:w="100"/>
-              <w:bottom w:type="dxa" w:w="40"/>
-              <w:right w:type="dxa" w:w="100"/>
-            </w:tcMar>
-            <w:vAlign w:val="center"/>
-          </w:tcPr>
-          <w:p>
-            <w:pPr>
-              <w:keepNext w:val="false"/>
-              <w:spacing w:after="0" w:line="252"/>
-              <w:jc w:val="left"/>
-            </w:pPr>
-            <w:r>
-              <w:rPr>
-                <w:rFonts w:ascii="Arial" w:cs="Arial" w:eastAsia="Arial" w:hAnsi="Arial"/>
-                <w:b w:val="false"/>
-                <w:bCs w:val="false"/>
-                <w:color w:val="1C1B16"/>
-                <w:sz w:val="18"/>
-                <w:szCs w:val="18"/>
-              </w:rPr>
-              <w:t xml:space="preserve">Medium</w:t>
-            </w:r>
-          </w:p>
-        </w:tc>
-        <w:tc>
-          <w:tcPr>
-            <w:tcW w:type="dxa" w:w="700"/>
-            <w:tcBorders>
-              <w:top w:val="single" w:color="D5D0C4" w:sz="4"/>
-              <w:left w:val="single" w:color="D5D0C4" w:sz="4"/>
-              <w:bottom w:val="single" w:color="D5D0C4" w:sz="4"/>
-              <w:right w:val="single" w:color="D5D0C4" w:sz="4"/>
-            </w:tcBorders>
-            <w:tcMar>
-              <w:top w:type="dxa" w:w="40"/>
-              <w:left w:type="dxa" w:w="100"/>
-              <w:bottom w:type="dxa" w:w="40"/>
-              <w:right w:type="dxa" w:w="100"/>
-            </w:tcMar>
-            <w:vAlign w:val="center"/>
-          </w:tcPr>
-          <w:p>
-            <w:pPr>
-              <w:keepNext w:val="false"/>
-              <w:spacing w:after="0" w:line="252"/>
-              <w:jc w:val="center"/>
-            </w:pPr>
-            <w:r>
-              <w:rPr>
-                <w:rFonts w:ascii="Arial" w:cs="Arial" w:eastAsia="Arial" w:hAnsi="Arial"/>
-                <w:b w:val="false"/>
-                <w:bCs w:val="false"/>
-                <w:color w:val="1C1B16"/>
-                <w:sz w:val="18"/>
-                <w:szCs w:val="18"/>
-              </w:rPr>
-              <w:t xml:space="preserve">[D]</w:t>
-            </w:r>
-          </w:p>
-        </w:tc>
-        <w:tc>
-          <w:tcPr>
-            <w:tcW w:type="dxa" w:w="700"/>
-            <w:tcBorders>
-              <w:top w:val="single" w:color="D5D0C4" w:sz="4"/>
-              <w:left w:val="single" w:color="D5D0C4" w:sz="4"/>
-              <w:bottom w:val="single" w:color="D5D0C4" w:sz="4"/>
-              <w:right w:val="single" w:color="D5D0C4" w:sz="4"/>
-            </w:tcBorders>
-            <w:tcMar>
-              <w:top w:type="dxa" w:w="40"/>
-              <w:left w:type="dxa" w:w="100"/>
-              <w:bottom w:type="dxa" w:w="40"/>
-              <w:right w:type="dxa" w:w="100"/>
-            </w:tcMar>
-            <w:vAlign w:val="center"/>
-          </w:tcPr>
-          <w:p>
-            <w:pPr>
-              <w:keepNext w:val="false"/>
-              <w:spacing w:after="0" w:line="252"/>
-              <w:jc w:val="center"/>
-            </w:pPr>
-            <w:r>
-              <w:rPr>
-                <w:rFonts w:ascii="Arial" w:cs="Arial" w:eastAsia="Arial" w:hAnsi="Arial"/>
-                <w:b w:val="false"/>
-                <w:bCs w:val="false"/>
-                <w:color w:val="1C1B16"/>
-                <w:sz w:val="18"/>
-                <w:szCs w:val="18"/>
-              </w:rPr>
-              <w:t xml:space="preserve">Fri</w:t>
-            </w:r>
-          </w:p>
-        </w:tc>
-        <w:tc>
-          <w:tcPr>
-            <w:tcW w:type="dxa" w:w="2340"/>
-            <w:tcBorders>
-              <w:top w:val="single" w:color="D5D0C4" w:sz="4"/>
-              <w:left w:val="single" w:color="D5D0C4" w:sz="4"/>
-              <w:bottom w:val="single" w:color="D5D0C4" w:sz="4"/>
-              <w:right w:val="single" w:color="D5D0C4" w:sz="4"/>
-            </w:tcBorders>
-            <w:tcMar>
-              <w:top w:type="dxa" w:w="40"/>
-              <w:left w:type="dxa" w:w="100"/>
-              <w:bottom w:type="dxa" w:w="40"/>
-              <w:right w:type="dxa" w:w="100"/>
-            </w:tcMar>
-            <w:vAlign w:val="center"/>
-          </w:tcPr>
-          <w:p>
-            <w:pPr>
-              <w:keepNext w:val="false"/>
-              <w:spacing w:after="0" w:line="252"/>
-              <w:jc w:val="left"/>
-            </w:pPr>
-            <w:r>
-              <w:rPr>
-                <w:rFonts w:ascii="Arial" w:cs="Arial" w:eastAsia="Arial" w:hAnsi="Arial"/>
-                <w:b w:val="false"/>
-                <w:bCs w:val="false"/>
-                <w:color w:val="1C1B16"/>
-                <w:sz w:val="18"/>
-                <w:szCs w:val="18"/>
-              </w:rPr>
-              <w:t xml:space="preserve">new</w:t>
-            </w:r>
-          </w:p>
-        </w:tc>
-      </w:tr>
-      <w:tr>
-        <w:trPr>
-          <w:cantSplit/>
-        </w:trPr>
-        <w:tc>
-          <w:tcPr>
-            <w:tcW w:type="dxa" w:w="560"/>
-            <w:tcBorders>
-              <w:top w:val="single" w:color="D5D0C4" w:sz="4"/>
-              <w:left w:val="single" w:color="D5D0C4" w:sz="4"/>
-              <w:bottom w:val="single" w:color="D5D0C4" w:sz="4"/>
-              <w:right w:val="single" w:color="D5D0C4" w:sz="4"/>
-            </w:tcBorders>
-            <w:tcMar>
-              <w:top w:type="dxa" w:w="40"/>
-              <w:left w:type="dxa" w:w="100"/>
-              <w:bottom w:type="dxa" w:w="40"/>
-              <w:right w:type="dxa" w:w="100"/>
-            </w:tcMar>
-            <w:vAlign w:val="center"/>
-          </w:tcPr>
-          <w:p>
-            <w:pPr>
-              <w:keepNext w:val="false"/>
-              <w:spacing w:after="0" w:line="252"/>
-              <w:jc w:val="center"/>
-            </w:pPr>
-            <w:r>
-              <w:rPr>
-                <w:rFonts w:ascii="Arial" w:cs="Arial" w:eastAsia="Arial" w:hAnsi="Arial"/>
-                <w:color w:val="1C1B16"/>
-                <w:sz w:val="18"/>
-                <w:szCs w:val="18"/>
-              </w:rPr>
-              <w:t xml:space="preserve">25</w:t>
-            </w:r>
-          </w:p>
-        </w:tc>
-        <w:tc>
-          <w:tcPr>
-            <w:tcW w:type="dxa" w:w="1900"/>
-            <w:tcBorders>
-              <w:top w:val="single" w:color="D5D0C4" w:sz="4"/>
-              <w:left w:val="single" w:color="D5D0C4" w:sz="4"/>
-              <w:bottom w:val="single" w:color="D5D0C4" w:sz="4"/>
-              <w:right w:val="single" w:color="D5D0C4" w:sz="4"/>
-            </w:tcBorders>
-            <w:tcMar>
-              <w:top w:type="dxa" w:w="40"/>
-              <w:left w:type="dxa" w:w="100"/>
-              <w:bottom w:type="dxa" w:w="40"/>
-              <w:right w:type="dxa" w:w="100"/>
-            </w:tcMar>
-            <w:vAlign w:val="center"/>
-          </w:tcPr>
-          <w:p>
-            <w:pPr>
-              <w:keepNext w:val="false"/>
-              <w:spacing w:after="0" w:line="252"/>
-              <w:jc w:val="left"/>
-            </w:pPr>
-            <w:r>
-              <w:rPr>
-                <w:rFonts w:ascii="Arial" w:cs="Arial" w:eastAsia="Arial" w:hAnsi="Arial"/>
-                <w:b w:val="false"/>
-                <w:bCs w:val="false"/>
-                <w:color w:val="1C1B16"/>
-                <w:sz w:val="18"/>
-                <w:szCs w:val="18"/>
-              </w:rPr>
-              <w:t xml:space="preserve">A</w:t>
-            </w:r>
-          </w:p>
-        </w:tc>
-        <w:tc>
-          <w:tcPr>
-            <w:tcW w:type="dxa" w:w="2100"/>
-            <w:tcBorders>
-              <w:top w:val="single" w:color="D5D0C4" w:sz="4"/>
-              <w:left w:val="single" w:color="D5D0C4" w:sz="4"/>
-              <w:bottom w:val="single" w:color="D5D0C4" w:sz="4"/>
-              <w:right w:val="single" w:color="D5D0C4" w:sz="4"/>
-            </w:tcBorders>
-            <w:tcMar>
-              <w:top w:type="dxa" w:w="40"/>
-              <w:left w:type="dxa" w:w="100"/>
-              <w:bottom w:type="dxa" w:w="40"/>
-              <w:right w:type="dxa" w:w="100"/>
-            </w:tcMar>
-            <w:vAlign w:val="center"/>
-          </w:tcPr>
-          <w:p>
-            <w:pPr>
-              <w:keepNext w:val="false"/>
-              <w:spacing w:after="0" w:line="252"/>
-              <w:jc w:val="left"/>
-            </w:pPr>
-            <w:r>
-              <w:rPr>
-                <w:rFonts w:ascii="Arial" w:cs="Arial" w:eastAsia="Arial" w:hAnsi="Arial"/>
-                <w:b w:val="false"/>
-                <w:bCs w:val="false"/>
-                <w:color w:val="1C1B16"/>
-                <w:sz w:val="18"/>
-                <w:szCs w:val="18"/>
-              </w:rPr>
-              <w:t xml:space="preserve">One correct option</w:t>
-            </w:r>
-          </w:p>
-        </w:tc>
-        <w:tc>
-          <w:tcPr>
-            <w:tcW w:type="dxa" w:w="600"/>
-            <w:tcBorders>
-              <w:top w:val="single" w:color="D5D0C4" w:sz="4"/>
-              <w:left w:val="single" w:color="D5D0C4" w:sz="4"/>
-              <w:bottom w:val="single" w:color="D5D0C4" w:sz="4"/>
-              <w:right w:val="single" w:color="D5D0C4" w:sz="4"/>
-            </w:tcBorders>
-            <w:tcMar>
-              <w:top w:type="dxa" w:w="40"/>
-              <w:left w:type="dxa" w:w="100"/>
-              <w:bottom w:type="dxa" w:w="40"/>
-              <w:right w:type="dxa" w:w="100"/>
-            </w:tcMar>
-            <w:vAlign w:val="center"/>
-          </w:tcPr>
-          <w:p>
-            <w:pPr>
-              <w:keepNext w:val="false"/>
-              <w:spacing w:after="0" w:line="252"/>
-              <w:jc w:val="center"/>
-            </w:pPr>
-            <w:r>
-              <w:rPr>
-                <w:rFonts w:ascii="Arial" w:cs="Arial" w:eastAsia="Arial" w:hAnsi="Arial"/>
-                <w:b w:val="false"/>
-                <w:bCs w:val="false"/>
-                <w:color w:val="1C1B16"/>
-                <w:sz w:val="18"/>
-                <w:szCs w:val="18"/>
-              </w:rPr>
-              <w:t xml:space="preserve">5</w:t>
-            </w:r>
-          </w:p>
-        </w:tc>
-        <w:tc>
-          <w:tcPr>
-            <w:tcW w:type="dxa" w:w="900"/>
-            <w:tcBorders>
-              <w:top w:val="single" w:color="D5D0C4" w:sz="4"/>
-              <w:left w:val="single" w:color="D5D0C4" w:sz="4"/>
-              <w:bottom w:val="single" w:color="D5D0C4" w:sz="4"/>
-              <w:right w:val="single" w:color="D5D0C4" w:sz="4"/>
-            </w:tcBorders>
-            <w:tcMar>
-              <w:top w:type="dxa" w:w="40"/>
-              <w:left w:type="dxa" w:w="100"/>
-              <w:bottom w:type="dxa" w:w="40"/>
-              <w:right w:type="dxa" w:w="100"/>
-            </w:tcMar>
-            <w:vAlign w:val="center"/>
-          </w:tcPr>
-          <w:p>
-            <w:pPr>
-              <w:keepNext w:val="false"/>
-              <w:spacing w:after="0" w:line="252"/>
-              <w:jc w:val="left"/>
-            </w:pPr>
-            <w:r>
-              <w:rPr>
-                <w:rFonts w:ascii="Arial" w:cs="Arial" w:eastAsia="Arial" w:hAnsi="Arial"/>
-                <w:b w:val="false"/>
-                <w:bCs w:val="false"/>
-                <w:color w:val="1C1B16"/>
-                <w:sz w:val="18"/>
-                <w:szCs w:val="18"/>
-              </w:rPr>
-              <w:t xml:space="preserve">Medium</w:t>
-            </w:r>
-          </w:p>
-        </w:tc>
-        <w:tc>
-          <w:tcPr>
-            <w:tcW w:type="dxa" w:w="700"/>
-            <w:tcBorders>
-              <w:top w:val="single" w:color="D5D0C4" w:sz="4"/>
-              <w:left w:val="single" w:color="D5D0C4" w:sz="4"/>
-              <w:bottom w:val="single" w:color="D5D0C4" w:sz="4"/>
-              <w:right w:val="single" w:color="D5D0C4" w:sz="4"/>
-            </w:tcBorders>
-            <w:tcMar>
-              <w:top w:type="dxa" w:w="40"/>
-              <w:left w:type="dxa" w:w="100"/>
-              <w:bottom w:type="dxa" w:w="40"/>
-              <w:right w:type="dxa" w:w="100"/>
-            </w:tcMar>
-            <w:vAlign w:val="center"/>
-          </w:tcPr>
-          <w:p>
-            <w:pPr>
-              <w:keepNext w:val="false"/>
-              <w:spacing w:after="0" w:line="252"/>
-              <w:jc w:val="center"/>
-            </w:pPr>
-            <w:r>
-              <w:rPr>
-                <w:rFonts w:ascii="Arial" w:cs="Arial" w:eastAsia="Arial" w:hAnsi="Arial"/>
-                <w:b w:val="false"/>
-                <w:bCs w:val="false"/>
-                <w:color w:val="1C1B16"/>
-                <w:sz w:val="18"/>
-                <w:szCs w:val="18"/>
-              </w:rPr>
-              <w:t xml:space="preserve">[D]</w:t>
-            </w:r>
-          </w:p>
-        </w:tc>
-        <w:tc>
-          <w:tcPr>
-            <w:tcW w:type="dxa" w:w="700"/>
-            <w:tcBorders>
-              <w:top w:val="single" w:color="D5D0C4" w:sz="4"/>
-              <w:left w:val="single" w:color="D5D0C4" w:sz="4"/>
-              <w:bottom w:val="single" w:color="D5D0C4" w:sz="4"/>
-              <w:right w:val="single" w:color="D5D0C4" w:sz="4"/>
-            </w:tcBorders>
-            <w:tcMar>
-              <w:top w:type="dxa" w:w="40"/>
-              <w:left w:type="dxa" w:w="100"/>
-              <w:bottom w:type="dxa" w:w="40"/>
-              <w:right w:type="dxa" w:w="100"/>
-            </w:tcMar>
-            <w:vAlign w:val="center"/>
-          </w:tcPr>
-          <w:p>
-            <w:pPr>
-              <w:keepNext w:val="false"/>
-              <w:spacing w:after="0" w:line="252"/>
-              <w:jc w:val="center"/>
-            </w:pPr>
-            <w:r>
-              <w:rPr>
-                <w:rFonts w:ascii="Arial" w:cs="Arial" w:eastAsia="Arial" w:hAnsi="Arial"/>
-                <w:b w:val="false"/>
-                <w:bCs w:val="false"/>
-                <w:color w:val="1C1B16"/>
-                <w:sz w:val="18"/>
-                <w:szCs w:val="18"/>
-              </w:rPr>
-              <w:t xml:space="preserve">Fri</w:t>
-            </w:r>
-          </w:p>
-        </w:tc>
-        <w:tc>
-          <w:tcPr>
-            <w:tcW w:type="dxa" w:w="2340"/>
-            <w:tcBorders>
-              <w:top w:val="single" w:color="D5D0C4" w:sz="4"/>
-              <w:left w:val="single" w:color="D5D0C4" w:sz="4"/>
-              <w:bottom w:val="single" w:color="D5D0C4" w:sz="4"/>
-              <w:right w:val="single" w:color="D5D0C4" w:sz="4"/>
-            </w:tcBorders>
-            <w:tcMar>
-              <w:top w:type="dxa" w:w="40"/>
-              <w:left w:type="dxa" w:w="100"/>
-              <w:bottom w:type="dxa" w:w="40"/>
-              <w:right w:type="dxa" w:w="100"/>
-            </w:tcMar>
-            <w:vAlign w:val="center"/>
-          </w:tcPr>
-          <w:p>
-            <w:pPr>
-              <w:keepNext w:val="false"/>
-              <w:spacing w:after="0" w:line="252"/>
-              <w:jc w:val="left"/>
-            </w:pPr>
-            <w:r>
-              <w:rPr>
-                <w:rFonts w:ascii="Arial" w:cs="Arial" w:eastAsia="Arial" w:hAnsi="Arial"/>
-                <w:b w:val="false"/>
-                <w:bCs w:val="false"/>
-                <w:color w:val="1C1B16"/>
-                <w:sz w:val="18"/>
-                <w:szCs w:val="18"/>
-              </w:rPr>
-              <w:t xml:space="preserve">new</w:t>
-            </w:r>
-          </w:p>
-        </w:tc>
-      </w:tr>
-      <w:tr>
-        <w:trPr>
-          <w:cantSplit/>
-        </w:trPr>
-        <w:tc>
-          <w:tcPr>
-            <w:tcW w:type="dxa" w:w="560"/>
-            <w:tcBorders>
-              <w:top w:val="single" w:color="D5D0C4" w:sz="4"/>
-              <w:left w:val="single" w:color="D5D0C4" w:sz="4"/>
-              <w:bottom w:val="single" w:color="D5D0C4" w:sz="4"/>
-              <w:right w:val="single" w:color="D5D0C4" w:sz="4"/>
-            </w:tcBorders>
-            <w:tcMar>
-              <w:top w:type="dxa" w:w="40"/>
-              <w:left w:type="dxa" w:w="100"/>
-              <w:bottom w:type="dxa" w:w="40"/>
-              <w:right w:type="dxa" w:w="100"/>
-            </w:tcMar>
-            <w:vAlign w:val="center"/>
-          </w:tcPr>
-          <w:p>
-            <w:pPr>
-              <w:keepNext w:val="false"/>
-              <w:spacing w:after="0" w:line="252"/>
-              <w:jc w:val="center"/>
-            </w:pPr>
-            <w:r>
-              <w:rPr>
-                <w:rFonts w:ascii="Arial" w:cs="Arial" w:eastAsia="Arial" w:hAnsi="Arial"/>
-                <w:color w:val="1C1B16"/>
-                <w:sz w:val="18"/>
-                <w:szCs w:val="18"/>
-              </w:rPr>
-              <w:t xml:space="preserve">26</w:t>
-            </w:r>
-          </w:p>
-        </w:tc>
-        <w:tc>
-          <w:tcPr>
-            <w:tcW w:type="dxa" w:w="1900"/>
-            <w:tcBorders>
-              <w:top w:val="single" w:color="D5D0C4" w:sz="4"/>
-              <w:left w:val="single" w:color="D5D0C4" w:sz="4"/>
-              <w:bottom w:val="single" w:color="D5D0C4" w:sz="4"/>
-              <w:right w:val="single" w:color="D5D0C4" w:sz="4"/>
-            </w:tcBorders>
-            <w:tcMar>
-              <w:top w:type="dxa" w:w="40"/>
-              <w:left w:type="dxa" w:w="100"/>
-              <w:bottom w:type="dxa" w:w="40"/>
-              <w:right w:type="dxa" w:w="100"/>
-            </w:tcMar>
-            <w:vAlign w:val="center"/>
-          </w:tcPr>
-          <w:p>
-            <w:pPr>
-              <w:keepNext w:val="false"/>
-              <w:spacing w:after="0" w:line="252"/>
-              <w:jc w:val="left"/>
-            </w:pPr>
-            <w:r>
-              <w:rPr>
-                <w:rFonts w:ascii="Arial" w:cs="Arial" w:eastAsia="Arial" w:hAnsi="Arial"/>
-                <w:b w:val="false"/>
-                <w:bCs w:val="false"/>
-                <w:color w:val="1C1B16"/>
-                <w:sz w:val="18"/>
-                <w:szCs w:val="18"/>
-              </w:rPr>
-              <w:t xml:space="preserve">D</w:t>
+              <w:t xml:space="preserve">B</w:t>
             </w:r>
           </w:p>
         </w:tc>
@@ -10539,7 +9957,7 @@
                 <w:sz w:val="21"/>
                 <w:szCs w:val="21"/>
               </w:rPr>
-              <w:t xml:space="preserve">   Key C</w:t>
+              <w:t xml:space="preserve">   Key A</w:t>
             </w:r>
             <w:r>
               <w:rPr>
@@ -10592,7 +10010,7 @@
                 <w:sz w:val="20"/>
                 <w:szCs w:val="20"/>
               </w:rPr>
-              <w:t xml:space="preserve">A.  </w:t>
+              <w:t xml:space="preserve">B.  </w:t>
             </w:r>
             <w:r>
               <w:rPr>
@@ -10601,7 +10019,7 @@
                 <w:sz w:val="20"/>
                 <w:szCs w:val="20"/>
               </w:rPr>
-              <w:t xml:space="preserve">Stratifying keeps the yes share equal, and it says nothing about mixing months, which is what lets the random split flatter the model.</w:t>
+              <w:t xml:space="preserve">The split by date wins on timing, not on the count of yes rows; validation already holds 928 yes rows under the random split.</w:t>
             </w:r>
           </w:p>
           <w:p>
@@ -10619,7 +10037,7 @@
                 <w:sz w:val="20"/>
                 <w:szCs w:val="20"/>
               </w:rPr>
-              <w:t xml:space="preserve">B.  </w:t>
+              <w:t xml:space="preserve">C.  </w:t>
             </w:r>
             <w:r>
               <w:rPr>
@@ -10628,7 +10046,7 @@
                 <w:sz w:val="20"/>
                 <w:szCs w:val="20"/>
               </w:rPr>
-              <w:t xml:space="preserve">The month and the five economic indicators each mark the period a call was made in, so the model reads time without a date column.</w:t>
+              <w:t xml:space="preserve">Stratifying keeps the yes share equal, and it says nothing about mixing months, which is what lets the random split flatter the model.</w:t>
             </w:r>
           </w:p>
           <w:p>
@@ -10655,7 +10073,7 @@
                 <w:sz w:val="20"/>
                 <w:szCs w:val="20"/>
               </w:rPr>
-              <w:t xml:space="preserve">Validation holds 928 yes rows under the random split; the problem is which months they come from, never how many there are.</w:t>
+              <w:t xml:space="preserve">The month and the five economic indicators each mark the period a call was made in, so the model reads time without a date column.</w:t>
             </w:r>
           </w:p>
           <w:p>
@@ -11356,7 +10774,7 @@
                 <w:sz w:val="18"/>
                 <w:szCs w:val="18"/>
               </w:rPr>
-              <w:t xml:space="preserve">   True or false, Hard, [F], Tue</w:t>
+              <w:t xml:space="preserve">   True or false, Medium, [F], Tue</w:t>
             </w:r>
           </w:p>
           <w:p>
@@ -11585,7 +11003,7 @@
                 <w:sz w:val="18"/>
                 <w:szCs w:val="18"/>
               </w:rPr>
-              <w:t xml:space="preserve">   Applied maths, Hard, [S], Tue</w:t>
+              <w:t xml:space="preserve">   Applied maths, Medium, [S], Tue</w:t>
             </w:r>
           </w:p>
           <w:p>
@@ -11724,7 +11142,7 @@
                 <w:sz w:val="21"/>
                 <w:szCs w:val="21"/>
               </w:rPr>
-              <w:t xml:space="preserve">   Key Call when p x 1,200 &gt; (1 - p) x 40, so p &gt; 40 / 1,240 = 1 / 31, about 0.032; the line moves down from 0.5 and recall leads.</w:t>
+              <w:t xml:space="preserve">   Key Call when p x 1,200 &gt; (1 - p) x 40, so p &gt; 40 / 1,240 = 1 / 31, about 0.032 (1 in 30, 0.033, from one buyer paying for 30 calls, is accepted); the line moves down from 0.5 and recall leads.</w:t>
             </w:r>
             <w:r>
               <w:rPr>
@@ -11881,7 +11299,7 @@
                 <w:sz w:val="18"/>
                 <w:szCs w:val="18"/>
               </w:rPr>
-              <w:t xml:space="preserve">   One correct option, Hard, [S], Tue</w:t>
+              <w:t xml:space="preserve">   One correct option, Medium, [S], Tue</w:t>
             </w:r>
           </w:p>
           <w:p>
@@ -12487,7 +11905,7 @@
                 <w:sz w:val="18"/>
                 <w:szCs w:val="18"/>
               </w:rPr>
-              <w:t xml:space="preserve">   One correct option, Hard, [S], Wed</w:t>
+              <w:t xml:space="preserve">   One correct option, Medium, [S], Wed</w:t>
             </w:r>
           </w:p>
           <w:p>
@@ -12707,7 +12125,7 @@
                 <w:sz w:val="21"/>
                 <w:szCs w:val="21"/>
               </w:rPr>
-              <w:t xml:space="preserve">   Key B, C, D</w:t>
+              <w:t xml:space="preserve">   Key B, C</w:t>
             </w:r>
             <w:r>
               <w:rPr>
@@ -12742,7 +12160,7 @@
                 <w:sz w:val="21"/>
                 <w:szCs w:val="21"/>
               </w:rPr>
-              <w:t xml:space="preserve">A column passes when its value exists at the prediction moment. Age, job and housing, the previous campaign's result and the rate published that morning all exist before any call. The previous result is strongly predictive, 65 percent yes among past successes, and still legitimate, because it was recorded before this campaign began, so it passes the timing test however strong it is. Duration exists only after this campaign's call. Wednesday's chapter interrogated every column with this one question.</w:t>
+              <w:t xml:space="preserve">A column passes when its value exists at the prediction moment. Age, job and housing and the previous campaign's result exist before any call. The previous result is strongly predictive, 65 percent yes among past successes, and still legitimate, because it was recorded before this campaign began, so it passes the timing test however strong it is. Duration exists only after this campaign's call, and a quarterly indicator for the current quarter, filled in once the quarter closes, does not exist on the morning the list is built: a published indicator can leak when its period has not ended, which is the calendar leak Wednesday named beside duration. Wednesday's chapter interrogated every column with this one question.</w:t>
             </w:r>
           </w:p>
           <w:p>
@@ -12775,7 +12193,8 @@
           <w:p>
             <w:pPr>
               <w:keepNext/>
-              <w:spacing w:after="40" w:before="60" w:line="276"/>
+              <w:spacing w:after="40" w:line="264"/>
+              <w:ind w:left="360" w:hanging="360"/>
             </w:pPr>
             <w:r>
               <w:rPr>
@@ -12783,6 +12202,32 @@
                 <w:b/>
                 <w:bCs/>
                 <w:color w:val="1C1B16"/>
+                <w:sz w:val="20"/>
+                <w:szCs w:val="20"/>
+              </w:rPr>
+              <w:t xml:space="preserve">D.  </w:t>
+            </w:r>
+            <w:r>
+              <w:rPr>
+                <w:rFonts w:ascii="Arial" w:cs="Arial" w:eastAsia="Arial" w:hAnsi="Arial"/>
+                <w:color w:val="1C1B16"/>
+                <w:sz w:val="20"/>
+                <w:szCs w:val="20"/>
+              </w:rPr>
+              <w:t xml:space="preserve">The current quarter has not closed on the morning of the list, so its count is from the future; last quarter's published count would pass.</w:t>
+            </w:r>
+          </w:p>
+          <w:p>
+            <w:pPr>
+              <w:keepNext/>
+              <w:spacing w:after="40" w:before="60" w:line="276"/>
+            </w:pPr>
+            <w:r>
+              <w:rPr>
+                <w:rFonts w:ascii="Arial" w:cs="Arial" w:eastAsia="Arial" w:hAnsi="Arial"/>
+                <w:b/>
+                <w:bCs/>
+                <w:color w:val="1C1B16"/>
                 <w:sz w:val="21"/>
                 <w:szCs w:val="21"/>
               </w:rPr>
@@ -12795,7 +12240,7 @@
                 <w:sz w:val="21"/>
                 <w:szCs w:val="21"/>
               </w:rPr>
-              <w:t xml:space="preserve">I test a column by when it exists: a strong column from the past is a feature, and a weak one from the future is a leak.</w:t>
+              <w:t xml:space="preserve">I test a column by when it exists: a strong column from the past is a feature, and a respectable column from a period that has not ended is a leak.</w:t>
             </w:r>
           </w:p>
           <w:p>
@@ -13120,7 +12565,7 @@
                 <w:sz w:val="18"/>
                 <w:szCs w:val="18"/>
               </w:rPr>
-              <w:t xml:space="preserve">   One correct option, Hard, [F], Wed</w:t>
+              <w:t xml:space="preserve">   One correct option, Medium, [F], Wed</w:t>
             </w:r>
           </w:p>
           <w:p>
@@ -13497,7 +12942,7 @@
                 <w:sz w:val="18"/>
                 <w:szCs w:val="18"/>
               </w:rPr>
-              <w:t xml:space="preserve">   One correct option, Hard, [S], Thu</w:t>
+              <w:t xml:space="preserve">   One correct option, Medium, [S], Thu</w:t>
             </w:r>
           </w:p>
           <w:p>
@@ -14121,7 +13566,7 @@
                 <w:sz w:val="21"/>
                 <w:szCs w:val="21"/>
               </w:rPr>
-              <w:t xml:space="preserve">   Key C</w:t>
+              <w:t xml:space="preserve">   Key B</w:t>
             </w:r>
             <w:r>
               <w:rPr>
@@ -14156,7 +13601,7 @@
                 <w:sz w:val="21"/>
                 <w:szCs w:val="21"/>
               </w:rPr>
-              <w:t xml:space="preserve">The three families sit within 0.011 AUC of each other, while the five folds of one model moved by about 0.03, so the ranking is inside the noise. On a tie the simpler model is the better recommendation: it is explained to a committee in one line per weight, monitored easily, and moved to lending with less to re-check. The flip is a gap that clears the folds' spread and is worth more in rupees, at the same budget of calls, than the cost of explaining and running the complex model. Thursday closed on why the boring model often ships.</w:t>
+              <w:t xml:space="preserve">The three families sit within 0.011 AUC of each other on one validation slice, while the five folds of one model moved by about 0.03, so another split could reorder them. The test that would settle it scores both models on the same five folds; until boosting leads on every fold by a margin worth its cost, the simpler model is the recommendation: it is explained to a committee in one line per weight, monitored easily, and moved to lending with less to re-check. The flip is a gap that holds across the folds and is worth more in rupees, at the same budget of calls, than the cost of explaining and running the complex model. Thursday closed on why the boring model often ships.</w:t>
             </w:r>
           </w:p>
           <w:p>
@@ -14183,7 +13628,7 @@
                 <w:sz w:val="20"/>
                 <w:szCs w:val="20"/>
               </w:rPr>
-              <w:t xml:space="preserve">The best number found on one validation slice carries that slice's luck, which Exhibit 4B sizes at about 0.03.</w:t>
+              <w:t xml:space="preserve">A logistic model overfits too when it has many columns and no penalty; its case here is the tie and its plainness.</w:t>
             </w:r>
           </w:p>
           <w:p>
@@ -14201,7 +13646,7 @@
                 <w:sz w:val="20"/>
                 <w:szCs w:val="20"/>
               </w:rPr>
-              <w:t xml:space="preserve">B.  </w:t>
+              <w:t xml:space="preserve">C.  </w:t>
             </w:r>
             <w:r>
               <w:rPr>
@@ -14210,7 +13655,7 @@
                 <w:sz w:val="20"/>
                 <w:szCs w:val="20"/>
               </w:rPr>
-              <w:t xml:space="preserve">Boosting can generalise well, and it can also overfit; how it fits says nothing about whether it beats the others here.</w:t>
+              <w:t xml:space="preserve">The best number found on one validation slice carries that slice's luck, which Exhibit 4B sizes at about 0.03.</w:t>
             </w:r>
           </w:p>
           <w:p>
@@ -14263,7 +13708,7 @@
                 <w:sz w:val="21"/>
                 <w:szCs w:val="21"/>
               </w:rPr>
-              <w:t xml:space="preserve">Inside the noise the simpler model ships, and I name the gap, in AUC and in rupees, at which the complex one would.</w:t>
+              <w:t xml:space="preserve">Inside the noise the simpler model ships, and I name the gap, in AUC and in rupees, held across folds, at which the complex one would.</w:t>
             </w:r>
           </w:p>
           <w:p>
@@ -14350,7 +13795,7 @@
                 <w:sz w:val="21"/>
                 <w:szCs w:val="21"/>
               </w:rPr>
-              <w:t xml:space="preserve">   Key A (overfitting)</w:t>
+              <w:t xml:space="preserve">   Key A</w:t>
             </w:r>
             <w:r>
               <w:rPr>
@@ -14359,7 +13804,7 @@
                 <w:sz w:val="18"/>
                 <w:szCs w:val="18"/>
               </w:rPr>
-              <w:t xml:space="preserve">   Fill in the blank, Easy, [S], Thu</w:t>
+              <w:t xml:space="preserve">   One correct option, Hard, [F], Fri</w:t>
             </w:r>
           </w:p>
           <w:p>
@@ -14385,7 +13830,88 @@
                 <w:sz w:val="21"/>
                 <w:szCs w:val="21"/>
               </w:rPr>
-              <w:t xml:space="preserve">Perfect on training and far lower on validation is a model that memorised its training rows, which is overfitting; the room's unlimited tree scored 0.996 against 0.837. Underfitting scores low on both.</w:t>
+              <w:t xml:space="preserve">Staleness shows on fresh outcomes, so the rule compares what the model predicted with what happened, every month, against a gap stated in advance. On the bank's late rows the mean score was 0.152 while 24.6 percent said yes: the probabilities fell out of step even though the ranking still held at an AUC of 0.657, and the cost line, which reads the scores as probabilities, was drawn on numbers that understate every client's chance. Instacart's alarm was the same kind: a monitored metric falling from 93 to 61 percent, and its first fix was a threshold change while retraining caught up. Friday's chapter was when the model goes stale.</w:t>
+            </w:r>
+          </w:p>
+          <w:p>
+            <w:pPr>
+              <w:keepNext/>
+              <w:spacing w:after="40" w:line="264"/>
+              <w:ind w:left="360" w:hanging="360"/>
+            </w:pPr>
+            <w:r>
+              <w:rPr>
+                <w:rFonts w:ascii="Arial" w:cs="Arial" w:eastAsia="Arial" w:hAnsi="Arial"/>
+                <w:b/>
+                <w:bCs/>
+                <w:color w:val="1C1B16"/>
+                <w:sz w:val="20"/>
+                <w:szCs w:val="20"/>
+              </w:rPr>
+              <w:t xml:space="preserve">B.  </w:t>
+            </w:r>
+            <w:r>
+              <w:rPr>
+                <w:rFonts w:ascii="Arial" w:cs="Arial" w:eastAsia="Arial" w:hAnsi="Arial"/>
+                <w:color w:val="1C1B16"/>
+                <w:sz w:val="20"/>
+                <w:szCs w:val="20"/>
+              </w:rPr>
+              <w:t xml:space="preserve">Retraining with no measurement can neither tell whether the old model failed nor whether the new one is better, and the outcomes it needs arrive weeks late.</w:t>
+            </w:r>
+          </w:p>
+          <w:p>
+            <w:pPr>
+              <w:keepNext/>
+              <w:spacing w:after="40" w:line="264"/>
+              <w:ind w:left="360" w:hanging="360"/>
+            </w:pPr>
+            <w:r>
+              <w:rPr>
+                <w:rFonts w:ascii="Arial" w:cs="Arial" w:eastAsia="Arial" w:hAnsi="Arial"/>
+                <w:b/>
+                <w:bCs/>
+                <w:color w:val="1C1B16"/>
+                <w:sz w:val="20"/>
+                <w:szCs w:val="20"/>
+              </w:rPr>
+              <w:t xml:space="preserve">C.  </w:t>
+            </w:r>
+            <w:r>
+              <w:rPr>
+                <w:rFonts w:ascii="Arial" w:cs="Arial" w:eastAsia="Arial" w:hAnsi="Arial"/>
+                <w:color w:val="1C1B16"/>
+                <w:sz w:val="20"/>
+                <w:szCs w:val="20"/>
+              </w:rPr>
+              <w:t xml:space="preserve">Training accuracy is measured on rows the model already saw, so it stays high while the world moves, and a line drawn on scores that run low is wrong whatever training says.</w:t>
+            </w:r>
+          </w:p>
+          <w:p>
+            <w:pPr>
+              <w:keepNext/>
+              <w:spacing w:after="40" w:line="264"/>
+              <w:ind w:left="360" w:hanging="360"/>
+            </w:pPr>
+            <w:r>
+              <w:rPr>
+                <w:rFonts w:ascii="Arial" w:cs="Arial" w:eastAsia="Arial" w:hAnsi="Arial"/>
+                <w:b/>
+                <w:bCs/>
+                <w:color w:val="1C1B16"/>
+                <w:sz w:val="20"/>
+                <w:szCs w:val="20"/>
+              </w:rPr>
+              <w:t xml:space="preserve">D.  </w:t>
+            </w:r>
+            <w:r>
+              <w:rPr>
+                <w:rFonts w:ascii="Arial" w:cs="Arial" w:eastAsia="Arial" w:hAnsi="Arial"/>
+                <w:color w:val="1C1B16"/>
+                <w:sz w:val="20"/>
+                <w:szCs w:val="20"/>
+              </w:rPr>
+              <w:t xml:space="preserve">A ranking can hold while the probabilities drift, as the late rows' AUC of 0.657 did, and the cost line reads probabilities, so the ranking cannot vouch for it.</w:t>
             </w:r>
           </w:p>
           <w:p>
@@ -14411,7 +13937,7 @@
                 <w:sz w:val="21"/>
                 <w:szCs w:val="21"/>
               </w:rPr>
-              <w:t xml:space="preserve">A big gap between training and validation is memorising, so I add a brake and choose its strength on validation or by cross-validation.</w:t>
+              <w:t xml:space="preserve">I monitor the decision's metric on fresh outcomes, predicted against actual, with the floor written into the memo before launch.</w:t>
             </w:r>
           </w:p>
           <w:p>
@@ -14426,7 +13952,7 @@
                 <w:sz w:val="18"/>
                 <w:szCs w:val="18"/>
               </w:rPr>
-              <w:t xml:space="preserve">Anchor: Overfitting: what it is, how you detect it, how you fix it.</w:t>
+              <w:t xml:space="preserve">Anchor: How would you know your model has gone stale?</w:t>
             </w:r>
           </w:p>
         </w:tc>
@@ -14498,7 +14024,7 @@
                 <w:sz w:val="21"/>
                 <w:szCs w:val="21"/>
               </w:rPr>
-              <w:t xml:space="preserve">   Key D (split)</w:t>
+              <w:t xml:space="preserve">   Key B, C</w:t>
             </w:r>
             <w:r>
               <w:rPr>
@@ -14507,7 +14033,7 @@
                 <w:sz w:val="18"/>
                 <w:szCs w:val="18"/>
               </w:rPr>
-              <w:t xml:space="preserve">   Fill in the blank, Medium, [F], Thu</w:t>
+              <w:t xml:space="preserve">   More than one correct, Medium, [D], Fri</w:t>
             </w:r>
           </w:p>
           <w:p>
@@ -14533,7 +14059,61 @@
                 <w:sz w:val="21"/>
                 <w:szCs w:val="21"/>
               </w:rPr>
-              <w:t xml:space="preserve">One split can be lucky or unlucky in which clients land in validation; cross-validation gives every row a turn in validation and averages the scores, so the luck of one split averages away. The week's five folds ran from 0.769 to 0.798.</w:t>
+              <w:t xml:space="preserve">The caveat says where the model is weak and when to stop trusting it: its worst segment, sized, and the staleness trigger, which on this file would have fired as the yes rate climbed past the mean score. The validation AUC against the simpler model is evidence, and the budget of calls belongs to the error bill and the plan. Friday's memo ran claim, evidence, error bill and caveat.</w:t>
+            </w:r>
+          </w:p>
+          <w:p>
+            <w:pPr>
+              <w:keepNext/>
+              <w:spacing w:after="40" w:line="264"/>
+              <w:ind w:left="360" w:hanging="360"/>
+            </w:pPr>
+            <w:r>
+              <w:rPr>
+                <w:rFonts w:ascii="Arial" w:cs="Arial" w:eastAsia="Arial" w:hAnsi="Arial"/>
+                <w:b/>
+                <w:bCs/>
+                <w:color w:val="1C1B16"/>
+                <w:sz w:val="20"/>
+                <w:szCs w:val="20"/>
+              </w:rPr>
+              <w:t xml:space="preserve">A.  </w:t>
+            </w:r>
+            <w:r>
+              <w:rPr>
+                <w:rFonts w:ascii="Arial" w:cs="Arial" w:eastAsia="Arial" w:hAnsi="Arial"/>
+                <w:color w:val="1C1B16"/>
+                <w:sz w:val="20"/>
+                <w:szCs w:val="20"/>
+              </w:rPr>
+              <w:t xml:space="preserve">A score against the simpler model is the memo's evidence line, not a limit on the model.</w:t>
+            </w:r>
+          </w:p>
+          <w:p>
+            <w:pPr>
+              <w:keepNext/>
+              <w:spacing w:after="40" w:line="264"/>
+              <w:ind w:left="360" w:hanging="360"/>
+            </w:pPr>
+            <w:r>
+              <w:rPr>
+                <w:rFonts w:ascii="Arial" w:cs="Arial" w:eastAsia="Arial" w:hAnsi="Arial"/>
+                <w:b/>
+                <w:bCs/>
+                <w:color w:val="1C1B16"/>
+                <w:sz w:val="20"/>
+                <w:szCs w:val="20"/>
+              </w:rPr>
+              <w:t xml:space="preserve">D.  </w:t>
+            </w:r>
+            <w:r>
+              <w:rPr>
+                <w:rFonts w:ascii="Arial" w:cs="Arial" w:eastAsia="Arial" w:hAnsi="Arial"/>
+                <w:color w:val="1C1B16"/>
+                <w:sz w:val="20"/>
+                <w:szCs w:val="20"/>
+              </w:rPr>
+              <w:t xml:space="preserve">The budget sets how many calls the plan buys, which is the bill's line; it says nothing about where the model fails.</w:t>
             </w:r>
           </w:p>
           <w:p>
@@ -14559,7 +14139,7 @@
                 <w:sz w:val="21"/>
                 <w:szCs w:val="21"/>
               </w:rPr>
-              <w:t xml:space="preserve">One split is one draw; five folds are five draws, so I quote the mean and the spread.</w:t>
+              <w:t xml:space="preserve">The caveat names the weakest segment and the trigger that retires the model, both in numbers.</w:t>
             </w:r>
           </w:p>
           <w:p>
@@ -14574,7 +14154,7 @@
                 <w:sz w:val="18"/>
                 <w:szCs w:val="18"/>
               </w:rPr>
-              <w:t xml:space="preserve">Anchor: Why cross-validation instead of one split?</w:t>
+              <w:t xml:space="preserve">Anchor: Your tuned model beats a simpler one by a point and costs ten times more to explain; which ships?</w:t>
             </w:r>
           </w:p>
         </w:tc>
@@ -14646,7 +14226,7 @@
                 <w:sz w:val="21"/>
                 <w:szCs w:val="21"/>
               </w:rPr>
-              <w:t xml:space="preserve">   Key A</w:t>
+              <w:t xml:space="preserve">   Key C</w:t>
             </w:r>
             <w:r>
               <w:rPr>
@@ -14655,7 +14235,7 @@
                 <w:sz w:val="18"/>
                 <w:szCs w:val="18"/>
               </w:rPr>
-              <w:t xml:space="preserve">   One correct option, Hard, [F], Fri</w:t>
+              <w:t xml:space="preserve">   One correct option, Medium, [D], Fri</w:t>
             </w:r>
           </w:p>
           <w:p>
@@ -14681,7 +14261,7 @@
                 <w:sz w:val="21"/>
                 <w:szCs w:val="21"/>
               </w:rPr>
-              <w:t xml:space="preserve">Staleness shows on fresh outcomes, so the rule compares what the model predicted with what happened, every month, against a gap stated in advance. On the bank's late rows the mean score was 0.152 while 24.6 percent said yes: the probabilities fell out of step even though the ranking still held at an AUC of 0.657, and the cost line, which reads the scores as probabilities, was drawn on numbers that understate every client's chance. Instacart's alarm was the same kind: a monitored metric falling from 93 to 61 percent, and its first fix was a threshold change while retraining caught up. Friday's chapter was when the model goes stale.</w:t>
+              <w:t xml:space="preserve">An offline score says the model ranks well on past rows; it does not say the campaign will sell more deposits. Booking.com's 23 comparisons put the correlation between the two near zero, -0.1 with an interval from -0.45 to 0.27, and the paper calls offline performance a health check. So the memo asks for a randomised trial that sets the model's list against the current rule on the business number, deposits sold per call, with the size fixed before it starts. Friday's memo turned the score into a decision the committee could test.</w:t>
             </w:r>
           </w:p>
           <w:p>
@@ -14699,7 +14279,7 @@
                 <w:sz w:val="20"/>
                 <w:szCs w:val="20"/>
               </w:rPr>
-              <w:t xml:space="preserve">B.  </w:t>
+              <w:t xml:space="preserve">A.  </w:t>
             </w:r>
             <w:r>
               <w:rPr>
@@ -14708,7 +14288,7 @@
                 <w:sz w:val="20"/>
                 <w:szCs w:val="20"/>
               </w:rPr>
-              <w:t xml:space="preserve">Retraining with no measurement can neither tell whether the old model failed nor whether the new one is better, and the outcomes it needs arrive weeks late.</w:t>
+              <w:t xml:space="preserve">More decimals on the offline score sharpen the health check, and the gap to the business number stays where it was.</w:t>
             </w:r>
           </w:p>
           <w:p>
@@ -14726,7 +14306,7 @@
                 <w:sz w:val="20"/>
                 <w:szCs w:val="20"/>
               </w:rPr>
-              <w:t xml:space="preserve">C.  </w:t>
+              <w:t xml:space="preserve">B.  </w:t>
             </w:r>
             <w:r>
               <w:rPr>
@@ -14735,7 +14315,7 @@
                 <w:sz w:val="20"/>
                 <w:szCs w:val="20"/>
               </w:rPr>
-              <w:t xml:space="preserve">Training accuracy is measured on rows the model already saw, so it stays high while the world moves, and a line drawn on scores that run low is wrong whatever training says.</w:t>
+              <w:t xml:space="preserve">A larger offline gain is the very thing Booking.com found did not predict business gain.</w:t>
             </w:r>
           </w:p>
           <w:p>
@@ -14762,7 +14342,7 @@
                 <w:sz w:val="20"/>
                 <w:szCs w:val="20"/>
               </w:rPr>
-              <w:t xml:space="preserve">A ranking can hold while the probabilities drift, as the late rows' AUC of 0.657 did, and the cost line reads probabilities, so the ranking cannot vouch for it.</w:t>
+              <w:t xml:space="preserve">The test score is the honest offline number, and it is still offline.</w:t>
             </w:r>
           </w:p>
           <w:p>
@@ -14788,7 +14368,7 @@
                 <w:sz w:val="21"/>
                 <w:szCs w:val="21"/>
               </w:rPr>
-              <w:t xml:space="preserve">I monitor the decision's metric on fresh outcomes, predicted against actual, with the floor written into the memo before launch.</w:t>
+              <w:t xml:space="preserve">Offline metrics earn a model its trial; the trial on the business number earns it the rollout.</w:t>
             </w:r>
           </w:p>
           <w:p>
@@ -14803,7 +14383,7 @@
                 <w:sz w:val="18"/>
                 <w:szCs w:val="18"/>
               </w:rPr>
-              <w:t xml:space="preserve">Anchor: How would you know your model has gone stale?</w:t>
+              <w:t xml:space="preserve">Anchor: Your tuned model beats a simpler one by a hair: which ships, and why?</w:t>
             </w:r>
           </w:p>
         </w:tc>
@@ -14875,7 +14455,7 @@
                 <w:sz w:val="21"/>
                 <w:szCs w:val="21"/>
               </w:rPr>
-              <w:t xml:space="preserve">   Key B, C</w:t>
+              <w:t xml:space="preserve">   Key B</w:t>
             </w:r>
             <w:r>
               <w:rPr>
@@ -14884,7 +14464,7 @@
                 <w:sz w:val="18"/>
                 <w:szCs w:val="18"/>
               </w:rPr>
-              <w:t xml:space="preserve">   More than one correct, Medium, [D], Fri</w:t>
+              <w:t xml:space="preserve">   One correct option, Hard, [D], Fri</w:t>
             </w:r>
           </w:p>
           <w:p>
@@ -14910,7 +14490,7 @@
                 <w:sz w:val="21"/>
                 <w:szCs w:val="21"/>
               </w:rPr>
-              <w:t xml:space="preserve">The caveat says where the model is weak and when to stop trusting it: its worst segment, sized, and the staleness trigger, which on this file would have fired as the yes rate climbed past the mean score. The validation AUC against the simpler model is evidence, and the budget of calls belongs to the error bill and the plan. Friday's memo ran claim, evidence, error bill and caveat.</w:t>
+              <w:t xml:space="preserve">Approve when the expected cost of approving, p times Rs 60,000, is below the expected cost of rejecting, (1 minus p) times Rs 3,000, where p is the chance of default: p below 3,000 over 63,000, about 0.048. P at 0.04 is approved and Q at 0.08 is rejected. So Rohan lends only above about a 95 percent chance of repayment, while the nudge acts on a 3 percent chance of a yes: the asymmetry flips, so the line flips. Both rules assume calibrated probabilities. Friday's transfer chapter and Tuesday's hand count on Rohan's costs drew this line.</w:t>
             </w:r>
           </w:p>
           <w:p>
@@ -14937,7 +14517,7 @@
                 <w:sz w:val="20"/>
                 <w:szCs w:val="20"/>
               </w:rPr>
-              <w:t xml:space="preserve">A score against the simpler model is the memo's evidence line, not a limit on the model.</w:t>
+              <w:t xml:space="preserve">0.5 treats the two errors as equal, while a default costs twenty times a wrongful rejection.</w:t>
             </w:r>
           </w:p>
           <w:p>
@@ -14955,7 +14535,7 @@
                 <w:sz w:val="20"/>
                 <w:szCs w:val="20"/>
               </w:rPr>
-              <w:t xml:space="preserve">D.  </w:t>
+              <w:t xml:space="preserve">C.  </w:t>
             </w:r>
             <w:r>
               <w:rPr>
@@ -14964,155 +14544,7 @@
                 <w:sz w:val="20"/>
                 <w:szCs w:val="20"/>
               </w:rPr>
-              <w:t xml:space="preserve">The budget sets how many calls the plan buys, which is the bill's line; it says nothing about where the model fails.</w:t>
-            </w:r>
-          </w:p>
-          <w:p>
-            <w:pPr>
-              <w:keepNext/>
-              <w:spacing w:after="40" w:before="60" w:line="276"/>
-            </w:pPr>
-            <w:r>
-              <w:rPr>
-                <w:rFonts w:ascii="Arial" w:cs="Arial" w:eastAsia="Arial" w:hAnsi="Arial"/>
-                <w:b/>
-                <w:bCs/>
-                <w:color w:val="1C1B16"/>
-                <w:sz w:val="21"/>
-                <w:szCs w:val="21"/>
-              </w:rPr>
-              <w:t xml:space="preserve">In the interview.  </w:t>
-            </w:r>
-            <w:r>
-              <w:rPr>
-                <w:rFonts w:ascii="Arial" w:cs="Arial" w:eastAsia="Arial" w:hAnsi="Arial"/>
-                <w:color w:val="1C1B16"/>
-                <w:sz w:val="21"/>
-                <w:szCs w:val="21"/>
-              </w:rPr>
-              <w:t xml:space="preserve">The caveat names the weakest segment and the trigger that retires the model, both in numbers.</w:t>
-            </w:r>
-          </w:p>
-          <w:p>
-            <w:pPr>
-              <w:keepNext w:val="false"/>
-              <w:spacing w:after="0"/>
-            </w:pPr>
-            <w:r>
-              <w:rPr>
-                <w:rFonts w:ascii="Arial" w:cs="Arial" w:eastAsia="Arial" w:hAnsi="Arial"/>
-                <w:color w:val="6B675E"/>
-                <w:sz w:val="18"/>
-                <w:szCs w:val="18"/>
-              </w:rPr>
-              <w:t xml:space="preserve">Anchor: Your tuned model beats a simpler one by a point and costs ten times more to explain; which ships?</w:t>
-            </w:r>
-          </w:p>
-        </w:tc>
-      </w:tr>
-    </w:tbl>
-    <w:p>
-      <w:pPr>
-        <w:keepNext w:val="false"/>
-        <w:spacing w:after="160" w:before="0"/>
-      </w:pPr>
-    </w:p>
-    <w:tbl>
-      <w:tblPr>
-        <w:tblW w:type="dxa" w:w="9800"/>
-        <w:tblBorders>
-          <w:top w:val="none" w:color="FFFFFF" w:sz="0"/>
-          <w:left w:val="none" w:color="FFFFFF" w:sz="0"/>
-          <w:bottom w:val="none" w:color="FFFFFF" w:sz="0"/>
-          <w:right w:val="none" w:color="FFFFFF" w:sz="0"/>
-          <w:insideH w:val="none" w:color="FFFFFF" w:sz="0"/>
-          <w:insideV w:val="none" w:color="FFFFFF" w:sz="0"/>
-        </w:tblBorders>
-      </w:tblPr>
-      <w:tblGrid>
-        <w:gridCol w:w="9800"/>
-      </w:tblGrid>
-      <w:tr>
-        <w:trPr>
-          <w:cantSplit/>
-        </w:trPr>
-        <w:tc>
-          <w:tcPr>
-            <w:tcW w:type="dxa" w:w="9800"/>
-            <w:tcBorders>
-              <w:top w:val="none" w:color="FFFFFF" w:sz="0"/>
-              <w:left w:val="none" w:color="FFFFFF" w:sz="0"/>
-              <w:bottom w:val="none" w:color="FFFFFF" w:sz="0"/>
-              <w:right w:val="none" w:color="FFFFFF" w:sz="0"/>
-            </w:tcBorders>
-            <w:tcMar>
-              <w:top w:type="dxa" w:w="0"/>
-              <w:left w:type="dxa" w:w="0"/>
-              <w:bottom w:type="dxa" w:w="0"/>
-              <w:right w:type="dxa" w:w="0"/>
-            </w:tcMar>
-          </w:tcPr>
-          <w:p>
-            <w:pPr>
-              <w:keepNext/>
-              <w:spacing w:after="60" w:before="60"/>
-            </w:pPr>
-            <w:r>
-              <w:rPr>
-                <w:rFonts w:ascii="Arial" w:cs="Arial" w:eastAsia="Arial" w:hAnsi="Arial"/>
-                <w:b/>
-                <w:bCs/>
-                <w:color w:val="B37A33"/>
-                <w:sz w:val="22"/>
-                <w:szCs w:val="22"/>
-              </w:rPr>
-              <w:t xml:space="preserve">Q25</w:t>
-            </w:r>
-            <w:r>
-              <w:rPr>
-                <w:rFonts w:ascii="Arial" w:cs="Arial" w:eastAsia="Arial" w:hAnsi="Arial"/>
-                <w:b/>
-                <w:bCs/>
-                <w:color w:val="1C1B16"/>
-                <w:sz w:val="21"/>
-                <w:szCs w:val="21"/>
-              </w:rPr>
-              <w:t xml:space="preserve">   Key A</w:t>
-            </w:r>
-            <w:r>
-              <w:rPr>
-                <w:rFonts w:ascii="Arial" w:cs="Arial" w:eastAsia="Arial" w:hAnsi="Arial"/>
-                <w:color w:val="6B675E"/>
-                <w:sz w:val="18"/>
-                <w:szCs w:val="18"/>
-              </w:rPr>
-              <w:t xml:space="preserve">   One correct option, Medium, [D], Fri</w:t>
-            </w:r>
-          </w:p>
-          <w:p>
-            <w:pPr>
-              <w:keepNext/>
-              <w:spacing w:after="60" w:line="276"/>
-            </w:pPr>
-            <w:r>
-              <w:rPr>
-                <w:rFonts w:ascii="Arial" w:cs="Arial" w:eastAsia="Arial" w:hAnsi="Arial"/>
-                <w:b/>
-                <w:bCs/>
-                <w:color w:val="1C1B16"/>
-                <w:sz w:val="21"/>
-                <w:szCs w:val="21"/>
-              </w:rPr>
-              <w:t xml:space="preserve">Why it holds.  </w:t>
-            </w:r>
-            <w:r>
-              <w:rPr>
-                <w:rFonts w:ascii="Arial" w:cs="Arial" w:eastAsia="Arial" w:hAnsi="Arial"/>
-                <w:color w:val="1C1B16"/>
-                <w:sz w:val="21"/>
-                <w:szCs w:val="21"/>
-              </w:rPr>
-              <w:t xml:space="preserve">An offline score says the model ranks well on past rows; it does not say the campaign will sell more deposits. Booking.com's 23 comparisons put the correlation between the two near zero, -0.1 with an interval from -0.45 to 0.27, and the paper calls offline performance a health check. So the memo asks for a randomised trial that sets the model's list against the current rule on the business number, deposits sold per call, with the size fixed before it starts. Friday's memo turned the score into a decision the committee could test.</w:t>
+              <w:t xml:space="preserve">The method moves and the costs do not: the nudge's cheap error is a wasted call, while the loan's expensive error is a default, so the line moves to the other end.</w:t>
             </w:r>
           </w:p>
           <w:p>
@@ -15130,7 +14562,7 @@
                 <w:sz w:val="20"/>
                 <w:szCs w:val="20"/>
               </w:rPr>
-              <w:t xml:space="preserve">B.  </w:t>
+              <w:t xml:space="preserve">D.  </w:t>
             </w:r>
             <w:r>
               <w:rPr>
@@ -15139,14 +14571,13 @@
                 <w:sz w:val="20"/>
                 <w:szCs w:val="20"/>
               </w:rPr>
-              <w:t xml:space="preserve">More decimals on the offline score sharpen the health check, and the gap to the business number stays where it was.</w:t>
+              <w:t xml:space="preserve">1 in 20 is the cost ratio, and the line is 3,000 over 63,000, about 1 in 21; P at 4 percent sits below it and is approved.</w:t>
             </w:r>
           </w:p>
           <w:p>
             <w:pPr>
               <w:keepNext/>
-              <w:spacing w:after="40" w:line="264"/>
-              <w:ind w:left="360" w:hanging="360"/>
+              <w:spacing w:after="40" w:before="60" w:line="276"/>
             </w:pPr>
             <w:r>
               <w:rPr>
@@ -15154,59 +14585,6 @@
                 <w:b/>
                 <w:bCs/>
                 <w:color w:val="1C1B16"/>
-                <w:sz w:val="20"/>
-                <w:szCs w:val="20"/>
-              </w:rPr>
-              <w:t xml:space="preserve">C.  </w:t>
-            </w:r>
-            <w:r>
-              <w:rPr>
-                <w:rFonts w:ascii="Arial" w:cs="Arial" w:eastAsia="Arial" w:hAnsi="Arial"/>
-                <w:color w:val="1C1B16"/>
-                <w:sz w:val="20"/>
-                <w:szCs w:val="20"/>
-              </w:rPr>
-              <w:t xml:space="preserve">A larger offline gain is the very thing Booking.com found did not predict business gain.</w:t>
-            </w:r>
-          </w:p>
-          <w:p>
-            <w:pPr>
-              <w:keepNext/>
-              <w:spacing w:after="40" w:line="264"/>
-              <w:ind w:left="360" w:hanging="360"/>
-            </w:pPr>
-            <w:r>
-              <w:rPr>
-                <w:rFonts w:ascii="Arial" w:cs="Arial" w:eastAsia="Arial" w:hAnsi="Arial"/>
-                <w:b/>
-                <w:bCs/>
-                <w:color w:val="1C1B16"/>
-                <w:sz w:val="20"/>
-                <w:szCs w:val="20"/>
-              </w:rPr>
-              <w:t xml:space="preserve">D.  </w:t>
-            </w:r>
-            <w:r>
-              <w:rPr>
-                <w:rFonts w:ascii="Arial" w:cs="Arial" w:eastAsia="Arial" w:hAnsi="Arial"/>
-                <w:color w:val="1C1B16"/>
-                <w:sz w:val="20"/>
-                <w:szCs w:val="20"/>
-              </w:rPr>
-              <w:t xml:space="preserve">The test score is the honest offline number, and it is still offline.</w:t>
-            </w:r>
-          </w:p>
-          <w:p>
-            <w:pPr>
-              <w:keepNext/>
-              <w:spacing w:after="40" w:before="60" w:line="276"/>
-            </w:pPr>
-            <w:r>
-              <w:rPr>
-                <w:rFonts w:ascii="Arial" w:cs="Arial" w:eastAsia="Arial" w:hAnsi="Arial"/>
-                <w:b/>
-                <w:bCs/>
-                <w:color w:val="1C1B16"/>
                 <w:sz w:val="21"/>
                 <w:szCs w:val="21"/>
               </w:rPr>
@@ -15219,236 +14597,7 @@
                 <w:sz w:val="21"/>
                 <w:szCs w:val="21"/>
               </w:rPr>
-              <w:t xml:space="preserve">Offline metrics earn a model its trial; the trial on the business number earns it the rollout.</w:t>
-            </w:r>
-          </w:p>
-          <w:p>
-            <w:pPr>
-              <w:keepNext w:val="false"/>
-              <w:spacing w:after="0"/>
-            </w:pPr>
-            <w:r>
-              <w:rPr>
-                <w:rFonts w:ascii="Arial" w:cs="Arial" w:eastAsia="Arial" w:hAnsi="Arial"/>
-                <w:color w:val="6B675E"/>
-                <w:sz w:val="18"/>
-                <w:szCs w:val="18"/>
-              </w:rPr>
-              <w:t xml:space="preserve">Anchor: Your tuned model beats a simpler one by a hair: which ships, and why?</w:t>
-            </w:r>
-          </w:p>
-        </w:tc>
-      </w:tr>
-    </w:tbl>
-    <w:p>
-      <w:pPr>
-        <w:keepNext w:val="false"/>
-        <w:spacing w:after="160" w:before="0"/>
-      </w:pPr>
-    </w:p>
-    <w:tbl>
-      <w:tblPr>
-        <w:tblW w:type="dxa" w:w="9800"/>
-        <w:tblBorders>
-          <w:top w:val="none" w:color="FFFFFF" w:sz="0"/>
-          <w:left w:val="none" w:color="FFFFFF" w:sz="0"/>
-          <w:bottom w:val="none" w:color="FFFFFF" w:sz="0"/>
-          <w:right w:val="none" w:color="FFFFFF" w:sz="0"/>
-          <w:insideH w:val="none" w:color="FFFFFF" w:sz="0"/>
-          <w:insideV w:val="none" w:color="FFFFFF" w:sz="0"/>
-        </w:tblBorders>
-      </w:tblPr>
-      <w:tblGrid>
-        <w:gridCol w:w="9800"/>
-      </w:tblGrid>
-      <w:tr>
-        <w:trPr>
-          <w:cantSplit/>
-        </w:trPr>
-        <w:tc>
-          <w:tcPr>
-            <w:tcW w:type="dxa" w:w="9800"/>
-            <w:tcBorders>
-              <w:top w:val="none" w:color="FFFFFF" w:sz="0"/>
-              <w:left w:val="none" w:color="FFFFFF" w:sz="0"/>
-              <w:bottom w:val="none" w:color="FFFFFF" w:sz="0"/>
-              <w:right w:val="none" w:color="FFFFFF" w:sz="0"/>
-            </w:tcBorders>
-            <w:tcMar>
-              <w:top w:type="dxa" w:w="0"/>
-              <w:left w:type="dxa" w:w="0"/>
-              <w:bottom w:type="dxa" w:w="0"/>
-              <w:right w:type="dxa" w:w="0"/>
-            </w:tcMar>
-          </w:tcPr>
-          <w:p>
-            <w:pPr>
-              <w:keepNext/>
-              <w:spacing w:after="60" w:before="60"/>
-            </w:pPr>
-            <w:r>
-              <w:rPr>
-                <w:rFonts w:ascii="Arial" w:cs="Arial" w:eastAsia="Arial" w:hAnsi="Arial"/>
-                <w:b/>
-                <w:bCs/>
-                <w:color w:val="B37A33"/>
-                <w:sz w:val="22"/>
-                <w:szCs w:val="22"/>
-              </w:rPr>
-              <w:t xml:space="preserve">Q26</w:t>
-            </w:r>
-            <w:r>
-              <w:rPr>
-                <w:rFonts w:ascii="Arial" w:cs="Arial" w:eastAsia="Arial" w:hAnsi="Arial"/>
-                <w:b/>
-                <w:bCs/>
-                <w:color w:val="1C1B16"/>
-                <w:sz w:val="21"/>
-                <w:szCs w:val="21"/>
-              </w:rPr>
-              <w:t xml:space="preserve">   Key D</w:t>
-            </w:r>
-            <w:r>
-              <w:rPr>
-                <w:rFonts w:ascii="Arial" w:cs="Arial" w:eastAsia="Arial" w:hAnsi="Arial"/>
-                <w:color w:val="6B675E"/>
-                <w:sz w:val="18"/>
-                <w:szCs w:val="18"/>
-              </w:rPr>
-              <w:t xml:space="preserve">   One correct option, Hard, [D], Fri</w:t>
-            </w:r>
-          </w:p>
-          <w:p>
-            <w:pPr>
-              <w:keepNext/>
-              <w:spacing w:after="60" w:line="276"/>
-            </w:pPr>
-            <w:r>
-              <w:rPr>
-                <w:rFonts w:ascii="Arial" w:cs="Arial" w:eastAsia="Arial" w:hAnsi="Arial"/>
-                <w:b/>
-                <w:bCs/>
-                <w:color w:val="1C1B16"/>
-                <w:sz w:val="21"/>
-                <w:szCs w:val="21"/>
-              </w:rPr>
-              <w:t xml:space="preserve">Why it holds.  </w:t>
-            </w:r>
-            <w:r>
-              <w:rPr>
-                <w:rFonts w:ascii="Arial" w:cs="Arial" w:eastAsia="Arial" w:hAnsi="Arial"/>
-                <w:color w:val="1C1B16"/>
-                <w:sz w:val="21"/>
-                <w:szCs w:val="21"/>
-              </w:rPr>
-              <w:t xml:space="preserve">The same cost rule runs in both businesses. Approve when the expected cost of approving, p times Rs 60,000, is below the expected cost of rejecting, (1 minus p) times Rs 3,000, where p is the chance of default: p below 3,000 over 63,000, about 0.048. So Rohan lends only above about a 95 percent chance of repayment, while the nudge acts on a 3 percent chance of a yes. The asymmetry flips, so the line flips. Both rules assume calibrated probabilities. Friday's transfer chapter and Tuesday's hand count on Rohan's costs drew this line.</w:t>
-            </w:r>
-          </w:p>
-          <w:p>
-            <w:pPr>
-              <w:keepNext/>
-              <w:spacing w:after="40" w:line="264"/>
-              <w:ind w:left="360" w:hanging="360"/>
-            </w:pPr>
-            <w:r>
-              <w:rPr>
-                <w:rFonts w:ascii="Arial" w:cs="Arial" w:eastAsia="Arial" w:hAnsi="Arial"/>
-                <w:b/>
-                <w:bCs/>
-                <w:color w:val="1C1B16"/>
-                <w:sz w:val="20"/>
-                <w:szCs w:val="20"/>
-              </w:rPr>
-              <w:t xml:space="preserve">A.  </w:t>
-            </w:r>
-            <w:r>
-              <w:rPr>
-                <w:rFonts w:ascii="Arial" w:cs="Arial" w:eastAsia="Arial" w:hAnsi="Arial"/>
-                <w:color w:val="1C1B16"/>
-                <w:sz w:val="20"/>
-                <w:szCs w:val="20"/>
-              </w:rPr>
-              <w:t xml:space="preserve">The method moves and the costs do not: the nudge's cheap error is a wasted call, while the loan's expensive error is a default.</w:t>
-            </w:r>
-          </w:p>
-          <w:p>
-            <w:pPr>
-              <w:keepNext/>
-              <w:spacing w:after="40" w:line="264"/>
-              <w:ind w:left="360" w:hanging="360"/>
-            </w:pPr>
-            <w:r>
-              <w:rPr>
-                <w:rFonts w:ascii="Arial" w:cs="Arial" w:eastAsia="Arial" w:hAnsi="Arial"/>
-                <w:b/>
-                <w:bCs/>
-                <w:color w:val="1C1B16"/>
-                <w:sz w:val="20"/>
-                <w:szCs w:val="20"/>
-              </w:rPr>
-              <w:t xml:space="preserve">B.  </w:t>
-            </w:r>
-            <w:r>
-              <w:rPr>
-                <w:rFonts w:ascii="Arial" w:cs="Arial" w:eastAsia="Arial" w:hAnsi="Arial"/>
-                <w:color w:val="1C1B16"/>
-                <w:sz w:val="20"/>
-                <w:szCs w:val="20"/>
-              </w:rPr>
-              <w:t xml:space="preserve">0.5 treats the two errors as equal, while a default costs twenty times a wrongful rejection.</w:t>
-            </w:r>
-          </w:p>
-          <w:p>
-            <w:pPr>
-              <w:keepNext/>
-              <w:spacing w:after="40" w:line="264"/>
-              <w:ind w:left="360" w:hanging="360"/>
-            </w:pPr>
-            <w:r>
-              <w:rPr>
-                <w:rFonts w:ascii="Arial" w:cs="Arial" w:eastAsia="Arial" w:hAnsi="Arial"/>
-                <w:b/>
-                <w:bCs/>
-                <w:color w:val="1C1B16"/>
-                <w:sz w:val="20"/>
-                <w:szCs w:val="20"/>
-              </w:rPr>
-              <w:t xml:space="preserve">C.  </w:t>
-            </w:r>
-            <w:r>
-              <w:rPr>
-                <w:rFonts w:ascii="Arial" w:cs="Arial" w:eastAsia="Arial" w:hAnsi="Arial"/>
-                <w:color w:val="1C1B16"/>
-                <w:sz w:val="20"/>
-                <w:szCs w:val="20"/>
-              </w:rPr>
-              <w:t xml:space="preserve">This puts the expensive error's cost on top, which would lend to a borrower with a 95 percent chance of default.</w:t>
-            </w:r>
-          </w:p>
-          <w:p>
-            <w:pPr>
-              <w:keepNext/>
-              <w:spacing w:after="40" w:before="60" w:line="276"/>
-            </w:pPr>
-            <w:r>
-              <w:rPr>
-                <w:rFonts w:ascii="Arial" w:cs="Arial" w:eastAsia="Arial" w:hAnsi="Arial"/>
-                <w:b/>
-                <w:bCs/>
-                <w:color w:val="1C1B16"/>
-                <w:sz w:val="21"/>
-                <w:szCs w:val="21"/>
-              </w:rPr>
-              <w:t xml:space="preserve">In the interview.  </w:t>
-            </w:r>
-            <w:r>
-              <w:rPr>
-                <w:rFonts w:ascii="Arial" w:cs="Arial" w:eastAsia="Arial" w:hAnsi="Arial"/>
-                <w:color w:val="1C1B16"/>
-                <w:sz w:val="21"/>
-                <w:szCs w:val="21"/>
-              </w:rPr>
-              <w:t xml:space="preserve">The line is the cheap error's cost over both costs, so the same model calls on a 3 percent chance and lends only at 95 percent sure.</w:t>
+              <w:t xml:space="preserve">The line is the cheap error's cost over both costs, so the same model calls on a 3 percent chance and lends only below about a 5 percent chance of default.</w:t>
             </w:r>
           </w:p>
           <w:p>
@@ -15508,7 +14657,7 @@
           <w:sz w:val="21"/>
           <w:szCs w:val="21"/>
         </w:rPr>
-        <w:t xml:space="preserve">[S] (12): Q1, Q4, Q5, Q7, Q8, Q9, Q11, Q12, Q13, Q16, Q17, Q21</w:t>
+        <w:t xml:space="preserve">[S] (11): Q1, Q4, Q5, Q7, Q8, Q9, Q11, Q12, Q13, Q16, Q17</w:t>
       </w:r>
     </w:p>
     <w:p>
@@ -15527,7 +14676,7 @@
           <w:sz w:val="21"/>
           <w:szCs w:val="21"/>
         </w:rPr>
-        <w:t xml:space="preserve">[F] (8): Q3, Q6, Q14, Q15, Q18, Q19, Q22, Q23</w:t>
+        <w:t xml:space="preserve">[F] (7): Q3, Q6, Q14, Q15, Q18, Q19, Q21</w:t>
       </w:r>
     </w:p>
     <w:p>
@@ -15565,7 +14714,7 @@
           <w:sz w:val="21"/>
           <w:szCs w:val="21"/>
         </w:rPr>
-        <w:t xml:space="preserve">[D] (6): Q2, Q10, Q20, Q24, Q25, Q26</w:t>
+        <w:t xml:space="preserve">[D] (6): Q2, Q10, Q20, Q22, Q23, Q24</w:t>
       </w:r>
     </w:p>
     <w:p>
@@ -15584,7 +14733,7 @@
           <w:sz w:val="21"/>
           <w:szCs w:val="21"/>
         </w:rPr>
-        <w:t xml:space="preserve">Easy (4): Q5, Q11, Q16, Q21</w:t>
+        <w:t xml:space="preserve">Easy (3): Q5, Q11, Q16</w:t>
       </w:r>
     </w:p>
     <w:p>
@@ -15603,7 +14752,7 @@
           <w:sz w:val="21"/>
           <w:szCs w:val="21"/>
         </w:rPr>
-        <w:t xml:space="preserve">Medium (9): Q1, Q3, Q4, Q8, Q14, Q18, Q22, Q24, Q25</w:t>
+        <w:t xml:space="preserve">Medium (14): Q1, Q3, Q4, Q6, Q7, Q8, Q9, Q12, Q14, Q15, Q17, Q18, Q22, Q23</w:t>
       </w:r>
     </w:p>
     <w:p>
@@ -15622,7 +14771,7 @@
           <w:sz w:val="21"/>
           <w:szCs w:val="21"/>
         </w:rPr>
-        <w:t xml:space="preserve">Hard (13): Q2, Q6, Q7, Q9, Q10, Q12, Q13, Q15, Q17, Q19, Q20, Q23, Q26</w:t>
+        <w:t xml:space="preserve">Hard (7): Q2, Q10, Q13, Q19, Q20, Q21, Q24</w:t>
       </w:r>
     </w:p>
     <w:p>
@@ -15698,7 +14847,7 @@
           <w:sz w:val="21"/>
           <w:szCs w:val="21"/>
         </w:rPr>
-        <w:t xml:space="preserve">Part 4, Is the model learning, or memorising? (6): Q17, Q18, Q19, Q20, Q21, Q22</w:t>
+        <w:t xml:space="preserve">Part 4, Is the model learning, or memorising? (4): Q17, Q18, Q19, Q20</w:t>
       </w:r>
     </w:p>
     <w:p>
@@ -15717,7 +14866,7 @@
           <w:sz w:val="21"/>
           <w:szCs w:val="21"/>
         </w:rPr>
-        <w:t xml:space="preserve">Part 5, Would the committee sign, and what moves to lending? (4): Q23, Q24, Q25, Q26</w:t>
+        <w:t xml:space="preserve">Part 5, Would the committee sign, and what moves to lending? (4): Q21, Q22, Q23, Q24</w:t>
       </w:r>
     </w:p>
     <w:p>
@@ -15787,7 +14936,7 @@
           <w:sz w:val="21"/>
           <w:szCs w:val="21"/>
         </w:rPr>
-        <w:t xml:space="preserve">Q2 (True or false, Hard, [D]): The calls run in date order. On the week's run the earliest 70 percent of rows say yes 5.6 percent of the time and the latest 30 percent say yes 24.6 percent of the time. Statement: for the question "whom do we call in the next campaign", a random split of all the rows estimates the model's score as honestly as a split by date. True or false, and why?</w:t>
+        <w:t xml:space="preserve">Q2 (True or false, Hard, [D]): The calls run in date order. On the week's run the earliest 70 percent of rows say yes 5.6 percent of the time and the latest 30 percent say yes 24.6 percent of the time. Statement: for the question "whom do we call in the next campaign", a split by date estimates the model's score more honestly than a random split of all the rows. True or false, and why?</w:t>
       </w:r>
     </w:p>
     <w:p>
@@ -15844,7 +14993,7 @@
           <w:sz w:val="21"/>
           <w:szCs w:val="21"/>
         </w:rPr>
-        <w:t xml:space="preserve">Q6 (True or false, Hard, [F]): Statement: an accuracy of 0.897 against 0.887 for calling nobody shows that the model at 0.5 is good enough to run the campaign. True or false, and why?</w:t>
+        <w:t xml:space="preserve">Q6 (True or false, Medium, [F]): Statement: an accuracy of 0.897 against 0.887 for calling nobody shows that the model at 0.5 is good enough to run the campaign. True or false, and why?</w:t>
       </w:r>
     </w:p>
     <w:p>
@@ -15863,7 +15012,7 @@
           <w:sz w:val="21"/>
           <w:szCs w:val="21"/>
         </w:rPr>
-        <w:t xml:space="preserve">Q7 (Applied maths, Hard, [S]): From the model's row of Exhibit 2A, compute its precision, recall and F1 at the threshold of 0.5, each to two decimal places. Show the working.</w:t>
+        <w:t xml:space="preserve">Q7 (Applied maths, Medium, [S]): From the model's row of Exhibit 2A, compute its precision, recall and F1 at the threshold of 0.5, each to two decimal places. Show the working.</w:t>
       </w:r>
     </w:p>
     <w:p>
@@ -15901,7 +15050,7 @@
           <w:sz w:val="21"/>
           <w:szCs w:val="21"/>
         </w:rPr>
-        <w:t xml:space="preserve">Q9 (One correct option, Hard, [S]): At Rs 40 a wasted call and Rs 1,200 a missed buyer, what is the error bill at the thresholds of 0.5 and 0.10 in Exhibit 2B, and which costs less?</w:t>
+        <w:t xml:space="preserve">Q9 (One correct option, Medium, [S]): At Rs 40 a wasted call and Rs 1,200 a missed buyer, what is the error bill at the thresholds of 0.5 and 0.10 in Exhibit 2B, and which costs less?</w:t>
       </w:r>
     </w:p>
     <w:p>
@@ -15939,7 +15088,7 @@
           <w:sz w:val="21"/>
           <w:szCs w:val="21"/>
         </w:rPr>
-        <w:t xml:space="preserve">Q12 (One correct option, Hard, [S]): The junior's message reads: "Adding duration lifts AUC from 0.795 to 0.932. Shipping tonight." What is the reply?</w:t>
+        <w:t xml:space="preserve">Q12 (One correct option, Medium, [S]): The junior's message reads: "Adding duration lifts AUC from 0.795 to 0.932. Shipping tonight." What is the reply?</w:t>
       </w:r>
     </w:p>
     <w:p>
@@ -15996,7 +15145,7 @@
           <w:sz w:val="21"/>
           <w:szCs w:val="21"/>
         </w:rPr>
-        <w:t xml:space="preserve">Q15 (One correct option, Hard, [F]): On its own, euribor3m takes a coefficient of -0.92 on the standardised scale; beside the four other economic indicators it takes +0.39. The marketing head asks whether higher rates help the campaign. What is the likeliest cause of the flip, and what does the memo say?</w:t>
+        <w:t xml:space="preserve">Q15 (One correct option, Medium, [F]): On its own, euribor3m takes a coefficient of -0.92 on the standardised scale; beside the four other economic indicators it takes +0.39. The marketing head asks whether higher rates help the campaign. What is the likeliest cause of the flip, and what does the memo say?</w:t>
       </w:r>
     </w:p>
     <w:p>
@@ -16015,7 +15164,7 @@
           <w:sz w:val="21"/>
           <w:szCs w:val="21"/>
         </w:rPr>
-        <w:t xml:space="preserve">Q17 (One correct option, Hard, [S]): The unlimited tree scores 0.996 on training and 0.837 on validation, below calling nobody. Which reading and which next step are right?</w:t>
+        <w:t xml:space="preserve">Q17 (One correct option, Medium, [S]): The unlimited tree scores 0.996 on training and 0.837 on validation, below calling nobody. Which reading and which next step are right?</w:t>
       </w:r>
     </w:p>
     <w:p>
@@ -16072,7 +15221,7 @@
           <w:sz w:val="21"/>
           <w:szCs w:val="21"/>
         </w:rPr>
-        <w:t xml:space="preserve">Q20 (True or false, Hard, [D]): Statement: gradient boosting should go into the memo, since it scores the highest validation AUC of the three families in Exhibit 4B. True or false, and why?</w:t>
+        <w:t xml:space="preserve">Q20 (True or false, Hard, [D]): Statement: the logistic model should go into the memo, although gradient boosting scores the highest validation AUC of the three families in Exhibit 4B. True or false, and why?</w:t>
       </w:r>
     </w:p>
     <w:p>
@@ -16091,7 +15240,7 @@
           <w:sz w:val="21"/>
           <w:szCs w:val="21"/>
         </w:rPr>
-        <w:t xml:space="preserve">Q23 (One correct option, Hard, [F]): On the latest 30 percent of calls the model's mean score was 0.152 while 24.6 percent said yes (Exhibit 5A). Which monitoring rule catches this first, and what does it mean for the cost line drawn on these scores?</w:t>
+        <w:t xml:space="preserve">Q21 (One correct option, Hard, [F]): On the latest 30 percent of calls the model's mean score was 0.152 while 24.6 percent said yes (Exhibit 5A). Which monitoring rule catches this first, and what does it mean for the cost line drawn on these scores?</w:t>
       </w:r>
     </w:p>
     <w:p>
@@ -16110,7 +15259,7 @@
           <w:sz w:val="21"/>
           <w:szCs w:val="21"/>
         </w:rPr>
-        <w:t xml:space="preserve">Q24 (More than one correct, Medium, [D]): Which lines belong in the memo's caveat? Circle every correct letter.</w:t>
+        <w:t xml:space="preserve">Q22 (More than one correct, Medium, [D]): Which lines belong in the memo's caveat? Circle every correct letter.</w:t>
       </w:r>
     </w:p>
     <w:p>
@@ -16129,7 +15278,7 @@
           <w:sz w:val="21"/>
           <w:szCs w:val="21"/>
         </w:rPr>
-        <w:t xml:space="preserve">Q25 (One correct option, Medium, [D]): Anand Iyer asks what evidence would make him sign. Across 23 comparisons, Booking.com found offline gains and business gains almost uncorrelated (Exhibit 5B). What does the memo propose?</w:t>
+        <w:t xml:space="preserve">Q23 (One correct option, Medium, [D]): Anand Iyer asks what evidence would make him sign. Across 23 comparisons, Booking.com found offline gains and business gains almost uncorrelated (Exhibit 5B). What does the memo propose?</w:t>
       </w:r>
     </w:p>
     <w:p>
@@ -16148,7 +15297,7 @@
           <w:sz w:val="21"/>
           <w:szCs w:val="21"/>
         </w:rPr>
-        <w:t xml:space="preserve">Q26 (One correct option, Hard, [D]): Rohan Desai's lending book: approving a borrower who defaults costs Rs 60,000, and rejecting a good borrower costs Rs 3,000 of lost interest. Where does Rohan's approval line go?</w:t>
+        <w:t xml:space="preserve">Q24 (One correct option, Hard, [D]): Rohan Desai's lending book: approving a borrower who defaults costs Rs 60,000, and rejecting a good borrower costs Rs 3,000 of lost interest. His model, calibrated on recent loans, gives applicant P a 4 percent chance of default and applicant Q an 8 percent chance. Whom does Rohan approve?</w:t>
       </w:r>
     </w:p>
     <w:p>
@@ -16181,6 +15330,44 @@
           <w:szCs w:val="21"/>
         </w:rPr>
         <w:t xml:space="preserve">These tracker items are not printed, because a deeper item on the paper tests the same concept.</w:t>
+      </w:r>
+    </w:p>
+    <w:p>
+      <w:pPr>
+        <w:pStyle w:val="ListParagraph"/>
+        <w:numPr>
+          <w:ilvl w:val="0"/>
+          <w:numId w:val="3"/>
+        </w:numPr>
+        <w:spacing w:after="40"/>
+      </w:pPr>
+      <w:r>
+        <w:rPr>
+          <w:rFonts w:ascii="Arial" w:cs="Arial" w:eastAsia="Arial" w:hAnsi="Arial"/>
+          <w:color w:val="1C1B16"/>
+          <w:sz w:val="21"/>
+          <w:szCs w:val="21"/>
+        </w:rPr>
+        <w:t xml:space="preserve">Bank 4 (Fill in the blank, Easy, Thu), folded into Q17: The blind sitting found the bank's 100 and 61 percent read beside Exhibit 4A's 0.996 and 0.619, two metrics, and found the blank cued by the part's title and by the options above it, so the item that reads training at 0.996 against validation at 0.837 as memorising tests bank 4's word on the room's own tree.</w:t>
+      </w:r>
+    </w:p>
+    <w:p>
+      <w:pPr>
+        <w:pStyle w:val="ListParagraph"/>
+        <w:numPr>
+          <w:ilvl w:val="0"/>
+          <w:numId w:val="3"/>
+        </w:numPr>
+        <w:spacing w:after="40"/>
+      </w:pPr>
+      <w:r>
+        <w:rPr>
+          <w:rFonts w:ascii="Arial" w:cs="Arial" w:eastAsia="Arial" w:hAnsi="Arial"/>
+          <w:color w:val="1C1B16"/>
+          <w:sz w:val="21"/>
+          <w:szCs w:val="21"/>
+        </w:rPr>
+        <w:t xml:space="preserve">Bank 5 (Fill in the blank, Medium, Thu), folded into Q19: The blind sitting found the blank answered by the folds item's own options, which say what one split could have read, so the folds item, whose key is the luck of one split sized at 0.77 to 0.80, tests bank 5's word.</w:t>
       </w:r>
     </w:p>
     <w:p>
@@ -16332,7 +15519,7 @@
           <w:sz w:val="21"/>
           <w:szCs w:val="21"/>
         </w:rPr>
-        <w:t xml:space="preserve">Bank 13 (One correct option, Hard, Tue), folded into Q26: The item is bank 13 on Rohan Desai's own costs, set beside the nudge's cost line, and its key draws the approval line at about 0.05 chance of default, which is the bar moving up.</w:t>
+        <w:t xml:space="preserve">Bank 13 (One correct option, Hard, Tue), folded into Q24: The item is bank 13 on Rohan Desai's own costs, set beside the nudge's cost line, and its key draws the approval line at about 0.05 chance of default, which is the bar moving up.</w:t>
       </w:r>
     </w:p>
     <w:p>
@@ -16408,7 +15595,7 @@
           <w:sz w:val="21"/>
           <w:szCs w:val="21"/>
         </w:rPr>
-        <w:t xml:space="preserve">Bank 17 (One correct option, Medium, Fri), folded into Q23: The key is bank 17's monitoring rule made concrete on the bank's late rows, the called clients' yes rate against the mean score with a stated gap, and its distractors are bank 17's three.</w:t>
+        <w:t xml:space="preserve">Bank 17 (One correct option, Medium, Fri), folded into Q21: The key is bank 17's monitoring rule made concrete on the bank's late rows, the called clients' yes rate against the mean score with a stated gap, and its distractors are bank 17's three.</w:t>
       </w:r>
     </w:p>
     <w:p>
@@ -16484,7 +15671,7 @@
           <w:sz w:val="21"/>
           <w:szCs w:val="21"/>
         </w:rPr>
-        <w:t xml:space="preserve">Bank 21 (More than one correct, Hard, Fri), folded into Q24: The item is bank 21's four-part memo on the bank's numbers, with the weakest segment and the staleness trigger as the caveat and the validation score and the budget as the lines that belong elsewhere.</w:t>
+        <w:t xml:space="preserve">Bank 21 (More than one correct, Hard, Fri), folded into Q22: The item is bank 21's four-part memo on the bank's numbers, with the weakest segment and the staleness trigger as the caveat and the validation score and the budget as the lines that belong elsewhere.</w:t>
       </w:r>
     </w:p>
     <w:p>
@@ -16705,7 +15892,7 @@
           <w:sz w:val="21"/>
           <w:szCs w:val="21"/>
         </w:rPr>
-        <w:t xml:space="preserve">First the gap must clear the spread of the folds, about 0.03 here. Then count the buyers each model puts in its top 1,000 on the same rows: each extra buyer is worth about Rs 1,200 a campaign, so the extra buyers times Rs 1,200 must beat the yearly cost of explaining, monitoring and re-validating the complex model. Below both bars the logistic model ships, and the memo states the gap that would change the call.</w:t>
+        <w:t xml:space="preserve">First the gap must hold on every fold, since one validation slice moves by about 0.03 here. Then count the buyers each model puts in its top 1,000 on the same rows: each extra buyer is worth about Rs 1,200 a campaign, so the extra buyers times Rs 1,200 must beat the yearly cost of explaining, monitoring and re-validating the complex model. Below both bars the logistic model ships, and the memo states the gap that would change the call.</w:t>
       </w:r>
     </w:p>
     <w:p>
@@ -17283,7 +16470,7 @@
                       <w:sz w:val="16"/>
                       <w:szCs w:val="16"/>
                     </w:rPr>
-                    <w:t xml:space="preserve"/>
+                    <w:t xml:space="preserve">X</w:t>
                   </w:r>
                 </w:p>
               </w:tc>
@@ -17353,7 +16540,7 @@
                       <w:sz w:val="16"/>
                       <w:szCs w:val="16"/>
                     </w:rPr>
-                    <w:t xml:space="preserve">X</w:t>
+                    <w:t xml:space="preserve"/>
                   </w:r>
                 </w:p>
               </w:tc>
@@ -18896,7 +18083,7 @@
                       <w:sz w:val="16"/>
                       <w:szCs w:val="16"/>
                     </w:rPr>
-                    <w:t xml:space="preserve">X</w:t>
+                    <w:t xml:space="preserve"/>
                   </w:r>
                 </w:p>
               </w:tc>
@@ -20153,7 +19340,7 @@
                       <w:sz w:val="16"/>
                       <w:szCs w:val="16"/>
                     </w:rPr>
-                    <w:t xml:space="preserve"/>
+                    <w:t xml:space="preserve">X</w:t>
                   </w:r>
                 </w:p>
               </w:tc>
@@ -20188,7 +19375,7 @@
                       <w:sz w:val="16"/>
                       <w:szCs w:val="16"/>
                     </w:rPr>
-                    <w:t xml:space="preserve">X</w:t>
+                    <w:t xml:space="preserve"/>
                   </w:r>
                 </w:p>
               </w:tc>
@@ -20264,7 +19451,7 @@
                       <w:sz w:val="16"/>
                       <w:szCs w:val="16"/>
                     </w:rPr>
-                    <w:t xml:space="preserve">Q23</w:t>
+                    <w:t xml:space="preserve">Q21</w:t>
                   </w:r>
                 </w:p>
               </w:tc>
@@ -20445,7 +19632,7 @@
                       <w:sz w:val="16"/>
                       <w:szCs w:val="16"/>
                     </w:rPr>
-                    <w:t xml:space="preserve">Q24*</w:t>
+                    <w:t xml:space="preserve">Q22*</w:t>
                   </w:r>
                 </w:p>
               </w:tc>
@@ -20626,7 +19813,223 @@
                       <w:sz w:val="16"/>
                       <w:szCs w:val="16"/>
                     </w:rPr>
-                    <w:t xml:space="preserve">Q25</w:t>
+                    <w:t xml:space="preserve">Q23</w:t>
+                  </w:r>
+                </w:p>
+              </w:tc>
+              <w:tc>
+                <w:tcPr>
+                  <w:tcW w:type="dxa" w:w="420"/>
+                  <w:tcBorders>
+                    <w:top w:val="single" w:color="D5D0C4" w:sz="4"/>
+                    <w:left w:val="single" w:color="D5D0C4" w:sz="4"/>
+                    <w:bottom w:val="single" w:color="D5D0C4" w:sz="4"/>
+                    <w:right w:val="single" w:color="D5D0C4" w:sz="4"/>
+                  </w:tcBorders>
+                  <w:tcMar>
+                    <w:top w:type="dxa" w:w="20"/>
+                    <w:left w:type="dxa" w:w="60"/>
+                    <w:bottom w:type="dxa" w:w="20"/>
+                    <w:right w:type="dxa" w:w="60"/>
+                  </w:tcMar>
+                  <w:vAlign w:val="center"/>
+                </w:tcPr>
+                <w:p>
+                  <w:pPr>
+                    <w:spacing w:after="20" w:before="20" w:line="240"/>
+                    <w:jc w:val="center"/>
+                  </w:pPr>
+                  <w:r>
+                    <w:rPr>
+                      <w:rFonts w:ascii="Arial" w:cs="Arial" w:eastAsia="Arial" w:hAnsi="Arial"/>
+                      <w:b/>
+                      <w:bCs/>
+                      <w:color w:val="B37A33"/>
+                      <w:sz w:val="16"/>
+                      <w:szCs w:val="16"/>
+                    </w:rPr>
+                    <w:t xml:space="preserve"/>
+                  </w:r>
+                </w:p>
+              </w:tc>
+              <w:tc>
+                <w:tcPr>
+                  <w:tcW w:type="dxa" w:w="420"/>
+                  <w:tcBorders>
+                    <w:top w:val="single" w:color="D5D0C4" w:sz="4"/>
+                    <w:left w:val="single" w:color="D5D0C4" w:sz="4"/>
+                    <w:bottom w:val="single" w:color="D5D0C4" w:sz="4"/>
+                    <w:right w:val="single" w:color="D5D0C4" w:sz="4"/>
+                  </w:tcBorders>
+                  <w:tcMar>
+                    <w:top w:type="dxa" w:w="20"/>
+                    <w:left w:type="dxa" w:w="60"/>
+                    <w:bottom w:type="dxa" w:w="20"/>
+                    <w:right w:type="dxa" w:w="60"/>
+                  </w:tcMar>
+                  <w:vAlign w:val="center"/>
+                </w:tcPr>
+                <w:p>
+                  <w:pPr>
+                    <w:spacing w:after="20" w:before="20" w:line="240"/>
+                    <w:jc w:val="center"/>
+                  </w:pPr>
+                  <w:r>
+                    <w:rPr>
+                      <w:rFonts w:ascii="Arial" w:cs="Arial" w:eastAsia="Arial" w:hAnsi="Arial"/>
+                      <w:b/>
+                      <w:bCs/>
+                      <w:color w:val="B37A33"/>
+                      <w:sz w:val="16"/>
+                      <w:szCs w:val="16"/>
+                    </w:rPr>
+                    <w:t xml:space="preserve"/>
+                  </w:r>
+                </w:p>
+              </w:tc>
+              <w:tc>
+                <w:tcPr>
+                  <w:tcW w:type="dxa" w:w="420"/>
+                  <w:tcBorders>
+                    <w:top w:val="single" w:color="D5D0C4" w:sz="4"/>
+                    <w:left w:val="single" w:color="D5D0C4" w:sz="4"/>
+                    <w:bottom w:val="single" w:color="D5D0C4" w:sz="4"/>
+                    <w:right w:val="single" w:color="D5D0C4" w:sz="4"/>
+                  </w:tcBorders>
+                  <w:tcMar>
+                    <w:top w:type="dxa" w:w="20"/>
+                    <w:left w:type="dxa" w:w="60"/>
+                    <w:bottom w:type="dxa" w:w="20"/>
+                    <w:right w:type="dxa" w:w="60"/>
+                  </w:tcMar>
+                  <w:vAlign w:val="center"/>
+                </w:tcPr>
+                <w:p>
+                  <w:pPr>
+                    <w:spacing w:after="20" w:before="20" w:line="240"/>
+                    <w:jc w:val="center"/>
+                  </w:pPr>
+                  <w:r>
+                    <w:rPr>
+                      <w:rFonts w:ascii="Arial" w:cs="Arial" w:eastAsia="Arial" w:hAnsi="Arial"/>
+                      <w:b/>
+                      <w:bCs/>
+                      <w:color w:val="B37A33"/>
+                      <w:sz w:val="16"/>
+                      <w:szCs w:val="16"/>
+                    </w:rPr>
+                    <w:t xml:space="preserve">X</w:t>
+                  </w:r>
+                </w:p>
+              </w:tc>
+              <w:tc>
+                <w:tcPr>
+                  <w:tcW w:type="dxa" w:w="420"/>
+                  <w:tcBorders>
+                    <w:top w:val="single" w:color="D5D0C4" w:sz="4"/>
+                    <w:left w:val="single" w:color="D5D0C4" w:sz="4"/>
+                    <w:bottom w:val="single" w:color="D5D0C4" w:sz="4"/>
+                    <w:right w:val="single" w:color="D5D0C4" w:sz="4"/>
+                  </w:tcBorders>
+                  <w:tcMar>
+                    <w:top w:type="dxa" w:w="20"/>
+                    <w:left w:type="dxa" w:w="60"/>
+                    <w:bottom w:type="dxa" w:w="20"/>
+                    <w:right w:type="dxa" w:w="60"/>
+                  </w:tcMar>
+                  <w:vAlign w:val="center"/>
+                </w:tcPr>
+                <w:p>
+                  <w:pPr>
+                    <w:spacing w:after="20" w:before="20" w:line="240"/>
+                    <w:jc w:val="center"/>
+                  </w:pPr>
+                  <w:r>
+                    <w:rPr>
+                      <w:rFonts w:ascii="Arial" w:cs="Arial" w:eastAsia="Arial" w:hAnsi="Arial"/>
+                      <w:b/>
+                      <w:bCs/>
+                      <w:color w:val="B37A33"/>
+                      <w:sz w:val="16"/>
+                      <w:szCs w:val="16"/>
+                    </w:rPr>
+                    <w:t xml:space="preserve"/>
+                  </w:r>
+                </w:p>
+              </w:tc>
+            </w:tr>
+            <w:tr>
+              <w:trPr>
+                <w:cantSplit/>
+                <w:trHeight w:val="280" w:hRule="atLeast"/>
+              </w:trPr>
+              <w:tc>
+                <w:tcPr>
+                  <w:tcW w:type="dxa" w:w="640"/>
+                  <w:tcBorders>
+                    <w:top w:val="single" w:color="D5D0C4" w:sz="4"/>
+                    <w:left w:val="single" w:color="D5D0C4" w:sz="4"/>
+                    <w:bottom w:val="single" w:color="D5D0C4" w:sz="4"/>
+                    <w:right w:val="single" w:color="D5D0C4" w:sz="4"/>
+                  </w:tcBorders>
+                  <w:tcMar>
+                    <w:top w:type="dxa" w:w="20"/>
+                    <w:left w:type="dxa" w:w="60"/>
+                    <w:bottom w:type="dxa" w:w="20"/>
+                    <w:right w:type="dxa" w:w="60"/>
+                  </w:tcMar>
+                  <w:vAlign w:val="center"/>
+                </w:tcPr>
+                <w:p>
+                  <w:pPr>
+                    <w:spacing w:after="20" w:before="20" w:line="240"/>
+                    <w:jc w:val="center"/>
+                  </w:pPr>
+                  <w:r>
+                    <w:rPr>
+                      <w:rFonts w:ascii="Arial" w:cs="Arial" w:eastAsia="Arial" w:hAnsi="Arial"/>
+                      <w:b w:val="false"/>
+                      <w:bCs w:val="false"/>
+                      <w:color w:val="1C1B16"/>
+                      <w:sz w:val="16"/>
+                      <w:szCs w:val="16"/>
+                    </w:rPr>
+                    <w:t xml:space="preserve">Q24</w:t>
+                  </w:r>
+                </w:p>
+              </w:tc>
+              <w:tc>
+                <w:tcPr>
+                  <w:tcW w:type="dxa" w:w="420"/>
+                  <w:tcBorders>
+                    <w:top w:val="single" w:color="D5D0C4" w:sz="4"/>
+                    <w:left w:val="single" w:color="D5D0C4" w:sz="4"/>
+                    <w:bottom w:val="single" w:color="D5D0C4" w:sz="4"/>
+                    <w:right w:val="single" w:color="D5D0C4" w:sz="4"/>
+                  </w:tcBorders>
+                  <w:tcMar>
+                    <w:top w:type="dxa" w:w="20"/>
+                    <w:left w:type="dxa" w:w="60"/>
+                    <w:bottom w:type="dxa" w:w="20"/>
+                    <w:right w:type="dxa" w:w="60"/>
+                  </w:tcMar>
+                  <w:vAlign w:val="center"/>
+                </w:tcPr>
+                <w:p>
+                  <w:pPr>
+                    <w:spacing w:after="20" w:before="20" w:line="240"/>
+                    <w:jc w:val="center"/>
+                  </w:pPr>
+                  <w:r>
+                    <w:rPr>
+                      <w:rFonts w:ascii="Arial" w:cs="Arial" w:eastAsia="Arial" w:hAnsi="Arial"/>
+                      <w:b/>
+                      <w:bCs/>
+                      <w:color w:val="B37A33"/>
+                      <w:sz w:val="16"/>
+                      <w:szCs w:val="16"/>
+                    </w:rPr>
+                    <w:t xml:space="preserve"/>
                   </w:r>
                 </w:p>
               </w:tc>
@@ -20732,222 +20135,6 @@
                       <w:szCs w:val="16"/>
                     </w:rPr>
                     <w:t xml:space="preserve"/>
-                  </w:r>
-                </w:p>
-              </w:tc>
-              <w:tc>
-                <w:tcPr>
-                  <w:tcW w:type="dxa" w:w="420"/>
-                  <w:tcBorders>
-                    <w:top w:val="single" w:color="D5D0C4" w:sz="4"/>
-                    <w:left w:val="single" w:color="D5D0C4" w:sz="4"/>
-                    <w:bottom w:val="single" w:color="D5D0C4" w:sz="4"/>
-                    <w:right w:val="single" w:color="D5D0C4" w:sz="4"/>
-                  </w:tcBorders>
-                  <w:tcMar>
-                    <w:top w:type="dxa" w:w="20"/>
-                    <w:left w:type="dxa" w:w="60"/>
-                    <w:bottom w:type="dxa" w:w="20"/>
-                    <w:right w:type="dxa" w:w="60"/>
-                  </w:tcMar>
-                  <w:vAlign w:val="center"/>
-                </w:tcPr>
-                <w:p>
-                  <w:pPr>
-                    <w:spacing w:after="20" w:before="20" w:line="240"/>
-                    <w:jc w:val="center"/>
-                  </w:pPr>
-                  <w:r>
-                    <w:rPr>
-                      <w:rFonts w:ascii="Arial" w:cs="Arial" w:eastAsia="Arial" w:hAnsi="Arial"/>
-                      <w:b/>
-                      <w:bCs/>
-                      <w:color w:val="B37A33"/>
-                      <w:sz w:val="16"/>
-                      <w:szCs w:val="16"/>
-                    </w:rPr>
-                    <w:t xml:space="preserve"/>
-                  </w:r>
-                </w:p>
-              </w:tc>
-            </w:tr>
-            <w:tr>
-              <w:trPr>
-                <w:cantSplit/>
-                <w:trHeight w:val="280" w:hRule="atLeast"/>
-              </w:trPr>
-              <w:tc>
-                <w:tcPr>
-                  <w:tcW w:type="dxa" w:w="640"/>
-                  <w:tcBorders>
-                    <w:top w:val="single" w:color="D5D0C4" w:sz="4"/>
-                    <w:left w:val="single" w:color="D5D0C4" w:sz="4"/>
-                    <w:bottom w:val="single" w:color="D5D0C4" w:sz="4"/>
-                    <w:right w:val="single" w:color="D5D0C4" w:sz="4"/>
-                  </w:tcBorders>
-                  <w:tcMar>
-                    <w:top w:type="dxa" w:w="20"/>
-                    <w:left w:type="dxa" w:w="60"/>
-                    <w:bottom w:type="dxa" w:w="20"/>
-                    <w:right w:type="dxa" w:w="60"/>
-                  </w:tcMar>
-                  <w:vAlign w:val="center"/>
-                </w:tcPr>
-                <w:p>
-                  <w:pPr>
-                    <w:spacing w:after="20" w:before="20" w:line="240"/>
-                    <w:jc w:val="center"/>
-                  </w:pPr>
-                  <w:r>
-                    <w:rPr>
-                      <w:rFonts w:ascii="Arial" w:cs="Arial" w:eastAsia="Arial" w:hAnsi="Arial"/>
-                      <w:b w:val="false"/>
-                      <w:bCs w:val="false"/>
-                      <w:color w:val="1C1B16"/>
-                      <w:sz w:val="16"/>
-                      <w:szCs w:val="16"/>
-                    </w:rPr>
-                    <w:t xml:space="preserve">Q26</w:t>
-                  </w:r>
-                </w:p>
-              </w:tc>
-              <w:tc>
-                <w:tcPr>
-                  <w:tcW w:type="dxa" w:w="420"/>
-                  <w:tcBorders>
-                    <w:top w:val="single" w:color="D5D0C4" w:sz="4"/>
-                    <w:left w:val="single" w:color="D5D0C4" w:sz="4"/>
-                    <w:bottom w:val="single" w:color="D5D0C4" w:sz="4"/>
-                    <w:right w:val="single" w:color="D5D0C4" w:sz="4"/>
-                  </w:tcBorders>
-                  <w:tcMar>
-                    <w:top w:type="dxa" w:w="20"/>
-                    <w:left w:type="dxa" w:w="60"/>
-                    <w:bottom w:type="dxa" w:w="20"/>
-                    <w:right w:type="dxa" w:w="60"/>
-                  </w:tcMar>
-                  <w:vAlign w:val="center"/>
-                </w:tcPr>
-                <w:p>
-                  <w:pPr>
-                    <w:spacing w:after="20" w:before="20" w:line="240"/>
-                    <w:jc w:val="center"/>
-                  </w:pPr>
-                  <w:r>
-                    <w:rPr>
-                      <w:rFonts w:ascii="Arial" w:cs="Arial" w:eastAsia="Arial" w:hAnsi="Arial"/>
-                      <w:b/>
-                      <w:bCs/>
-                      <w:color w:val="B37A33"/>
-                      <w:sz w:val="16"/>
-                      <w:szCs w:val="16"/>
-                    </w:rPr>
-                    <w:t xml:space="preserve"/>
-                  </w:r>
-                </w:p>
-              </w:tc>
-              <w:tc>
-                <w:tcPr>
-                  <w:tcW w:type="dxa" w:w="420"/>
-                  <w:tcBorders>
-                    <w:top w:val="single" w:color="D5D0C4" w:sz="4"/>
-                    <w:left w:val="single" w:color="D5D0C4" w:sz="4"/>
-                    <w:bottom w:val="single" w:color="D5D0C4" w:sz="4"/>
-                    <w:right w:val="single" w:color="D5D0C4" w:sz="4"/>
-                  </w:tcBorders>
-                  <w:tcMar>
-                    <w:top w:type="dxa" w:w="20"/>
-                    <w:left w:type="dxa" w:w="60"/>
-                    <w:bottom w:type="dxa" w:w="20"/>
-                    <w:right w:type="dxa" w:w="60"/>
-                  </w:tcMar>
-                  <w:vAlign w:val="center"/>
-                </w:tcPr>
-                <w:p>
-                  <w:pPr>
-                    <w:spacing w:after="20" w:before="20" w:line="240"/>
-                    <w:jc w:val="center"/>
-                  </w:pPr>
-                  <w:r>
-                    <w:rPr>
-                      <w:rFonts w:ascii="Arial" w:cs="Arial" w:eastAsia="Arial" w:hAnsi="Arial"/>
-                      <w:b/>
-                      <w:bCs/>
-                      <w:color w:val="B37A33"/>
-                      <w:sz w:val="16"/>
-                      <w:szCs w:val="16"/>
-                    </w:rPr>
-                    <w:t xml:space="preserve"/>
-                  </w:r>
-                </w:p>
-              </w:tc>
-              <w:tc>
-                <w:tcPr>
-                  <w:tcW w:type="dxa" w:w="420"/>
-                  <w:tcBorders>
-                    <w:top w:val="single" w:color="D5D0C4" w:sz="4"/>
-                    <w:left w:val="single" w:color="D5D0C4" w:sz="4"/>
-                    <w:bottom w:val="single" w:color="D5D0C4" w:sz="4"/>
-                    <w:right w:val="single" w:color="D5D0C4" w:sz="4"/>
-                  </w:tcBorders>
-                  <w:tcMar>
-                    <w:top w:type="dxa" w:w="20"/>
-                    <w:left w:type="dxa" w:w="60"/>
-                    <w:bottom w:type="dxa" w:w="20"/>
-                    <w:right w:type="dxa" w:w="60"/>
-                  </w:tcMar>
-                  <w:vAlign w:val="center"/>
-                </w:tcPr>
-                <w:p>
-                  <w:pPr>
-                    <w:spacing w:after="20" w:before="20" w:line="240"/>
-                    <w:jc w:val="center"/>
-                  </w:pPr>
-                  <w:r>
-                    <w:rPr>
-                      <w:rFonts w:ascii="Arial" w:cs="Arial" w:eastAsia="Arial" w:hAnsi="Arial"/>
-                      <w:b/>
-                      <w:bCs/>
-                      <w:color w:val="B37A33"/>
-                      <w:sz w:val="16"/>
-                      <w:szCs w:val="16"/>
-                    </w:rPr>
-                    <w:t xml:space="preserve"/>
-                  </w:r>
-                </w:p>
-              </w:tc>
-              <w:tc>
-                <w:tcPr>
-                  <w:tcW w:type="dxa" w:w="420"/>
-                  <w:tcBorders>
-                    <w:top w:val="single" w:color="D5D0C4" w:sz="4"/>
-                    <w:left w:val="single" w:color="D5D0C4" w:sz="4"/>
-                    <w:bottom w:val="single" w:color="D5D0C4" w:sz="4"/>
-                    <w:right w:val="single" w:color="D5D0C4" w:sz="4"/>
-                  </w:tcBorders>
-                  <w:tcMar>
-                    <w:top w:type="dxa" w:w="20"/>
-                    <w:left w:type="dxa" w:w="60"/>
-                    <w:bottom w:type="dxa" w:w="20"/>
-                    <w:right w:type="dxa" w:w="60"/>
-                  </w:tcMar>
-                  <w:vAlign w:val="center"/>
-                </w:tcPr>
-                <w:p>
-                  <w:pPr>
-                    <w:spacing w:after="20" w:before="20" w:line="240"/>
-                    <w:jc w:val="center"/>
-                  </w:pPr>
-                  <w:r>
-                    <w:rPr>
-                      <w:rFonts w:ascii="Arial" w:cs="Arial" w:eastAsia="Arial" w:hAnsi="Arial"/>
-                      <w:b/>
-                      <w:bCs/>
-                      <w:color w:val="B37A33"/>
-                      <w:sz w:val="16"/>
-                      <w:szCs w:val="16"/>
-                    </w:rPr>
-                    <w:t xml:space="preserve">X</w:t>
                   </w:r>
                 </w:p>
               </w:tc>
@@ -21487,118 +20674,7 @@
                       <w:sz w:val="16"/>
                       <w:szCs w:val="16"/>
                     </w:rPr>
-                    <w:t xml:space="preserve">Call when p x 1,200 &gt; (1 - p) x 40, so p &gt; 40 / 1,240 = 1 / 31, about 0.032; the line moves down from 0.5 and recall leads.</w:t>
-                  </w:r>
-                </w:p>
-              </w:tc>
-            </w:tr>
-            <w:tr>
-              <w:trPr>
-                <w:cantSplit/>
-                <w:trHeight w:val="380" w:hRule="atLeast"/>
-              </w:trPr>
-              <w:tc>
-                <w:tcPr>
-                  <w:tcW w:type="dxa" w:w="640"/>
-                  <w:tcBorders>
-                    <w:top w:val="single" w:color="D5D0C4" w:sz="4"/>
-                    <w:left w:val="single" w:color="D5D0C4" w:sz="4"/>
-                    <w:bottom w:val="single" w:color="D5D0C4" w:sz="4"/>
-                    <w:right w:val="single" w:color="D5D0C4" w:sz="4"/>
-                  </w:tcBorders>
-                  <w:tcMar>
-                    <w:top w:type="dxa" w:w="20"/>
-                    <w:left w:type="dxa" w:w="60"/>
-                    <w:bottom w:type="dxa" w:w="20"/>
-                    <w:right w:type="dxa" w:w="60"/>
-                  </w:tcMar>
-                  <w:vAlign w:val="center"/>
-                </w:tcPr>
-                <w:p>
-                  <w:pPr>
-                    <w:spacing w:after="20" w:before="20" w:line="240"/>
-                    <w:jc w:val="center"/>
-                  </w:pPr>
-                  <w:r>
-                    <w:rPr>
-                      <w:rFonts w:ascii="Arial" w:cs="Arial" w:eastAsia="Arial" w:hAnsi="Arial"/>
-                      <w:b w:val="false"/>
-                      <w:bCs w:val="false"/>
-                      <w:color w:val="1C1B16"/>
-                      <w:sz w:val="16"/>
-                      <w:szCs w:val="16"/>
-                    </w:rPr>
-                    <w:t xml:space="preserve">Q11</w:t>
-                  </w:r>
-                </w:p>
-              </w:tc>
-              <w:tc>
-                <w:tcPr>
-                  <w:tcW w:type="dxa" w:w="1250"/>
-                  <w:tcBorders>
-                    <w:top w:val="single" w:color="D5D0C4" w:sz="4"/>
-                    <w:left w:val="single" w:color="D5D0C4" w:sz="4"/>
-                    <w:bottom w:val="single" w:color="D5D0C4" w:sz="4"/>
-                    <w:right w:val="single" w:color="D5D0C4" w:sz="4"/>
-                  </w:tcBorders>
-                  <w:tcMar>
-                    <w:top w:type="dxa" w:w="20"/>
-                    <w:left w:type="dxa" w:w="60"/>
-                    <w:bottom w:type="dxa" w:w="20"/>
-                    <w:right w:type="dxa" w:w="60"/>
-                  </w:tcMar>
-                  <w:vAlign w:val="center"/>
-                </w:tcPr>
-                <w:p>
-                  <w:pPr>
-                    <w:spacing w:after="20" w:before="20" w:line="240"/>
-                    <w:jc w:val="center"/>
-                  </w:pPr>
-                  <w:r>
-                    <w:rPr>
-                      <w:rFonts w:ascii="Arial" w:cs="Arial" w:eastAsia="Arial" w:hAnsi="Arial"/>
-                      <w:b w:val="false"/>
-                      <w:bCs w:val="false"/>
-                      <w:color w:val="6B675E"/>
-                      <w:sz w:val="14"/>
-                      <w:szCs w:val="14"/>
-                    </w:rPr>
-                    <w:t xml:space="preserve">Letter</w:t>
-                  </w:r>
-                </w:p>
-              </w:tc>
-              <w:tc>
-                <w:tcPr>
-                  <w:tcW w:type="dxa" w:w="2860"/>
-                  <w:tcBorders>
-                    <w:top w:val="single" w:color="D5D0C4" w:sz="4"/>
-                    <w:left w:val="single" w:color="D5D0C4" w:sz="4"/>
-                    <w:bottom w:val="single" w:color="D5D0C4" w:sz="4"/>
-                    <w:right w:val="single" w:color="D5D0C4" w:sz="4"/>
-                  </w:tcBorders>
-                  <w:tcMar>
-                    <w:top w:type="dxa" w:w="20"/>
-                    <w:left w:type="dxa" w:w="60"/>
-                    <w:bottom w:type="dxa" w:w="20"/>
-                    <w:right w:type="dxa" w:w="60"/>
-                  </w:tcMar>
-                  <w:vAlign w:val="center"/>
-                </w:tcPr>
-                <w:p>
-                  <w:pPr>
-                    <w:spacing w:after="20" w:before="20" w:line="240"/>
-                    <w:jc w:val="left"/>
-                  </w:pPr>
-                  <w:r>
-                    <w:rPr>
-                      <w:rFonts w:ascii="Arial" w:cs="Arial" w:eastAsia="Arial" w:hAnsi="Arial"/>
-                      <w:b/>
-                      <w:bCs/>
-                      <w:color w:val="B37A33"/>
-                      <w:sz w:val="16"/>
-                      <w:szCs w:val="16"/>
-                    </w:rPr>
-                    <w:t xml:space="preserve">B</w:t>
+                    <w:t xml:space="preserve">Call when p x 1,200 &gt; (1 - p) x 40, so p &gt; 40 / 1,240 = 1 / 31, about 0.032 (1 in 30, 0.033, from one buyer paying for 30 calls, is accepted); the line moves down from 0.5 and recall leads.</w:t>
                   </w:r>
                 </w:p>
               </w:tc>
@@ -21806,6 +20882,117 @@
                       <w:sz w:val="16"/>
                       <w:szCs w:val="16"/>
                     </w:rPr>
+                    <w:t xml:space="preserve">Q11</w:t>
+                  </w:r>
+                </w:p>
+              </w:tc>
+              <w:tc>
+                <w:tcPr>
+                  <w:tcW w:type="dxa" w:w="1250"/>
+                  <w:tcBorders>
+                    <w:top w:val="single" w:color="D5D0C4" w:sz="4"/>
+                    <w:left w:val="single" w:color="D5D0C4" w:sz="4"/>
+                    <w:bottom w:val="single" w:color="D5D0C4" w:sz="4"/>
+                    <w:right w:val="single" w:color="D5D0C4" w:sz="4"/>
+                  </w:tcBorders>
+                  <w:tcMar>
+                    <w:top w:type="dxa" w:w="20"/>
+                    <w:left w:type="dxa" w:w="60"/>
+                    <w:bottom w:type="dxa" w:w="20"/>
+                    <w:right w:type="dxa" w:w="60"/>
+                  </w:tcMar>
+                  <w:vAlign w:val="center"/>
+                </w:tcPr>
+                <w:p>
+                  <w:pPr>
+                    <w:spacing w:after="20" w:before="20" w:line="240"/>
+                    <w:jc w:val="center"/>
+                  </w:pPr>
+                  <w:r>
+                    <w:rPr>
+                      <w:rFonts w:ascii="Arial" w:cs="Arial" w:eastAsia="Arial" w:hAnsi="Arial"/>
+                      <w:b w:val="false"/>
+                      <w:bCs w:val="false"/>
+                      <w:color w:val="6B675E"/>
+                      <w:sz w:val="14"/>
+                      <w:szCs w:val="14"/>
+                    </w:rPr>
+                    <w:t xml:space="preserve">Letter</w:t>
+                  </w:r>
+                </w:p>
+              </w:tc>
+              <w:tc>
+                <w:tcPr>
+                  <w:tcW w:type="dxa" w:w="2860"/>
+                  <w:tcBorders>
+                    <w:top w:val="single" w:color="D5D0C4" w:sz="4"/>
+                    <w:left w:val="single" w:color="D5D0C4" w:sz="4"/>
+                    <w:bottom w:val="single" w:color="D5D0C4" w:sz="4"/>
+                    <w:right w:val="single" w:color="D5D0C4" w:sz="4"/>
+                  </w:tcBorders>
+                  <w:tcMar>
+                    <w:top w:type="dxa" w:w="20"/>
+                    <w:left w:type="dxa" w:w="60"/>
+                    <w:bottom w:type="dxa" w:w="20"/>
+                    <w:right w:type="dxa" w:w="60"/>
+                  </w:tcMar>
+                  <w:vAlign w:val="center"/>
+                </w:tcPr>
+                <w:p>
+                  <w:pPr>
+                    <w:spacing w:after="20" w:before="20" w:line="240"/>
+                    <w:jc w:val="left"/>
+                  </w:pPr>
+                  <w:r>
+                    <w:rPr>
+                      <w:rFonts w:ascii="Arial" w:cs="Arial" w:eastAsia="Arial" w:hAnsi="Arial"/>
+                      <w:b/>
+                      <w:bCs/>
+                      <w:color w:val="B37A33"/>
+                      <w:sz w:val="16"/>
+                      <w:szCs w:val="16"/>
+                    </w:rPr>
+                    <w:t xml:space="preserve">B</w:t>
+                  </w:r>
+                </w:p>
+              </w:tc>
+            </w:tr>
+            <w:tr>
+              <w:trPr>
+                <w:cantSplit/>
+                <w:trHeight w:val="380" w:hRule="atLeast"/>
+              </w:trPr>
+              <w:tc>
+                <w:tcPr>
+                  <w:tcW w:type="dxa" w:w="640"/>
+                  <w:tcBorders>
+                    <w:top w:val="single" w:color="D5D0C4" w:sz="4"/>
+                    <w:left w:val="single" w:color="D5D0C4" w:sz="4"/>
+                    <w:bottom w:val="single" w:color="D5D0C4" w:sz="4"/>
+                    <w:right w:val="single" w:color="D5D0C4" w:sz="4"/>
+                  </w:tcBorders>
+                  <w:tcMar>
+                    <w:top w:type="dxa" w:w="20"/>
+                    <w:left w:type="dxa" w:w="60"/>
+                    <w:bottom w:type="dxa" w:w="20"/>
+                    <w:right w:type="dxa" w:w="60"/>
+                  </w:tcMar>
+                  <w:vAlign w:val="center"/>
+                </w:tcPr>
+                <w:p>
+                  <w:pPr>
+                    <w:spacing w:after="20" w:before="20" w:line="240"/>
+                    <w:jc w:val="center"/>
+                  </w:pPr>
+                  <w:r>
+                    <w:rPr>
+                      <w:rFonts w:ascii="Arial" w:cs="Arial" w:eastAsia="Arial" w:hAnsi="Arial"/>
+                      <w:b w:val="false"/>
+                      <w:bCs w:val="false"/>
+                      <w:color w:val="1C1B16"/>
+                      <w:sz w:val="16"/>
+                      <w:szCs w:val="16"/>
+                    </w:rPr>
                     <w:t xml:space="preserve">Q16</w:t>
                   </w:r>
                 </w:p>
@@ -21877,228 +21064,6 @@
                       <w:szCs w:val="16"/>
                     </w:rPr>
                     <w:t xml:space="preserve">C</w:t>
-                  </w:r>
-                </w:p>
-              </w:tc>
-            </w:tr>
-            <w:tr>
-              <w:trPr>
-                <w:cantSplit/>
-                <w:trHeight w:val="380" w:hRule="atLeast"/>
-              </w:trPr>
-              <w:tc>
-                <w:tcPr>
-                  <w:tcW w:type="dxa" w:w="640"/>
-                  <w:tcBorders>
-                    <w:top w:val="single" w:color="D5D0C4" w:sz="4"/>
-                    <w:left w:val="single" w:color="D5D0C4" w:sz="4"/>
-                    <w:bottom w:val="single" w:color="D5D0C4" w:sz="4"/>
-                    <w:right w:val="single" w:color="D5D0C4" w:sz="4"/>
-                  </w:tcBorders>
-                  <w:tcMar>
-                    <w:top w:type="dxa" w:w="20"/>
-                    <w:left w:type="dxa" w:w="60"/>
-                    <w:bottom w:type="dxa" w:w="20"/>
-                    <w:right w:type="dxa" w:w="60"/>
-                  </w:tcMar>
-                  <w:vAlign w:val="center"/>
-                </w:tcPr>
-                <w:p>
-                  <w:pPr>
-                    <w:spacing w:after="20" w:before="20" w:line="240"/>
-                    <w:jc w:val="center"/>
-                  </w:pPr>
-                  <w:r>
-                    <w:rPr>
-                      <w:rFonts w:ascii="Arial" w:cs="Arial" w:eastAsia="Arial" w:hAnsi="Arial"/>
-                      <w:b w:val="false"/>
-                      <w:bCs w:val="false"/>
-                      <w:color w:val="1C1B16"/>
-                      <w:sz w:val="16"/>
-                      <w:szCs w:val="16"/>
-                    </w:rPr>
-                    <w:t xml:space="preserve">Q21</w:t>
-                  </w:r>
-                </w:p>
-              </w:tc>
-              <w:tc>
-                <w:tcPr>
-                  <w:tcW w:type="dxa" w:w="1250"/>
-                  <w:tcBorders>
-                    <w:top w:val="single" w:color="D5D0C4" w:sz="4"/>
-                    <w:left w:val="single" w:color="D5D0C4" w:sz="4"/>
-                    <w:bottom w:val="single" w:color="D5D0C4" w:sz="4"/>
-                    <w:right w:val="single" w:color="D5D0C4" w:sz="4"/>
-                  </w:tcBorders>
-                  <w:tcMar>
-                    <w:top w:type="dxa" w:w="20"/>
-                    <w:left w:type="dxa" w:w="60"/>
-                    <w:bottom w:type="dxa" w:w="20"/>
-                    <w:right w:type="dxa" w:w="60"/>
-                  </w:tcMar>
-                  <w:vAlign w:val="center"/>
-                </w:tcPr>
-                <w:p>
-                  <w:pPr>
-                    <w:spacing w:after="20" w:before="20" w:line="240"/>
-                    <w:jc w:val="center"/>
-                  </w:pPr>
-                  <w:r>
-                    <w:rPr>
-                      <w:rFonts w:ascii="Arial" w:cs="Arial" w:eastAsia="Arial" w:hAnsi="Arial"/>
-                      <w:b w:val="false"/>
-                      <w:bCs w:val="false"/>
-                      <w:color w:val="6B675E"/>
-                      <w:sz w:val="14"/>
-                      <w:szCs w:val="14"/>
-                    </w:rPr>
-                    <w:t xml:space="preserve">Letter</w:t>
-                  </w:r>
-                </w:p>
-              </w:tc>
-              <w:tc>
-                <w:tcPr>
-                  <w:tcW w:type="dxa" w:w="2860"/>
-                  <w:tcBorders>
-                    <w:top w:val="single" w:color="D5D0C4" w:sz="4"/>
-                    <w:left w:val="single" w:color="D5D0C4" w:sz="4"/>
-                    <w:bottom w:val="single" w:color="D5D0C4" w:sz="4"/>
-                    <w:right w:val="single" w:color="D5D0C4" w:sz="4"/>
-                  </w:tcBorders>
-                  <w:tcMar>
-                    <w:top w:type="dxa" w:w="20"/>
-                    <w:left w:type="dxa" w:w="60"/>
-                    <w:bottom w:type="dxa" w:w="20"/>
-                    <w:right w:type="dxa" w:w="60"/>
-                  </w:tcMar>
-                  <w:vAlign w:val="center"/>
-                </w:tcPr>
-                <w:p>
-                  <w:pPr>
-                    <w:spacing w:after="20" w:before="20" w:line="240"/>
-                    <w:jc w:val="left"/>
-                  </w:pPr>
-                  <w:r>
-                    <w:rPr>
-                      <w:rFonts w:ascii="Arial" w:cs="Arial" w:eastAsia="Arial" w:hAnsi="Arial"/>
-                      <w:b/>
-                      <w:bCs/>
-                      <w:color w:val="B37A33"/>
-                      <w:sz w:val="16"/>
-                      <w:szCs w:val="16"/>
-                    </w:rPr>
-                    <w:t xml:space="preserve">A</w:t>
-                  </w:r>
-                </w:p>
-              </w:tc>
-            </w:tr>
-            <w:tr>
-              <w:trPr>
-                <w:cantSplit/>
-                <w:trHeight w:val="380" w:hRule="atLeast"/>
-              </w:trPr>
-              <w:tc>
-                <w:tcPr>
-                  <w:tcW w:type="dxa" w:w="640"/>
-                  <w:tcBorders>
-                    <w:top w:val="single" w:color="D5D0C4" w:sz="4"/>
-                    <w:left w:val="single" w:color="D5D0C4" w:sz="4"/>
-                    <w:bottom w:val="single" w:color="D5D0C4" w:sz="4"/>
-                    <w:right w:val="single" w:color="D5D0C4" w:sz="4"/>
-                  </w:tcBorders>
-                  <w:tcMar>
-                    <w:top w:type="dxa" w:w="20"/>
-                    <w:left w:type="dxa" w:w="60"/>
-                    <w:bottom w:type="dxa" w:w="20"/>
-                    <w:right w:type="dxa" w:w="60"/>
-                  </w:tcMar>
-                  <w:vAlign w:val="center"/>
-                </w:tcPr>
-                <w:p>
-                  <w:pPr>
-                    <w:spacing w:after="20" w:before="20" w:line="240"/>
-                    <w:jc w:val="center"/>
-                  </w:pPr>
-                  <w:r>
-                    <w:rPr>
-                      <w:rFonts w:ascii="Arial" w:cs="Arial" w:eastAsia="Arial" w:hAnsi="Arial"/>
-                      <w:b w:val="false"/>
-                      <w:bCs w:val="false"/>
-                      <w:color w:val="1C1B16"/>
-                      <w:sz w:val="16"/>
-                      <w:szCs w:val="16"/>
-                    </w:rPr>
-                    <w:t xml:space="preserve">Q22</w:t>
-                  </w:r>
-                </w:p>
-              </w:tc>
-              <w:tc>
-                <w:tcPr>
-                  <w:tcW w:type="dxa" w:w="1250"/>
-                  <w:tcBorders>
-                    <w:top w:val="single" w:color="D5D0C4" w:sz="4"/>
-                    <w:left w:val="single" w:color="D5D0C4" w:sz="4"/>
-                    <w:bottom w:val="single" w:color="D5D0C4" w:sz="4"/>
-                    <w:right w:val="single" w:color="D5D0C4" w:sz="4"/>
-                  </w:tcBorders>
-                  <w:tcMar>
-                    <w:top w:type="dxa" w:w="20"/>
-                    <w:left w:type="dxa" w:w="60"/>
-                    <w:bottom w:type="dxa" w:w="20"/>
-                    <w:right w:type="dxa" w:w="60"/>
-                  </w:tcMar>
-                  <w:vAlign w:val="center"/>
-                </w:tcPr>
-                <w:p>
-                  <w:pPr>
-                    <w:spacing w:after="20" w:before="20" w:line="240"/>
-                    <w:jc w:val="center"/>
-                  </w:pPr>
-                  <w:r>
-                    <w:rPr>
-                      <w:rFonts w:ascii="Arial" w:cs="Arial" w:eastAsia="Arial" w:hAnsi="Arial"/>
-                      <w:b w:val="false"/>
-                      <w:bCs w:val="false"/>
-                      <w:color w:val="6B675E"/>
-                      <w:sz w:val="14"/>
-                      <w:szCs w:val="14"/>
-                    </w:rPr>
-                    <w:t xml:space="preserve">Letter</w:t>
-                  </w:r>
-                </w:p>
-              </w:tc>
-              <w:tc>
-                <w:tcPr>
-                  <w:tcW w:type="dxa" w:w="2860"/>
-                  <w:tcBorders>
-                    <w:top w:val="single" w:color="D5D0C4" w:sz="4"/>
-                    <w:left w:val="single" w:color="D5D0C4" w:sz="4"/>
-                    <w:bottom w:val="single" w:color="D5D0C4" w:sz="4"/>
-                    <w:right w:val="single" w:color="D5D0C4" w:sz="4"/>
-                  </w:tcBorders>
-                  <w:tcMar>
-                    <w:top w:type="dxa" w:w="20"/>
-                    <w:left w:type="dxa" w:w="60"/>
-                    <w:bottom w:type="dxa" w:w="20"/>
-                    <w:right w:type="dxa" w:w="60"/>
-                  </w:tcMar>
-                  <w:vAlign w:val="center"/>
-                </w:tcPr>
-                <w:p>
-                  <w:pPr>
-                    <w:spacing w:after="20" w:before="20" w:line="240"/>
-                    <w:jc w:val="left"/>
-                  </w:pPr>
-                  <w:r>
-                    <w:rPr>
-                      <w:rFonts w:ascii="Arial" w:cs="Arial" w:eastAsia="Arial" w:hAnsi="Arial"/>
-                      <w:b/>
-                      <w:bCs/>
-                      <w:color w:val="B37A33"/>
-                      <w:sz w:val="16"/>
-                      <w:szCs w:val="16"/>
-                    </w:rPr>
-                    <w:t xml:space="preserve">D</w:t>
                   </w:r>
                 </w:p>
               </w:tc>

</xml_diff>

<commit_message>
W05 SAT: fix pass after the raise's blind sitting
Q11's failing column no longer contradicts the honest indicators; remove
the cues the sitting named in Q1, Q2, Q3, Q12, Q19, Q20 and Q22; give Q21
a direction-flip slip in place of a self-contradicting option; relabel
Q16 medium, leaving 13 hard by the bar; log every change and finding.

Co-Authored-By: Claude Opus 5.5 <noreply@anthropic.com>
Claude-Session: https://claude.ai/code/session_01TK2R2w1VqUevu4hjhMpfyj
</commit_message>
<xml_diff>
--- a/content/W05/SAT/answer-key/C2_W05_SAT_answer_key_TRAINER.docx
+++ b/content/W05/SAT/answer-key/C2_W05_SAT_answer_key_TRAINER.docx
@@ -1634,7 +1634,7 @@
                 <w:sz w:val="18"/>
                 <w:szCs w:val="18"/>
               </w:rPr>
-              <w:t xml:space="preserve">2</w:t>
+              <w:t xml:space="preserve">3</w:t>
             </w:r>
           </w:p>
         </w:tc>
@@ -1670,7 +1670,7 @@
                 <w:sz w:val="18"/>
                 <w:szCs w:val="18"/>
               </w:rPr>
-              <w:t xml:space="preserve">2</w:t>
+              <w:t xml:space="preserve">1</w:t>
             </w:r>
           </w:p>
         </w:tc>
@@ -2218,7 +2218,7 @@
                 <w:sz w:val="18"/>
                 <w:szCs w:val="18"/>
               </w:rPr>
-              <w:t xml:space="preserve">8</w:t>
+              <w:t xml:space="preserve">9</w:t>
             </w:r>
           </w:p>
         </w:tc>
@@ -2254,7 +2254,7 @@
                 <w:sz w:val="18"/>
                 <w:szCs w:val="18"/>
               </w:rPr>
-              <w:t xml:space="preserve">14</w:t>
+              <w:t xml:space="preserve">13</w:t>
             </w:r>
           </w:p>
         </w:tc>
@@ -7208,7 +7208,7 @@
                 <w:sz w:val="18"/>
                 <w:szCs w:val="18"/>
               </w:rPr>
-              <w:t xml:space="preserve">Hard</w:t>
+              <w:t xml:space="preserve">Medium</w:t>
             </w:r>
           </w:p>
         </w:tc>
@@ -9208,7 +9208,7 @@
                 <w:sz w:val="20"/>
                 <w:szCs w:val="20"/>
               </w:rPr>
-              <w:t xml:space="preserve">Every 2009 answer is already in the file, so a count answers it and no model is needed.</w:t>
+              <w:t xml:space="preserve">A past month's chance of a yes is a rate already in the file, so a count answers it and no model is needed.</w:t>
             </w:r>
           </w:p>
           <w:p>
@@ -9693,7 +9693,7 @@
                 <w:sz w:val="20"/>
                 <w:szCs w:val="20"/>
               </w:rPr>
-              <w:t xml:space="preserve">No version was fitted to the 2,000, so the luck is about the size of their noise, near a point of accuracy, never a fall below calling nobody.</w:t>
+              <w:t xml:space="preserve">No rule halves an edge: the fall is the luck that 60 tries picked, and the chosen version is an ordinary customer-table model, which Exhibit 1A puts at 0.897.</w:t>
             </w:r>
           </w:p>
           <w:p>
@@ -11201,7 +11201,7 @@
                 <w:sz w:val="21"/>
                 <w:szCs w:val="21"/>
               </w:rPr>
-              <w:t xml:space="preserve">A column passes when its value exists at the prediction moment. Age, job and housing and the previous campaign's result exist before any call. The previous result is strongly predictive, 65 percent yes among past successes, and still legitimate, because it was recorded before this campaign began, so it passes the timing test however strong it is. Duration exists only after this campaign's call, and a quarterly indicator for the current quarter, filled in once the quarter closes, does not exist on the morning the list is built: a published indicator can leak when its period has not ended, which is the calendar leak Wednesday named beside duration. Wednesday's chapter interrogated every column with this one question.</w:t>
+              <w:t xml:space="preserve">A column passes when its value exists at the prediction moment. Age, job and housing and the previous campaign's result exist before any call. The previous result is strongly predictive, 65 percent yes among past successes, and still legitimate, because it was recorded before this campaign began, so it passes the timing test however strong it is. Duration exists only after this campaign's call, and so does a callback flag an agent sets during it, however much it reads like a fact about the client: a column written by this campaign's own calls is from the future on the morning the list is built. Wednesday's chapter interrogated every column with this one question.</w:t>
             </w:r>
           </w:p>
           <w:p>
@@ -11255,7 +11255,7 @@
                 <w:sz w:val="20"/>
                 <w:szCs w:val="20"/>
               </w:rPr>
-              <w:t xml:space="preserve">The current quarter has not closed on the morning of the list, so its count is from the future; last quarter's published count would pass.</w:t>
+              <w:t xml:space="preserve">An agent sets it on a call in this campaign, which has not happened on the morning the list is built, so it is from the future however much it reads like a profile column.</w:t>
             </w:r>
           </w:p>
           <w:p>
@@ -12239,7 +12239,7 @@
                 <w:sz w:val="18"/>
                 <w:szCs w:val="18"/>
               </w:rPr>
-              <w:t xml:space="preserve">   One correct option, Hard, [F], Thu</w:t>
+              <w:t xml:space="preserve">   One correct option, Medium, [F], Thu</w:t>
             </w:r>
           </w:p>
           <w:p>
@@ -13154,7 +13154,7 @@
                 <w:sz w:val="21"/>
                 <w:szCs w:val="21"/>
               </w:rPr>
-              <w:t xml:space="preserve">An offline score says the model ranks past rows well; it does not say the campaign will sell more deposits, and Booking.com's 23 comparisons put the correlation between the two near zero, -0.1 with an interval from -0.45 to 0.27, which is why the paper calls offline performance a health check. So the evidence is a randomised trial on the business number: next month's clients assigned at random between the list and today's rule, run in the same weeks, scored on deposits per call, with the size fixed before it starts. A before-and-after comparison mixes the list with the month, and on this file the yes rate climbed from 5.6 to 24.6 percent across the calls (Exhibit 5A), so a month can beat the last without the list. Letting each method choose its branches mixes the list with the branches. Friday's memo turned the score into a decision the committee could test.</w:t>
+              <w:t xml:space="preserve">An offline score says the model ranks past rows well; it does not say the campaign will sell more deposits, and Booking.com's 23 comparisons put the correlation between the two near zero, -0.1 with an interval from -0.45 to 0.27, which is why the paper calls offline performance a health check. So the evidence is a randomised trial on the business number: next month's clients assigned at random between the list and today's rule, run in the same weeks, scored on deposits per call, with the size fixed before it starts. A before-and-after comparison mixes the list with the month, and on this file the yes rate climbed from 5.6 to 24.6 percent across the calls (Exhibit 5A), so a month can beat the last without the list. A random trial scored on AUC randomises the right thing and measures the wrong one. Friday's memo turned the score into a decision the committee could test.</w:t>
             </w:r>
           </w:p>
           <w:p>
@@ -13208,7 +13208,7 @@
                 <w:sz w:val="20"/>
                 <w:szCs w:val="20"/>
               </w:rPr>
-              <w:t xml:space="preserve">The test score is the honest offline number, and it is still offline: Booking.com found that such gains did not predict business gains.</w:t>
+              <w:t xml:space="preserve">Randomising is right, and the AUC is still the offline health check Booking.com found did not predict business gains; the trial is scored on deposits.</w:t>
             </w:r>
           </w:p>
           <w:p>
@@ -13235,7 +13235,7 @@
                 <w:sz w:val="20"/>
                 <w:szCs w:val="20"/>
               </w:rPr>
-              <w:t xml:space="preserve">Branches chosen to suit each method differ in their clients, so the gap in deposits mixes the method with the branch; only a random assignment separates them.</w:t>
+              <w:t xml:space="preserve">The test score is the honest offline number, and it is still offline: Booking.com found that such gains did not predict business gains.</w:t>
             </w:r>
           </w:p>
           <w:p>
@@ -13464,7 +13464,7 @@
                 <w:sz w:val="20"/>
                 <w:szCs w:val="20"/>
               </w:rPr>
-              <w:t xml:space="preserve">1 in 20 is the cost ratio, and the line is 3,000 over 63,000, about 1 in 21; P at 4 percent sits below it and is approved.</w:t>
+              <w:t xml:space="preserve">Clearing the line is how the nudge acts, on a chance of a yes; here the chance is of a default, so an applicant must sit below the line, and Q at 8 percent sits above it.</w:t>
             </w:r>
           </w:p>
           <w:p>
@@ -13612,7 +13612,7 @@
                 <w:sz w:val="21"/>
                 <w:szCs w:val="21"/>
               </w:rPr>
-              <w:t xml:space="preserve">Rohan's question leaves out the two facts that decide it: what a flag does, and how many flags the team can work. If a flag blocks the payment, a false alarm stops a genuine customer, and the survey Stripe cites says a third of them may not come back, so precision gains weight and the line rises. If a flag sends the payment to a reviewer, a false alarm costs an analyst's minutes while a missed fraud costs the payment, so recall leads, up to what the team can review; with a fixed team the number to report is precision at its capacity, as Flipkart's trust team read the top 250 and found 211 frauds. Each one-word answer is right in one of those worlds and wrong in the other, and F1 prices the two errors the same in both. So the reply opens on the question, then draws the line from the two costs. Tuesday met Stripe and Flipkart; Friday carried the cost line to Rohan's business.</w:t>
+              <w:t xml:space="preserve">Rohan's question leaves out the two facts that decide it: what a flag does, and how many flags the team can work. If a flag blocks the payment, a false alarm stops a genuine customer, and the survey Stripe cites says a third of them may not come back, so precision gains weight and the line rises. If a flag sends the payment to a reviewer, a false alarm costs an analyst's minutes while a missed fraud costs the payment, so recall leads, up to what the team can review; with a fixed team the number to report is precision at its capacity, as Flipkart's trust team read the top 250 and found 211 frauds. Each one-word answer is right in one of those worlds and wrong in the other, and how rare fraud is settles neither, since it says how many false alarms come with each catch and never which costs more. So the reply opens on the question that decides it, then draws the line from the two costs. Tuesday met Stripe and Flipkart; Friday carried the cost line to Rohan's business.</w:t>
             </w:r>
           </w:p>
           <w:p>
@@ -13666,7 +13666,7 @@
                 <w:sz w:val="20"/>
                 <w:szCs w:val="20"/>
               </w:rPr>
-              <w:t xml:space="preserve">A false decline costs a customer only when a flag declines the payment; if it queues a review, missed fraud is the larger cost, so precision cannot be chosen before knowing what a flag does.</w:t>
+              <w:t xml:space="preserve">How rare fraud is sets how many false alarms come with each catch and leaves open which error costs more; that turns on what a flag does, so this question cannot settle the answer.</w:t>
             </w:r>
           </w:p>
           <w:p>
@@ -13693,7 +13693,7 @@
                 <w:sz w:val="20"/>
                 <w:szCs w:val="20"/>
               </w:rPr>
-              <w:t xml:space="preserve">F1 weighs a false alarm and a missed fraud the same, which is right in neither world: their costs differ, and which costs more turns on what a flag does.</w:t>
+              <w:t xml:space="preserve">A false decline costs a customer only when a flag declines the payment; if it queues a review, missed fraud is the larger cost, so precision cannot be chosen before knowing what a flag does.</w:t>
             </w:r>
           </w:p>
           <w:p>
@@ -13874,7 +13874,7 @@
           <w:sz w:val="21"/>
           <w:szCs w:val="21"/>
         </w:rPr>
-        <w:t xml:space="preserve">Medium (8): Q1, Q5, Q6, Q7, Q10, Q14, Q15, Q19</w:t>
+        <w:t xml:space="preserve">Medium (9): Q1, Q5, Q6, Q7, Q10, Q14, Q15, Q16, Q19</w:t>
       </w:r>
     </w:p>
     <w:p>
@@ -13893,7 +13893,7 @@
           <w:sz w:val="21"/>
           <w:szCs w:val="21"/>
         </w:rPr>
-        <w:t xml:space="preserve">Hard (14): Q2, Q3, Q4, Q8, Q9, Q11, Q12, Q13, Q16, Q17, Q18, Q20, Q21, Q22</w:t>
+        <w:t xml:space="preserve">Hard (13): Q2, Q3, Q4, Q8, Q9, Q11, Q12, Q13, Q17, Q18, Q20, Q21, Q22</w:t>
       </w:r>
     </w:p>
     <w:p>
@@ -14077,7 +14077,7 @@
           <w:sz w:val="21"/>
           <w:szCs w:val="21"/>
         </w:rPr>
-        <w:t xml:space="preserve">Q3 (One correct option, Hard, [S]): On Monday a junior tried 60 versions of the model, each on a different list of columns, scored all 60 on the same 2,000 held-out clients and kept the best: accuracy 0.9055 there, where calling nobody scores 0.8875. On 6,238 fresh clients, where calling nobody scores 0.8873, what does the chosen version score, and what have the 2,000 clients become?</w:t>
+        <w:t xml:space="preserve">Q3 (One correct option, Hard, [S]): On Monday a junior tried 60 versions of the model, each on a different list of the customer table's columns, scored all 60 on the same 2,000 held-out clients and kept the best: accuracy 0.9055 there, where calling nobody scores 0.8875. On 6,238 fresh clients, where calling nobody scores 0.8873, what does the chosen version score, and what have the 2,000 clients become?</w:t>
       </w:r>
     </w:p>
     <w:p>
@@ -14324,7 +14324,7 @@
           <w:sz w:val="21"/>
           <w:szCs w:val="21"/>
         </w:rPr>
-        <w:t xml:space="preserve">Q16 (One correct option, Hard, [F]): Five-fold cross-validation of the logistic model gave the five fold scores in Exhibit 4B. How many models were fitted, on about how many clients each, and what does the spread tell the committee?</w:t>
+        <w:t xml:space="preserve">Q16 (One correct option, Medium, [F]): Five-fold cross-validation of the logistic model gave the five fold scores in Exhibit 4B. How many models were fitted, on about how many clients each, and what does the spread tell the committee?</w:t>
       </w:r>
     </w:p>
     <w:p>
@@ -14438,7 +14438,7 @@
           <w:sz w:val="21"/>
           <w:szCs w:val="21"/>
         </w:rPr>
-        <w:t xml:space="preserve">Q22 (One correct option, Hard, [F]): Rohan Desai asks one question about a fraud model for Kalpa Financial Services' payments app: "Do we tune it for precision or for recall?" Exhibit 5C sets two public cases beside his question. What is the best first reply?</w:t>
+        <w:t xml:space="preserve">Q22 (One correct option, Hard, [F]): Rohan Desai asks one question about a fraud model for Kalpa Financial Services' payments app: "Do we tune it for precision or for recall?" Exhibit 5C sets two public cases beside his question. Which reply holds?</w:t>
       </w:r>
     </w:p>
     <w:p>

</xml_diff>

<commit_message>
W05 SAT: blind sitting fixes to Q12, Q16 to Q18, Q20, Q21 and Part 4's intro
A blind sitting matched the key on all 22 items. Q17's keyed reason now carries Thursday's
two tests (a lead that holds fold by fold and pays its upkeep), which the old reason
contradicted; Q16's interview line follows. Q12's exhibit drops the row that stated its key.
Q20's options now cross before-and-after or random with deposits or AUC, and Q21's last
distractor carries the nudge's line over to lending, so neither key can be found unread.
Q18 cites Instacart's exhibit; Part 4's intro stops listing the columns Q11 asks about.
Key proofs pass on 22 items; --check, the distractor audit and verify pass. The sources
file logs each change.

Co-Authored-By: Claude Opus 5.5 <noreply@anthropic.com>
Claude-Session: https://claude.ai/code/session_01P7zaoR4dQ5pzBFnsX549JQ
</commit_message>
<xml_diff>
--- a/content/W05/SAT/answer-key/C2_W05_SAT_answer_key_TRAINER.docx
+++ b/content/W05/SAT/answer-key/C2_W05_SAT_answer_key_TRAINER.docx
@@ -11403,7 +11403,7 @@
                 <w:sz w:val="21"/>
                 <w:szCs w:val="21"/>
               </w:rPr>
-              <w:t xml:space="preserve">The held-out X-rays came from the same two hospital systems as the training X-rays, so whatever marked the hospital marked them too. Sorting them by hospital alone scored 0.861, because one system's pneumonia rate was 34.2 percent and the other's 1.2 percent, and a network named the hospital of 22,050 of 22,062 X-rays from one system, so much of the 0.931 was the hospital. At a third hospital the shortcut no longer carried the label, and the AUC fell to 0.815. That is leakage through a proxy, which a held-out slice from the same source cannot catch; a score on data from a new site, or for the bank a later period, catches it. Overfitting shows as training far above held-out, and this model's held-out score was high. Wednesday told this case beside duration.</w:t>
+              <w:t xml:space="preserve">The held-out X-rays came from the same two hospital systems as the training X-rays, so whatever marked the hospital marked them too. One system's pneumonia rate was 34.2 percent and the other's 1.2 percent, so the hospital alone predicts the label: the paper reports that sorting X-rays by hospital alone scored 0.861, and a network named the hospital of 22,050 of 22,062 X-rays from one system, so much of the 0.931 was the hospital. At a third hospital the shortcut no longer carried the label, and the AUC fell to 0.815. That is leakage through a proxy, which a held-out slice from the same source cannot catch; a score on data from a new site, or for the bank a later period, catches it. Overfitting shows as training far above held-out, and this model's held-out score was high. Wednesday told this case beside duration.</w:t>
             </w:r>
           </w:p>
           <w:p>
@@ -11457,7 +11457,7 @@
                 <w:sz w:val="20"/>
                 <w:szCs w:val="20"/>
               </w:rPr>
-              <w:t xml:space="preserve">Sorting by hospital alone scored 0.861, so the model leaned on where an X-ray came from, which a new hospital cannot supply; the model needs the check.</w:t>
+              <w:t xml:space="preserve">Pneumonia ran at 34.2 percent in one training system and 1.2 percent in the other, so where an X-ray came from predicted the label, which a new hospital cannot supply; the model needs the check.</w:t>
             </w:r>
           </w:p>
           <w:p>
@@ -12372,7 +12372,7 @@
                 <w:sz w:val="21"/>
                 <w:szCs w:val="21"/>
               </w:rPr>
-              <w:t xml:space="preserve">k folds fit k models on (k minus 1) over k of the rows; I report the mean and the spread, and a gap smaller than the spread is a tie.</w:t>
+              <w:t xml:space="preserve">k folds fit k models on (k minus 1) over k of the rows; I report the mean and the spread, and I compare two models fold by fold on the same folds.</w:t>
             </w:r>
           </w:p>
           <w:p>
@@ -12494,7 +12494,7 @@
                 <w:sz w:val="21"/>
                 <w:szCs w:val="21"/>
               </w:rPr>
-              <w:t xml:space="preserve">The three families sit within 0.011 AUC of each other on one validation slice, while the five folds of one model moved by about 0.03, so another split could reorder them. The test that would settle it scores both models on the same five folds; until boosting leads on every fold by a margin worth its cost, the simpler model is the recommendation: it is explained to a committee in one line per weight, monitored easily, and moved to lending with less to re-check. The flip is a gap that holds across the folds and is worth more in rupees, at the same budget of calls, than the cost of explaining and running the complex model. Thursday closed on why the boring model often ships.</w:t>
+              <w:t xml:space="preserve">The three families sit within 0.011 AUC of each other on one validation slice, while the five folds of one model moved by about 0.03, so one slice settles nothing. Thursday ran two tests on the same five folds. Boosting led logistic on every fold, by 0.003 to 0.014 AUC, so its lead is real; the second test asks whether so small a lead pays, and at the same budget of calls its extra buyers were worth less than the cost the room set for explaining and running it. So the simpler model is the recommendation: it is explained to a committee in one line per weight, monitored easily, and moved to lending with less to re-check. The flip is a lead that holds across the folds and is worth more in rupees, at the same budget of calls, than that cost. Thursday closed on why the boring model often ships.</w:t>
             </w:r>
           </w:p>
           <w:p>
@@ -12521,7 +12521,7 @@
                 <w:sz w:val="20"/>
                 <w:szCs w:val="20"/>
               </w:rPr>
-              <w:t xml:space="preserve">A logistic model overfits too when it has many columns and no penalty; its case here is the tie and its plainness.</w:t>
+              <w:t xml:space="preserve">A logistic model overfits too when it has many columns and no penalty; its case here is the small lead it gives up and its plainness.</w:t>
             </w:r>
           </w:p>
           <w:p>
@@ -12548,7 +12548,7 @@
                 <w:sz w:val="20"/>
                 <w:szCs w:val="20"/>
               </w:rPr>
-              <w:t xml:space="preserve">The best number found on one validation slice carries that slice's luck, which Exhibit 4B sizes at about 0.03.</w:t>
+              <w:t xml:space="preserve">The best of three on one slice is flattered by the choosing, and even a lead that holds on every fold has to pay for the complex model's upkeep before it ships.</w:t>
             </w:r>
           </w:p>
           <w:p>
@@ -12601,7 +12601,7 @@
                 <w:sz w:val="21"/>
                 <w:szCs w:val="21"/>
               </w:rPr>
-              <w:t xml:space="preserve">Inside the noise the simpler model ships, and I name the gap, in AUC and in rupees, held across folds, at which the complex one would.</w:t>
+              <w:t xml:space="preserve">A lead must hold fold by fold and pay for itself in rupees before the complex model ships, and I name the gap at which it would.</w:t>
             </w:r>
           </w:p>
           <w:p>
@@ -13154,7 +13154,7 @@
                 <w:sz w:val="21"/>
                 <w:szCs w:val="21"/>
               </w:rPr>
-              <w:t xml:space="preserve">An offline score says the model ranks past rows well; it does not say the campaign will sell more deposits, and Booking.com's 23 comparisons put the correlation between the two near zero, -0.1 with an interval from -0.45 to 0.27, which is why the paper calls offline performance a health check. So the evidence is a randomised trial on the business number: next month's clients assigned at random between the list and today's rule, run in the same weeks, scored on deposits per call, with the size fixed before it starts. A before-and-after comparison mixes the list with the month, and on this file the yes rate climbed from 5.6 to 24.6 percent across the calls (Exhibit 5A), so a month can beat the last without the list. A random trial scored on AUC randomises the right thing and measures the wrong one. Friday's memo turned the score into a decision the committee could test.</w:t>
+              <w:t xml:space="preserve">An offline score says the model ranks past rows well; it does not say the campaign will sell more deposits, and Booking.com's 23 comparisons put the correlation between the two near zero, -0.1 with an interval from -0.45 to 0.27, which is why the paper calls offline performance a health check. So the evidence is a randomised trial on the business number: next month's clients assigned at random between the list and today's rule, run in the same weeks, scored on deposits per call, with the size fixed before it starts. A sealed test score is still offline. A before-and-after comparison mixes the list with the month, and on this file the yes rate climbed from 5.6 to 24.6 percent across the calls (Exhibit 5A), so a month can beat the last without the list. A random trial scored on AUC randomises the right thing and measures the wrong one. Friday's memo turned the score into a decision the committee could test.</w:t>
             </w:r>
           </w:p>
           <w:p>
@@ -13235,7 +13235,7 @@
                 <w:sz w:val="20"/>
                 <w:szCs w:val="20"/>
               </w:rPr>
-              <w:t xml:space="preserve">The test score is the honest offline number, and it is still offline: Booking.com found that such gains did not predict business gains.</w:t>
+              <w:t xml:space="preserve">Two faults: the yes rate moved from 5.6 to 24.6 percent across the file, so next month against validation measures the calendar too, and AUC is the offline health check Booking.com found did not predict business gains.</w:t>
             </w:r>
           </w:p>
           <w:p>
@@ -13464,7 +13464,7 @@
                 <w:sz w:val="20"/>
                 <w:szCs w:val="20"/>
               </w:rPr>
-              <w:t xml:space="preserve">Clearing the line is how the nudge acts, on a chance of a yes; here the chance is of a default, so an applicant must sit below the line, and Q at 8 percent sits above it.</w:t>
+              <w:t xml:space="preserve">3 percent is the nudge's line, from Rs 40 against Rs 1,200; Rohan's costs, Rs 3,000 against Rs 60,000, put his line at 3,000 over 63,000, about 4.8 percent, so P at 4 percent clears it.</w:t>
             </w:r>
           </w:p>
           <w:p>
@@ -14362,7 +14362,7 @@
           <w:sz w:val="21"/>
           <w:szCs w:val="21"/>
         </w:rPr>
-        <w:t xml:space="preserve">Q18 (One correct option, Hard, [F]): On the latest 30 percent of calls the model's mean score was 0.152 while 24.6 percent said yes (Exhibit 5A). Which monitoring rule catches this first, and what happens to the cut on these scores that the cost line sets?</w:t>
+        <w:t xml:space="preserve">Q18 (One correct option, Hard, [F]): On the latest 30 percent of calls the model's mean score was 0.152 while 24.6 percent said yes (Exhibit 5A), and Exhibit 5B sets Instacart's case beside it. Which monitoring rule catches this first, and what happens to the cut on these scores that the cost line sets?</w:t>
       </w:r>
     </w:p>
     <w:p>
@@ -14641,7 +14641,7 @@
           <w:sz w:val="21"/>
           <w:szCs w:val="21"/>
         </w:rPr>
-        <w:t xml:space="preserve">Bank 9 (True or false, Hard, Fri), folded into Q17: The key is bank 9's statement on the week's three families, a gap of 0.011 AUC inside the 0.03 one split moves by, so the simpler, explainable model is the recommendation.</w:t>
+        <w:t xml:space="preserve">Bank 9 (True or false, Hard, Fri), folded into Q17: The key is bank 9's statement on the week's three families, a lead of 0.011 AUC that has to hold fold by fold and pay for its upkeep before it ships, so the simpler, explainable model is the recommendation.</w:t>
       </w:r>
     </w:p>
     <w:p>
@@ -20125,32 +20125,8 @@
         <w:szCs w:val="18"/>
       </w:rPr>
       <w:fldChar w:fldCharType="begin"/>
-    </w:r>
-    <w:r>
-      <w:rPr>
-        <w:rFonts w:ascii="Arial" w:cs="Arial" w:eastAsia="Arial" w:hAnsi="Arial"/>
-        <w:color w:val="1C1B16"/>
-        <w:sz w:val="18"/>
-        <w:szCs w:val="18"/>
-      </w:rPr>
       <w:instrText xml:space="preserve">PAGE</w:instrText>
-    </w:r>
-    <w:r>
-      <w:rPr>
-        <w:rFonts w:ascii="Arial" w:cs="Arial" w:eastAsia="Arial" w:hAnsi="Arial"/>
-        <w:color w:val="1C1B16"/>
-        <w:sz w:val="18"/>
-        <w:szCs w:val="18"/>
-      </w:rPr>
       <w:fldChar w:fldCharType="separate"/>
-    </w:r>
-    <w:r>
-      <w:rPr>
-        <w:rFonts w:ascii="Arial" w:cs="Arial" w:eastAsia="Arial" w:hAnsi="Arial"/>
-        <w:color w:val="1C1B16"/>
-        <w:sz w:val="18"/>
-        <w:szCs w:val="18"/>
-      </w:rPr>
       <w:fldChar w:fldCharType="end"/>
     </w:r>
     <w:r>
@@ -20170,32 +20146,8 @@
         <w:szCs w:val="18"/>
       </w:rPr>
       <w:fldChar w:fldCharType="begin"/>
-    </w:r>
-    <w:r>
-      <w:rPr>
-        <w:rFonts w:ascii="Arial" w:cs="Arial" w:eastAsia="Arial" w:hAnsi="Arial"/>
-        <w:color w:val="1C1B16"/>
-        <w:sz w:val="18"/>
-        <w:szCs w:val="18"/>
-      </w:rPr>
       <w:instrText xml:space="preserve">NUMPAGES</w:instrText>
-    </w:r>
-    <w:r>
-      <w:rPr>
-        <w:rFonts w:ascii="Arial" w:cs="Arial" w:eastAsia="Arial" w:hAnsi="Arial"/>
-        <w:color w:val="1C1B16"/>
-        <w:sz w:val="18"/>
-        <w:szCs w:val="18"/>
-      </w:rPr>
       <w:fldChar w:fldCharType="separate"/>
-    </w:r>
-    <w:r>
-      <w:rPr>
-        <w:rFonts w:ascii="Arial" w:cs="Arial" w:eastAsia="Arial" w:hAnsi="Arial"/>
-        <w:color w:val="1C1B16"/>
-        <w:sz w:val="18"/>
-        <w:szCs w:val="18"/>
-      </w:rPr>
       <w:fldChar w:fldCharType="end"/>
     </w:r>
   </w:p>
@@ -20511,139 +20463,6 @@
     <w:basedOn w:val="Normal"/>
     <w:qFormat/>
   </w:style>
-  <w:style w:type="paragraph" w:styleId="Caption">
-    <w:name w:val="caption"/>
-    <w:basedOn w:val="Normal"/>
-    <w:next w:val="Normal"/>
-    <w:uiPriority w:val="35"/>
-    <w:semiHidden/>
-    <w:unhideWhenUsed/>
-    <w:qFormat/>
-    <w:pPr>
-      <w:spacing w:after="200"/>
-    </w:pPr>
-    <w:rPr>
-      <w:i/>
-      <w:iCs/>
-      <w:color w:val="44546A" w:themeColor="dark2"/>
-      <w:sz w:val="18"/>
-      <w:szCs w:val="18"/>
-    </w:rPr>
-  </w:style>
-  <w:style w:type="paragraph" w:styleId="Bibliography">
-    <w:name w:val="Bibliography"/>
-    <w:basedOn w:val="Normal"/>
-    <w:next w:val="Normal"/>
-    <w:uiPriority w:val="37"/>
-    <w:unhideWhenUsed/>
-  </w:style>
-  <w:style w:type="paragraph" w:styleId="TOC1">
-    <w:name w:val="toc 1"/>
-    <w:basedOn w:val="Normal"/>
-    <w:next w:val="Normal"/>
-    <w:uiPriority w:val="39"/>
-    <w:semiHidden/>
-    <w:unhideWhenUsed/>
-    <w:pPr>
-      <w:spacing w:after="100"/>
-    </w:pPr>
-  </w:style>
-  <w:style w:type="paragraph" w:styleId="TOC2">
-    <w:name w:val="toc 2"/>
-    <w:basedOn w:val="Normal"/>
-    <w:next w:val="Normal"/>
-    <w:uiPriority w:val="39"/>
-    <w:semiHidden/>
-    <w:unhideWhenUsed/>
-    <w:pPr>
-      <w:spacing w:after="100"/>
-      <w:ind w:left="210"/>
-    </w:pPr>
-  </w:style>
-  <w:style w:type="paragraph" w:styleId="TOC3">
-    <w:name w:val="toc 3"/>
-    <w:basedOn w:val="Normal"/>
-    <w:next w:val="Normal"/>
-    <w:uiPriority w:val="39"/>
-    <w:semiHidden/>
-    <w:unhideWhenUsed/>
-    <w:pPr>
-      <w:spacing w:after="100"/>
-      <w:ind w:left="420"/>
-    </w:pPr>
-  </w:style>
-  <w:style w:type="paragraph" w:styleId="TOC4">
-    <w:name w:val="toc 4"/>
-    <w:basedOn w:val="Normal"/>
-    <w:next w:val="Normal"/>
-    <w:uiPriority w:val="39"/>
-    <w:semiHidden/>
-    <w:unhideWhenUsed/>
-    <w:pPr>
-      <w:spacing w:after="100"/>
-      <w:ind w:left="630"/>
-    </w:pPr>
-  </w:style>
-  <w:style w:type="paragraph" w:styleId="TOC5">
-    <w:name w:val="toc 5"/>
-    <w:basedOn w:val="Normal"/>
-    <w:next w:val="Normal"/>
-    <w:uiPriority w:val="39"/>
-    <w:semiHidden/>
-    <w:unhideWhenUsed/>
-    <w:pPr>
-      <w:spacing w:after="100"/>
-      <w:ind w:left="840"/>
-    </w:pPr>
-  </w:style>
-  <w:style w:type="paragraph" w:styleId="TOC6">
-    <w:name w:val="toc 6"/>
-    <w:basedOn w:val="Normal"/>
-    <w:next w:val="Normal"/>
-    <w:uiPriority w:val="39"/>
-    <w:semiHidden/>
-    <w:unhideWhenUsed/>
-    <w:pPr>
-      <w:spacing w:after="100"/>
-      <w:ind w:left="1050"/>
-    </w:pPr>
-  </w:style>
-  <w:style w:type="paragraph" w:styleId="TOC7">
-    <w:name w:val="toc 7"/>
-    <w:basedOn w:val="Normal"/>
-    <w:next w:val="Normal"/>
-    <w:uiPriority w:val="39"/>
-    <w:semiHidden/>
-    <w:unhideWhenUsed/>
-    <w:pPr>
-      <w:spacing w:after="100"/>
-      <w:ind w:left="1260"/>
-    </w:pPr>
-  </w:style>
-  <w:style w:type="paragraph" w:styleId="TOC8">
-    <w:name w:val="toc 8"/>
-    <w:basedOn w:val="Normal"/>
-    <w:next w:val="Normal"/>
-    <w:uiPriority w:val="39"/>
-    <w:semiHidden/>
-    <w:unhideWhenUsed/>
-    <w:pPr>
-      <w:spacing w:after="100"/>
-      <w:ind w:left="1470"/>
-    </w:pPr>
-  </w:style>
-  <w:style w:type="paragraph" w:styleId="TOC9">
-    <w:name w:val="toc 9"/>
-    <w:basedOn w:val="Normal"/>
-    <w:next w:val="Normal"/>
-    <w:uiPriority w:val="39"/>
-    <w:semiHidden/>
-    <w:unhideWhenUsed/>
-    <w:pPr>
-      <w:spacing w:after="100"/>
-      <w:ind w:left="1680"/>
-    </w:pPr>
-  </w:style>
   <w:style w:type="character" w:styleId="Hyperlink">
     <w:name w:val="Hyperlink"/>
     <w:basedOn w:val="DefaultParagraphFont"/>
@@ -20727,13 +20546,6 @@
       <w:sz w:val="20"/>
       <w:szCs w:val="20"/>
     </w:rPr>
-  </w:style>
-  <w:style w:type="character" w:styleId="LineNumber">
-    <w:name w:val="line number"/>
-    <w:basedOn w:val="DefaultParagraphFont"/>
-    <w:uiPriority w:val="99"/>
-    <w:semiHidden/>
-    <w:unhideWhenUsed/>
   </w:style>
 </w:styles>
 </file>

</xml_diff>

<commit_message>
W05 SAT: the split by date carries Friday's numbers, 0.159 and AUC 0.664
The paper took the split by date from the week pipeline's column set (mean score 0.152, AUC
0.657), while Friday's case02 notebook, notes and explorer fit Wednesday's audited columns and
print 0.159 and 0.664. Exhibit 5A, Q18's stem and key, Q4's key and the discussion guide now
carry Friday's figures; rows, months and yes rates were already the same. The key proofs'
rerun fits the split on Friday's columns and recomputes both from the UCI file. No key letter,
level or minute changed. Paper, key and item-analysis workbook rebuilt; proofs, rerun, verify
and every week's --check pass.

Co-Authored-By: Claude Opus 5.5 <noreply@anthropic.com>
Claude-Session: https://claude.ai/code/session_01P7zaoR4dQ5pzBFnsX549JQ
</commit_message>
<xml_diff>
--- a/content/W05/SAT/answer-key/C2_W05_SAT_answer_key_TRAINER.docx
+++ b/content/W05/SAT/answer-key/C2_W05_SAT_answer_key_TRAINER.docx
@@ -9841,7 +9841,7 @@
                 <w:sz w:val="21"/>
                 <w:szCs w:val="21"/>
               </w:rPr>
-              <w:t xml:space="preserve">The ask is about a campaign that has not happened yet, so the honest test trains on the earlier calls and scores the later ones. A random split puts calls from the same months in training and validation, and the month and the economic indicators mark the period, so the model partly learns when a call happened. On the week's run the yes rate moved from 5.6 to 24.6 percent across the file, and Friday's split by date cut the AUC from 0.795 to 0.657. Monday raised the split by time; Friday ran it.</w:t>
+              <w:t xml:space="preserve">The ask is about a campaign that has not happened yet, so the honest test trains on the earlier calls and scores the later ones. A random split puts calls from the same months in training and validation, and the month and the economic indicators mark the period, so the model partly learns when a call happened. On the week's run the yes rate moved from 5.6 to 24.6 percent across the file, and Friday's split by date cut the AUC from 0.795 to 0.664. Monday raised the split by time; Friday ran it.</w:t>
             </w:r>
           </w:p>
           <w:p>
@@ -12723,7 +12723,7 @@
                 <w:sz w:val="21"/>
                 <w:szCs w:val="21"/>
               </w:rPr>
-              <w:t xml:space="preserve">Staleness shows on fresh outcomes, so the rule compares what the model predicted with what happened, every month, against a gap stated in advance. On the bank's late rows the mean score was 0.152 while 24.6 percent said yes, so the scores run below the clients' true chances. The cost line asks for a true chance above about 1 in 31, and on scores that understate the chance the same true chance shows up as a lower score, so the cut on the scores moves down until they are recalibrated on recent outcomes. More clients saying yes is the reason the cut falls, never a reason to be choosier. The ranking still held at an AUC of 0.657, which is why the alarm watches the probabilities. Instacart's alarm was the same kind: a monitored metric falling from 93 to 61 percent, and its first fix was a threshold change while retraining caught up. Friday's chapter was when the model goes stale.</w:t>
+              <w:t xml:space="preserve">Staleness shows on fresh outcomes, so the rule compares what the model predicted with what happened, every month, against a gap stated in advance. On the bank's late rows the mean score was 0.159 while 24.6 percent said yes, so the scores run below the clients' true chances. The cost line asks for a true chance above about 1 in 31, and on scores that understate the chance the same true chance shows up as a lower score, so the cut on the scores moves down until they are recalibrated on recent outcomes. More clients saying yes is the reason the cut falls, never a reason to be choosier. The ranking still held at an AUC of 0.664, which is why the alarm watches the probabilities. Instacart's alarm was the same kind: a monitored metric falling from 93 to 61 percent, and its first fix was a threshold change while retraining caught up. Friday's chapter was when the model goes stale.</w:t>
             </w:r>
           </w:p>
           <w:p>
@@ -14362,7 +14362,7 @@
           <w:sz w:val="21"/>
           <w:szCs w:val="21"/>
         </w:rPr>
-        <w:t xml:space="preserve">Q18 (One correct option, Hard, [F]): On the latest 30 percent of calls the model's mean score was 0.152 while 24.6 percent said yes (Exhibit 5A), and Exhibit 5B sets Instacart's case beside it. Which monitoring rule catches this first, and what happens to the cut on these scores that the cost line sets?</w:t>
+        <w:t xml:space="preserve">Q18 (One correct option, Hard, [F]): On the latest 30 percent of calls the model's mean score was 0.159 while 24.6 percent said yes (Exhibit 5A), and Exhibit 5B sets Instacart's case beside it. Which monitoring rule catches this first, and what happens to the cut on these scores that the cost line sets?</w:t>
       </w:r>
     </w:p>
     <w:p>

</xml_diff>